<commit_message>
Updated CV both pdf and doc file
</commit_message>
<xml_diff>
--- a/shwetank_CV.docx
+++ b/shwetank_CV.docx
@@ -1,6 +1,6 @@
 
 <file path=word/document.xml><?xml version="1.0" encoding="utf-8"?>
-<w:document xmlns:wpc="http://schemas.microsoft.com/office/word/2010/wordprocessingCanvas" xmlns:mc="http://schemas.openxmlformats.org/markup-compatibility/2006" xmlns:o="urn:schemas-microsoft-com:office:office" xmlns:r="http://schemas.openxmlformats.org/officeDocument/2006/relationships" xmlns:m="http://schemas.openxmlformats.org/officeDocument/2006/math" xmlns:v="urn:schemas-microsoft-com:vml" xmlns:wp14="http://schemas.microsoft.com/office/word/2010/wordprocessingDrawing" xmlns:wp="http://schemas.openxmlformats.org/drawingml/2006/wordprocessingDrawing" xmlns:w10="urn:schemas-microsoft-com:office:word" xmlns:w="http://schemas.openxmlformats.org/wordprocessingml/2006/main" xmlns:w14="http://schemas.microsoft.com/office/word/2010/wordml" xmlns:w15="http://schemas.microsoft.com/office/word/2012/wordml" xmlns:wpg="http://schemas.microsoft.com/office/word/2010/wordprocessingGroup" xmlns:wpi="http://schemas.microsoft.com/office/word/2010/wordprocessingInk" xmlns:wne="http://schemas.microsoft.com/office/word/2006/wordml" xmlns:wps="http://schemas.microsoft.com/office/word/2010/wordprocessingShape" mc:Ignorable="w14 w15 wp14">
+<w:document xmlns:wpc="http://schemas.microsoft.com/office/word/2010/wordprocessingCanvas" xmlns:mc="http://schemas.openxmlformats.org/markup-compatibility/2006" xmlns:o="urn:schemas-microsoft-com:office:office" xmlns:r="http://schemas.openxmlformats.org/officeDocument/2006/relationships" xmlns:m="http://schemas.openxmlformats.org/officeDocument/2006/math" xmlns:v="urn:schemas-microsoft-com:vml" xmlns:wp14="http://schemas.microsoft.com/office/word/2010/wordprocessingDrawing" xmlns:wp="http://schemas.openxmlformats.org/drawingml/2006/wordprocessingDrawing" xmlns:w10="urn:schemas-microsoft-com:office:word" xmlns:w="http://schemas.openxmlformats.org/wordprocessingml/2006/main" xmlns:w14="http://schemas.microsoft.com/office/word/2010/wordml" xmlns:wpg="http://schemas.microsoft.com/office/word/2010/wordprocessingGroup" xmlns:wpi="http://schemas.microsoft.com/office/word/2010/wordprocessingInk" xmlns:wne="http://schemas.microsoft.com/office/word/2006/wordml" xmlns:wps="http://schemas.microsoft.com/office/word/2010/wordprocessingShape" mc:Ignorable="w14 wp14">
   <w:body>
     <w:tbl>
       <w:tblPr>
@@ -8,8 +8,8 @@
         <w:tblLook w:val="04A0" w:firstRow="1" w:lastRow="0" w:firstColumn="1" w:lastColumn="0" w:noHBand="0" w:noVBand="1"/>
       </w:tblPr>
       <w:tblGrid>
-        <w:gridCol w:w="5927"/>
-        <w:gridCol w:w="4755"/>
+        <w:gridCol w:w="8073"/>
+        <w:gridCol w:w="2609"/>
       </w:tblGrid>
       <w:tr>
         <w:trPr>
@@ -21,7 +21,7 @@
           </w:tcPr>
           <w:tbl>
             <w:tblPr>
-              <w:tblW w:w="5728" w:type="dxa"/>
+              <w:tblW w:w="7939" w:type="dxa"/>
               <w:tblBorders>
                 <w:top w:val="single" w:sz="8" w:space="0" w:color="AEBAD5"/>
                 <w:bottom w:val="single" w:sz="8" w:space="0" w:color="AEBAD5"/>
@@ -29,8 +29,9 @@
               <w:tblLook w:val="0680" w:firstRow="0" w:lastRow="0" w:firstColumn="1" w:lastColumn="0" w:noHBand="1" w:noVBand="1"/>
             </w:tblPr>
             <w:tblGrid>
-              <w:gridCol w:w="1760"/>
-              <w:gridCol w:w="3968"/>
+              <w:gridCol w:w="10"/>
+              <w:gridCol w:w="1750"/>
+              <w:gridCol w:w="6179"/>
             </w:tblGrid>
             <w:tr>
               <w:trPr>
@@ -39,6 +40,7 @@
               <w:tc>
                 <w:tcPr>
                   <w:tcW w:w="1760" w:type="dxa"/>
+                  <w:gridSpan w:val="2"/>
                   <w:vMerge w:val="restart"/>
                 </w:tcPr>
                 <w:p>
@@ -81,7 +83,7 @@
                         <o:lock v:ext="edit" aspectratio="t"/>
                       </v:shapetype>
                       <v:shape id="_x0000_i1025" type="#_x0000_t75" style="width:76.5pt;height:76.5pt">
-                        <v:imagedata r:id="rId7" o:title="DSC_0043"/>
+                        <v:imagedata r:id="rId8" o:title="DSC_0043"/>
                       </v:shape>
                     </w:pict>
                   </w:r>
@@ -89,7 +91,7 @@
               </w:tc>
               <w:tc>
                 <w:tcPr>
-                  <w:tcW w:w="3968" w:type="dxa"/>
+                  <w:tcW w:w="6179" w:type="dxa"/>
                 </w:tcPr>
                 <w:p>
                   <w:pPr>
@@ -122,6 +124,7 @@
               <w:tc>
                 <w:tcPr>
                   <w:tcW w:w="1760" w:type="dxa"/>
+                  <w:gridSpan w:val="2"/>
                   <w:vMerge/>
                 </w:tcPr>
                 <w:p>
@@ -140,7 +143,7 @@
               </w:tc>
               <w:tc>
                 <w:tcPr>
-                  <w:tcW w:w="3968" w:type="dxa"/>
+                  <w:tcW w:w="6179" w:type="dxa"/>
                 </w:tcPr>
                 <w:p>
                   <w:pPr>
@@ -151,6 +154,8 @@
                       <w:b/>
                       <w:bCs/>
                       <w:color w:val="595959" w:themeColor="text1" w:themeTint="A6"/>
+                      <w:sz w:val="22"/>
+                      <w:szCs w:val="22"/>
                     </w:rPr>
                   </w:pPr>
                   <w:r>
@@ -159,6 +164,8 @@
                       <w:b/>
                       <w:bCs/>
                       <w:color w:val="595959" w:themeColor="text1" w:themeTint="A6"/>
+                      <w:sz w:val="22"/>
+                      <w:szCs w:val="22"/>
                     </w:rPr>
                     <w:t>Ph</w:t>
                   </w:r>
@@ -168,6 +175,8 @@
                       <w:b/>
                       <w:bCs/>
                       <w:color w:val="595959" w:themeColor="text1" w:themeTint="A6"/>
+                      <w:sz w:val="22"/>
+                      <w:szCs w:val="22"/>
                     </w:rPr>
                     <w:t>.</w:t>
                   </w:r>
@@ -177,6 +186,8 @@
                       <w:b/>
                       <w:bCs/>
                       <w:color w:val="595959" w:themeColor="text1" w:themeTint="A6"/>
+                      <w:sz w:val="22"/>
+                      <w:szCs w:val="22"/>
                     </w:rPr>
                     <w:t>D</w:t>
                   </w:r>
@@ -186,6 +197,8 @@
                       <w:b/>
                       <w:bCs/>
                       <w:color w:val="595959" w:themeColor="text1" w:themeTint="A6"/>
+                      <w:sz w:val="22"/>
+                      <w:szCs w:val="22"/>
                     </w:rPr>
                     <w:t>.</w:t>
                   </w:r>
@@ -195,8 +208,10 @@
                       <w:b/>
                       <w:bCs/>
                       <w:color w:val="595959" w:themeColor="text1" w:themeTint="A6"/>
-                    </w:rPr>
-                    <w:t xml:space="preserve"> – IIT </w:t>
+                      <w:sz w:val="22"/>
+                      <w:szCs w:val="22"/>
+                    </w:rPr>
+                    <w:t xml:space="preserve"> – IIT Roorkee || </w:t>
                   </w:r>
                   <w:proofErr w:type="spellStart"/>
                   <w:r>
@@ -205,8 +220,10 @@
                       <w:b/>
                       <w:bCs/>
                       <w:color w:val="595959" w:themeColor="text1" w:themeTint="A6"/>
-                    </w:rPr>
-                    <w:t>Roorkee</w:t>
+                      <w:sz w:val="22"/>
+                      <w:szCs w:val="22"/>
+                    </w:rPr>
+                    <w:t>M.Tech</w:t>
                   </w:r>
                   <w:proofErr w:type="spellEnd"/>
                   <w:r>
@@ -215,8 +232,10 @@
                       <w:b/>
                       <w:bCs/>
                       <w:color w:val="595959" w:themeColor="text1" w:themeTint="A6"/>
-                    </w:rPr>
-                    <w:t xml:space="preserve"> || </w:t>
+                      <w:sz w:val="22"/>
+                      <w:szCs w:val="22"/>
+                    </w:rPr>
+                    <w:t xml:space="preserve"> – IIT BHU ||  </w:t>
                   </w:r>
                   <w:proofErr w:type="spellStart"/>
                   <w:r>
@@ -225,8 +244,10 @@
                       <w:b/>
                       <w:bCs/>
                       <w:color w:val="595959" w:themeColor="text1" w:themeTint="A6"/>
-                    </w:rPr>
-                    <w:t>M.Tech</w:t>
+                      <w:sz w:val="22"/>
+                      <w:szCs w:val="22"/>
+                    </w:rPr>
+                    <w:t>B.Tech</w:t>
                   </w:r>
                   <w:proofErr w:type="spellEnd"/>
                   <w:r>
@@ -235,8 +256,10 @@
                       <w:b/>
                       <w:bCs/>
                       <w:color w:val="595959" w:themeColor="text1" w:themeTint="A6"/>
-                    </w:rPr>
-                    <w:t xml:space="preserve"> – IIT BHU ||  </w:t>
+                      <w:sz w:val="22"/>
+                      <w:szCs w:val="22"/>
+                    </w:rPr>
+                    <w:t xml:space="preserve"> – NIT Rourkela || Research Intern – GE </w:t>
                   </w:r>
                   <w:proofErr w:type="spellStart"/>
                   <w:r>
@@ -245,8 +268,10 @@
                       <w:b/>
                       <w:bCs/>
                       <w:color w:val="595959" w:themeColor="text1" w:themeTint="A6"/>
-                    </w:rPr>
-                    <w:t>B.Tech</w:t>
+                      <w:sz w:val="22"/>
+                      <w:szCs w:val="22"/>
+                    </w:rPr>
+                    <w:t>Vernova</w:t>
                   </w:r>
                   <w:proofErr w:type="spellEnd"/>
                   <w:r>
@@ -255,29 +280,253 @@
                       <w:b/>
                       <w:bCs/>
                       <w:color w:val="595959" w:themeColor="text1" w:themeTint="A6"/>
-                    </w:rPr>
-                    <w:t xml:space="preserve"> – NIT Rourkela || Research Intern – GE </w:t>
-                  </w:r>
-                  <w:proofErr w:type="spellStart"/>
+                      <w:sz w:val="22"/>
+                      <w:szCs w:val="22"/>
+                    </w:rPr>
+                    <w:t xml:space="preserve"> ARC || GET – JSW </w:t>
+                  </w:r>
+                </w:p>
+              </w:tc>
+            </w:tr>
+            <w:tr>
+              <w:tblPrEx>
+                <w:tblBorders>
+                  <w:left w:val="single" w:sz="8" w:space="0" w:color="AEBAD5"/>
+                  <w:right w:val="single" w:sz="8" w:space="0" w:color="AEBAD5"/>
+                  <w:insideH w:val="single" w:sz="8" w:space="0" w:color="AEBAD5"/>
+                  <w:insideV w:val="single" w:sz="8" w:space="0" w:color="AEBAD5"/>
+                </w:tblBorders>
+                <w:tblLook w:val="04C0" w:firstRow="0" w:lastRow="1" w:firstColumn="1" w:lastColumn="0" w:noHBand="0" w:noVBand="1"/>
+              </w:tblPrEx>
+              <w:trPr>
+                <w:gridBefore w:val="1"/>
+                <w:wBefore w:w="10" w:type="dxa"/>
+                <w:trHeight w:val="308"/>
+              </w:trPr>
+              <w:tc>
+                <w:tcPr>
+                  <w:tcW w:w="7929" w:type="dxa"/>
+                  <w:gridSpan w:val="2"/>
+                  <w:tcBorders>
+                    <w:top w:val="single" w:sz="8" w:space="0" w:color="AEBAD5"/>
+                    <w:left w:val="single" w:sz="8" w:space="0" w:color="AEBAD5"/>
+                    <w:bottom w:val="single" w:sz="8" w:space="0" w:color="AEBAD5"/>
+                    <w:right w:val="single" w:sz="8" w:space="0" w:color="AEBAD5"/>
+                  </w:tcBorders>
+                  <w:shd w:val="clear" w:color="auto" w:fill="D9D9D9" w:themeFill="background1" w:themeFillShade="D9"/>
+                </w:tcPr>
+                <w:p>
+                  <w:pPr>
+                    <w:spacing w:after="0" w:line="240" w:lineRule="auto"/>
+                    <w:rPr>
+                      <w:rFonts w:ascii="Times New Roman" w:hAnsi="Times New Roman"/>
+                      <w:b/>
+                      <w:bCs/>
+                      <w:sz w:val="24"/>
+                      <w:szCs w:val="24"/>
+                    </w:rPr>
+                  </w:pPr>
+                  <w:r>
+                    <w:rPr>
+                      <w:rFonts w:ascii="Times New Roman" w:hAnsi="Times New Roman"/>
+                      <w:b/>
+                      <w:bCs/>
+                      <w:sz w:val="24"/>
+                      <w:szCs w:val="24"/>
+                    </w:rPr>
+                    <w:t>Contact</w:t>
+                  </w:r>
+                </w:p>
+              </w:tc>
+            </w:tr>
+            <w:tr>
+              <w:tblPrEx>
+                <w:tblBorders>
+                  <w:left w:val="single" w:sz="8" w:space="0" w:color="AEBAD5"/>
+                  <w:right w:val="single" w:sz="8" w:space="0" w:color="AEBAD5"/>
+                  <w:insideH w:val="single" w:sz="8" w:space="0" w:color="AEBAD5"/>
+                  <w:insideV w:val="single" w:sz="8" w:space="0" w:color="AEBAD5"/>
+                </w:tblBorders>
+                <w:tblLook w:val="04C0" w:firstRow="0" w:lastRow="1" w:firstColumn="1" w:lastColumn="0" w:noHBand="0" w:noVBand="1"/>
+              </w:tblPrEx>
+              <w:trPr>
+                <w:gridBefore w:val="1"/>
+                <w:wBefore w:w="10" w:type="dxa"/>
+                <w:trHeight w:val="1110"/>
+              </w:trPr>
+              <w:tc>
+                <w:tcPr>
+                  <w:tcW w:w="7929" w:type="dxa"/>
+                  <w:gridSpan w:val="2"/>
+                  <w:tcBorders>
+                    <w:top w:val="double" w:sz="6" w:space="0" w:color="AEBAD5"/>
+                    <w:left w:val="single" w:sz="8" w:space="0" w:color="AEBAD5"/>
+                    <w:bottom w:val="single" w:sz="8" w:space="0" w:color="AEBAD5"/>
+                    <w:right w:val="single" w:sz="8" w:space="0" w:color="AEBAD5"/>
+                  </w:tcBorders>
+                </w:tcPr>
+                <w:p>
+                  <w:pPr>
+                    <w:spacing w:after="0" w:line="240" w:lineRule="auto"/>
+                    <w:jc w:val="left"/>
+                    <w:rPr>
+                      <w:rFonts w:ascii="Times New Roman" w:hAnsi="Times New Roman"/>
+                      <w:b/>
+                      <w:bCs/>
+                      <w:sz w:val="24"/>
+                      <w:szCs w:val="24"/>
+                    </w:rPr>
+                  </w:pPr>
+                  <w:r>
+                    <w:rPr>
+                      <w:rFonts w:ascii="Times New Roman" w:hAnsi="Times New Roman"/>
+                      <w:b/>
+                      <w:bCs/>
+                      <w:sz w:val="24"/>
+                      <w:szCs w:val="24"/>
+                    </w:rPr>
+                    <w:t xml:space="preserve">Mob : </w:t>
+                  </w:r>
                   <w:r>
                     <w:rPr>
                       <w:rFonts w:ascii="Times New Roman" w:hAnsi="Times New Roman"/>
                       <w:b/>
                       <w:bCs/>
                       <w:color w:val="595959" w:themeColor="text1" w:themeTint="A6"/>
-                    </w:rPr>
-                    <w:t>Vernova</w:t>
-                  </w:r>
-                  <w:proofErr w:type="spellEnd"/>
+                      <w:sz w:val="24"/>
+                      <w:szCs w:val="24"/>
+                    </w:rPr>
+                    <w:t>+91-7738484037</w:t>
+                  </w:r>
+                </w:p>
+                <w:p>
+                  <w:pPr>
+                    <w:spacing w:after="0" w:line="240" w:lineRule="auto"/>
+                    <w:jc w:val="left"/>
+                    <w:rPr>
+                      <w:rStyle w:val="Hyperlink"/>
+                      <w:rFonts w:ascii="Times New Roman" w:hAnsi="Times New Roman"/>
+                      <w:b/>
+                      <w:bCs/>
+                      <w:sz w:val="24"/>
+                      <w:szCs w:val="24"/>
+                      <w:u w:val="none"/>
+                      <w:lang w:val="fr-FR"/>
+                    </w:rPr>
+                  </w:pPr>
+                  <w:r>
+                    <w:rPr>
+                      <w:rFonts w:ascii="Times New Roman" w:hAnsi="Times New Roman"/>
+                      <w:b/>
+                      <w:bCs/>
+                      <w:sz w:val="24"/>
+                      <w:szCs w:val="24"/>
+                      <w:lang w:val="fr-FR"/>
+                    </w:rPr>
+                    <w:t xml:space="preserve">E-mail : </w:t>
+                  </w:r>
+                  <w:hyperlink r:id="rId9" w:history="1">
+                    <w:r>
+                      <w:rPr>
+                        <w:rStyle w:val="Hyperlink"/>
+                        <w:rFonts w:ascii="Times New Roman" w:hAnsi="Times New Roman"/>
+                        <w:b/>
+                        <w:bCs/>
+                        <w:sz w:val="24"/>
+                        <w:szCs w:val="24"/>
+                        <w:u w:val="none"/>
+                        <w:lang w:val="fr-FR"/>
+                      </w:rPr>
+                      <w:t>sagrawal5@ee.iitr.ac.in</w:t>
+                    </w:r>
+                  </w:hyperlink>
                   <w:r>
                     <w:rPr>
                       <w:rFonts w:ascii="Times New Roman" w:hAnsi="Times New Roman"/>
                       <w:b/>
                       <w:bCs/>
                       <w:color w:val="595959" w:themeColor="text1" w:themeTint="A6"/>
-                    </w:rPr>
-                    <w:t xml:space="preserve"> ARC || GET – JSW </w:t>
-                  </w:r>
+                      <w:sz w:val="24"/>
+                      <w:szCs w:val="24"/>
+                      <w:lang w:val="fr-FR"/>
+                    </w:rPr>
+                    <w:t>,</w:t>
+                  </w:r>
+                  <w:r>
+                    <w:rPr>
+                      <w:rFonts w:ascii="Times New Roman" w:hAnsi="Times New Roman"/>
+                      <w:b/>
+                      <w:bCs/>
+                      <w:color w:val="595959" w:themeColor="text1" w:themeTint="A6"/>
+                      <w:sz w:val="24"/>
+                      <w:szCs w:val="24"/>
+                      <w:lang w:val="fr-FR"/>
+                    </w:rPr>
+                    <w:t xml:space="preserve"> </w:t>
+                  </w:r>
+                  <w:hyperlink r:id="rId10" w:history="1">
+                    <w:r>
+                      <w:rPr>
+                        <w:rStyle w:val="Hyperlink"/>
+                        <w:rFonts w:ascii="Times New Roman" w:hAnsi="Times New Roman"/>
+                        <w:b/>
+                        <w:bCs/>
+                        <w:sz w:val="24"/>
+                        <w:szCs w:val="24"/>
+                        <w:u w:val="none"/>
+                        <w:lang w:val="fr-FR"/>
+                      </w:rPr>
+                      <w:t>shwetank.agrawal23@gmail.com</w:t>
+                    </w:r>
+                  </w:hyperlink>
+                </w:p>
+                <w:p>
+                  <w:pPr>
+                    <w:spacing w:after="0" w:line="240" w:lineRule="auto"/>
+                    <w:jc w:val="left"/>
+                    <w:rPr>
+                      <w:rFonts w:ascii="Times New Roman" w:hAnsi="Times New Roman"/>
+                      <w:b/>
+                      <w:bCs/>
+                      <w:sz w:val="24"/>
+                      <w:szCs w:val="24"/>
+                    </w:rPr>
+                  </w:pPr>
+                  <w:r>
+                    <w:rPr>
+                      <w:rFonts w:ascii="Times New Roman" w:hAnsi="Times New Roman"/>
+                      <w:b/>
+                      <w:bCs/>
+                      <w:sz w:val="24"/>
+                      <w:szCs w:val="24"/>
+                    </w:rPr>
+                    <w:t>Social-link</w:t>
+                  </w:r>
+                  <w:r>
+                    <w:rPr>
+                      <w:rFonts w:ascii="Times New Roman" w:hAnsi="Times New Roman"/>
+                      <w:b/>
+                      <w:bCs/>
+                      <w:sz w:val="24"/>
+                      <w:szCs w:val="24"/>
+                    </w:rPr>
+                    <w:t xml:space="preserve"> : </w:t>
+                  </w:r>
+                  <w:hyperlink r:id="rId11" w:history="1">
+                    <w:r>
+                      <w:rPr>
+                        <w:rStyle w:val="Hyperlink"/>
+                        <w:rFonts w:ascii="Times New Roman" w:hAnsi="Times New Roman"/>
+                        <w:b/>
+                        <w:bCs/>
+                        <w:color w:val="0070C0"/>
+                        <w:sz w:val="24"/>
+                        <w:szCs w:val="24"/>
+                        <w:u w:val="none"/>
+                      </w:rPr>
+                      <w:t>LinkedIn</w:t>
+                    </w:r>
+                  </w:hyperlink>
                 </w:p>
               </w:tc>
             </w:tr>
@@ -299,7 +548,7 @@
           </w:tcPr>
           <w:tbl>
             <w:tblPr>
-              <w:tblW w:w="4536" w:type="dxa"/>
+              <w:tblW w:w="2400" w:type="dxa"/>
               <w:tblBorders>
                 <w:top w:val="single" w:sz="8" w:space="0" w:color="AEBAD5"/>
                 <w:left w:val="single" w:sz="8" w:space="0" w:color="AEBAD5"/>
@@ -311,30 +560,32 @@
               <w:tblLook w:val="04C0" w:firstRow="0" w:lastRow="1" w:firstColumn="1" w:lastColumn="0" w:noHBand="0" w:noVBand="1"/>
             </w:tblPr>
             <w:tblGrid>
-              <w:gridCol w:w="4536"/>
+              <w:gridCol w:w="2400"/>
             </w:tblGrid>
             <w:tr>
               <w:trPr>
-                <w:trHeight w:val="308"/>
+                <w:trHeight w:val="2657"/>
               </w:trPr>
               <w:tc>
                 <w:tcPr>
-                  <w:tcW w:w="4536" w:type="dxa"/>
+                  <w:tcW w:w="2400" w:type="dxa"/>
                   <w:tcBorders>
                     <w:top w:val="single" w:sz="8" w:space="0" w:color="AEBAD5"/>
                     <w:left w:val="single" w:sz="8" w:space="0" w:color="AEBAD5"/>
-                    <w:bottom w:val="single" w:sz="8" w:space="0" w:color="AEBAD5"/>
                     <w:right w:val="single" w:sz="8" w:space="0" w:color="AEBAD5"/>
                   </w:tcBorders>
-                  <w:shd w:val="clear" w:color="auto" w:fill="D9D9D9" w:themeFill="background1" w:themeFillShade="D9"/>
+                  <w:shd w:val="clear" w:color="auto" w:fill="auto"/>
                 </w:tcPr>
                 <w:p>
                   <w:pPr>
-                    <w:spacing w:after="0" w:line="240" w:lineRule="auto"/>
-                    <w:rPr>
-                      <w:rFonts w:ascii="Times New Roman" w:hAnsi="Times New Roman"/>
-                      <w:b/>
-                      <w:bCs/>
+                    <w:widowControl w:val="0"/>
+                    <w:autoSpaceDE w:val="0"/>
+                    <w:autoSpaceDN w:val="0"/>
+                    <w:adjustRightInd w:val="0"/>
+                    <w:spacing w:line="240" w:lineRule="auto"/>
+                    <w:jc w:val="center"/>
+                    <w:rPr>
+                      <w:rFonts w:ascii="Times New Roman" w:hAnsi="Times New Roman"/>
                       <w:sz w:val="24"/>
                       <w:szCs w:val="24"/>
                     </w:rPr>
@@ -342,285 +593,98 @@
                   <w:r>
                     <w:rPr>
                       <w:rFonts w:ascii="Times New Roman" w:hAnsi="Times New Roman"/>
-                      <w:b/>
-                      <w:bCs/>
+                      <w:noProof/>
                       <w:sz w:val="24"/>
                       <w:szCs w:val="24"/>
-                    </w:rPr>
-                    <w:t>Contact</w:t>
-                  </w:r>
-                </w:p>
-              </w:tc>
-            </w:tr>
-            <w:tr>
-              <w:trPr>
-                <w:trHeight w:val="1329"/>
-              </w:trPr>
-              <w:tc>
-                <w:tcPr>
-                  <w:tcW w:w="4536" w:type="dxa"/>
-                  <w:tcBorders>
-                    <w:top w:val="double" w:sz="6" w:space="0" w:color="AEBAD5"/>
-                    <w:left w:val="single" w:sz="8" w:space="0" w:color="AEBAD5"/>
-                    <w:bottom w:val="single" w:sz="8" w:space="0" w:color="AEBAD5"/>
-                    <w:right w:val="single" w:sz="8" w:space="0" w:color="AEBAD5"/>
-                  </w:tcBorders>
-                </w:tcPr>
-                <w:p>
-                  <w:pPr>
-                    <w:spacing w:after="0" w:line="240" w:lineRule="auto"/>
-                    <w:jc w:val="left"/>
-                    <w:rPr>
-                      <w:rFonts w:ascii="Times New Roman" w:hAnsi="Times New Roman"/>
-                      <w:b/>
-                      <w:bCs/>
+                      <w:lang w:bidi="ar-SA"/>
+                    </w:rPr>
+                    <w:drawing>
+                      <wp:inline distT="0" distB="0" distL="0" distR="0" wp14:anchorId="038D2FEC" wp14:editId="5A7433A5">
+                        <wp:extent cx="1261249" cy="1348283"/>
+                        <wp:effectExtent l="0" t="0" r="0" b="4445"/>
+                        <wp:docPr id="2" name="Picture 2" descr="C:\Users\Admin\Downloads\qrcode_200px.png"/>
+                        <wp:cNvGraphicFramePr>
+                          <a:graphicFrameLocks xmlns:a="http://schemas.openxmlformats.org/drawingml/2006/main" noChangeAspect="1"/>
+                        </wp:cNvGraphicFramePr>
+                        <a:graphic xmlns:a="http://schemas.openxmlformats.org/drawingml/2006/main">
+                          <a:graphicData uri="http://schemas.openxmlformats.org/drawingml/2006/picture">
+                            <pic:pic xmlns:pic="http://schemas.openxmlformats.org/drawingml/2006/picture">
+                              <pic:nvPicPr>
+                                <pic:cNvPr id="0" name="Picture 2" descr="C:\Users\Admin\Downloads\qrcode_200px.png"/>
+                                <pic:cNvPicPr>
+                                  <a:picLocks noChangeAspect="1" noChangeArrowheads="1"/>
+                                </pic:cNvPicPr>
+                              </pic:nvPicPr>
+                              <pic:blipFill rotWithShape="1">
+                                <a:blip r:embed="rId12" cstate="print">
+                                  <a:extLst>
+                                    <a:ext uri="{28A0092B-C50C-407E-A947-70E740481C1C}">
+                                      <a14:useLocalDpi xmlns:a14="http://schemas.microsoft.com/office/drawing/2010/main" val="0"/>
+                                    </a:ext>
+                                  </a:extLst>
+                                </a:blip>
+                                <a:srcRect b="4688"/>
+                                <a:stretch/>
+                              </pic:blipFill>
+                              <pic:spPr bwMode="auto">
+                                <a:xfrm>
+                                  <a:off x="0" y="0"/>
+                                  <a:ext cx="1278327" cy="1366539"/>
+                                </a:xfrm>
+                                <a:prstGeom prst="rect">
+                                  <a:avLst/>
+                                </a:prstGeom>
+                                <a:noFill/>
+                                <a:ln>
+                                  <a:noFill/>
+                                </a:ln>
+                                <a:extLst>
+                                  <a:ext uri="{53640926-AAD7-44D8-BBD7-CCE9431645EC}">
+                                    <a14:shadowObscured xmlns:a14="http://schemas.microsoft.com/office/drawing/2010/main"/>
+                                  </a:ext>
+                                </a:extLst>
+                              </pic:spPr>
+                            </pic:pic>
+                          </a:graphicData>
+                        </a:graphic>
+                      </wp:inline>
+                    </w:drawing>
+                  </w:r>
+                  <w:r>
+                    <w:rPr>
+                      <w:rFonts w:ascii="Times New Roman" w:hAnsi="Times New Roman"/>
                       <w:sz w:val="24"/>
                       <w:szCs w:val="24"/>
                     </w:rPr>
-                  </w:pPr>
-                  <w:r>
-                    <w:rPr>
-                      <w:rFonts w:ascii="Times New Roman" w:hAnsi="Times New Roman"/>
-                      <w:b/>
-                      <w:bCs/>
-                      <w:sz w:val="24"/>
-                      <w:szCs w:val="24"/>
-                    </w:rPr>
-                    <w:t>Mob</w:t>
-                  </w:r>
-                  <w:r>
-                    <w:rPr>
-                      <w:rFonts w:ascii="Times New Roman" w:hAnsi="Times New Roman"/>
-                      <w:b/>
-                      <w:bCs/>
-                      <w:sz w:val="24"/>
-                      <w:szCs w:val="24"/>
-                    </w:rPr>
-                    <w:t xml:space="preserve"> : </w:t>
-                  </w:r>
-                  <w:r>
-                    <w:rPr>
-                      <w:rFonts w:ascii="Times New Roman" w:hAnsi="Times New Roman"/>
-                      <w:b/>
-                      <w:bCs/>
-                      <w:color w:val="595959" w:themeColor="text1" w:themeTint="A6"/>
-                      <w:sz w:val="24"/>
-                      <w:szCs w:val="24"/>
-                    </w:rPr>
-                    <w:t>+91</w:t>
-                  </w:r>
-                  <w:r>
-                    <w:rPr>
-                      <w:rFonts w:ascii="Times New Roman" w:hAnsi="Times New Roman"/>
-                      <w:b/>
-                      <w:bCs/>
-                      <w:color w:val="595959" w:themeColor="text1" w:themeTint="A6"/>
-                      <w:sz w:val="24"/>
-                      <w:szCs w:val="24"/>
-                    </w:rPr>
-                    <w:t>-</w:t>
-                  </w:r>
-                  <w:r>
-                    <w:rPr>
-                      <w:rFonts w:ascii="Times New Roman" w:hAnsi="Times New Roman"/>
-                      <w:b/>
-                      <w:bCs/>
-                      <w:color w:val="595959" w:themeColor="text1" w:themeTint="A6"/>
-                      <w:sz w:val="24"/>
-                      <w:szCs w:val="24"/>
-                    </w:rPr>
-                    <w:t>7738484037</w:t>
+                    <w:t xml:space="preserve"> </w:t>
                   </w:r>
                 </w:p>
                 <w:p>
                   <w:pPr>
-                    <w:spacing w:after="0" w:line="240" w:lineRule="auto"/>
-                    <w:jc w:val="left"/>
+                    <w:widowControl w:val="0"/>
+                    <w:autoSpaceDE w:val="0"/>
+                    <w:autoSpaceDN w:val="0"/>
+                    <w:adjustRightInd w:val="0"/>
+                    <w:spacing w:line="240" w:lineRule="auto"/>
+                    <w:jc w:val="center"/>
                     <w:rPr>
                       <w:rFonts w:ascii="Times New Roman" w:hAnsi="Times New Roman"/>
                       <w:b/>
-                      <w:bCs/>
-                      <w:color w:val="595959" w:themeColor="text1" w:themeTint="A6"/>
-                      <w:sz w:val="24"/>
-                      <w:szCs w:val="24"/>
-                      <w:lang w:val="fr-FR"/>
+                      <w:color w:val="0070C0"/>
+                      <w:sz w:val="22"/>
+                      <w:szCs w:val="22"/>
                     </w:rPr>
                   </w:pPr>
                   <w:r>
                     <w:rPr>
                       <w:rFonts w:ascii="Times New Roman" w:hAnsi="Times New Roman"/>
                       <w:b/>
-                      <w:bCs/>
-                      <w:sz w:val="24"/>
-                      <w:szCs w:val="24"/>
-                      <w:lang w:val="fr-FR"/>
-                    </w:rPr>
-                    <w:t>E</w:t>
-                  </w:r>
-                  <w:r>
-                    <w:rPr>
-                      <w:rFonts w:ascii="Times New Roman" w:hAnsi="Times New Roman"/>
-                      <w:b/>
-                      <w:bCs/>
-                      <w:sz w:val="24"/>
-                      <w:szCs w:val="24"/>
-                      <w:lang w:val="fr-FR"/>
-                    </w:rPr>
-                    <w:t xml:space="preserve">-mail : </w:t>
-                  </w:r>
-                  <w:hyperlink r:id="rId8" w:history="1">
-                    <w:r>
-                      <w:rPr>
-                        <w:rStyle w:val="Hyperlink"/>
-                        <w:rFonts w:ascii="Times New Roman" w:hAnsi="Times New Roman"/>
-                        <w:b/>
-                        <w:bCs/>
-                        <w:sz w:val="24"/>
-                        <w:szCs w:val="24"/>
-                        <w:u w:val="none"/>
-                        <w:lang w:val="fr-FR"/>
-                      </w:rPr>
-                      <w:t>sagrawal5@ee.iitr.ac.in</w:t>
-                    </w:r>
-                  </w:hyperlink>
-                  <w:r>
-                    <w:rPr>
-                      <w:rFonts w:ascii="Times New Roman" w:hAnsi="Times New Roman"/>
-                      <w:b/>
-                      <w:bCs/>
-                      <w:color w:val="595959" w:themeColor="text1" w:themeTint="A6"/>
-                      <w:sz w:val="24"/>
-                      <w:szCs w:val="24"/>
-                      <w:lang w:val="fr-FR"/>
-                    </w:rPr>
-                    <w:t xml:space="preserve"> </w:t>
-                  </w:r>
-                  <w:r>
-                    <w:rPr>
-                      <w:rFonts w:ascii="Times New Roman" w:hAnsi="Times New Roman"/>
-                      <w:b/>
-                      <w:bCs/>
-                      <w:color w:val="595959" w:themeColor="text1" w:themeTint="A6"/>
-                      <w:sz w:val="24"/>
-                      <w:szCs w:val="24"/>
-                      <w:lang w:val="fr-FR"/>
-                    </w:rPr>
-                    <w:t>,</w:t>
-                  </w:r>
-                </w:p>
-                <w:p>
-                  <w:pPr>
-                    <w:spacing w:after="0" w:line="240" w:lineRule="auto"/>
-                    <w:jc w:val="left"/>
-                    <w:rPr>
-                      <w:rFonts w:ascii="Times New Roman" w:hAnsi="Times New Roman"/>
-                      <w:b/>
-                      <w:bCs/>
-                      <w:color w:val="595959" w:themeColor="text1" w:themeTint="A6"/>
-                      <w:sz w:val="24"/>
-                      <w:szCs w:val="24"/>
-                      <w:lang w:val="fr-FR"/>
-                    </w:rPr>
-                  </w:pPr>
-                  <w:r>
-                    <w:rPr>
-                      <w:rFonts w:ascii="Times New Roman" w:hAnsi="Times New Roman"/>
-                      <w:b/>
-                      <w:bCs/>
-                      <w:color w:val="595959" w:themeColor="text1" w:themeTint="A6"/>
-                      <w:sz w:val="24"/>
-                      <w:szCs w:val="24"/>
-                      <w:lang w:val="fr-FR"/>
-                    </w:rPr>
-                    <w:t xml:space="preserve">               </w:t>
-                  </w:r>
-                  <w:hyperlink r:id="rId9" w:history="1">
-                    <w:r>
-                      <w:rPr>
-                        <w:rStyle w:val="Hyperlink"/>
-                        <w:rFonts w:ascii="Times New Roman" w:hAnsi="Times New Roman"/>
-                        <w:b/>
-                        <w:bCs/>
-                        <w:sz w:val="24"/>
-                        <w:szCs w:val="24"/>
-                        <w:u w:val="none"/>
-                        <w:lang w:val="fr-FR"/>
-                      </w:rPr>
-                      <w:t>shwetank.agrawal23@gmail.com</w:t>
-                    </w:r>
-                  </w:hyperlink>
-                </w:p>
-                <w:p>
-                  <w:pPr>
-                    <w:spacing w:after="0" w:line="240" w:lineRule="auto"/>
-                    <w:jc w:val="left"/>
-                    <w:rPr>
-                      <w:rFonts w:ascii="Times New Roman" w:hAnsi="Times New Roman"/>
-                      <w:b/>
-                      <w:bCs/>
                       <w:color w:val="0070C0"/>
-                      <w:sz w:val="26"/>
-                      <w:szCs w:val="26"/>
-                      <w:lang w:val="fr-FR"/>
-                    </w:rPr>
-                  </w:pPr>
-                  <w:r>
-                    <w:rPr>
-                      <w:rFonts w:ascii="Times New Roman" w:hAnsi="Times New Roman"/>
-                      <w:b/>
-                      <w:bCs/>
-                      <w:sz w:val="24"/>
-                      <w:szCs w:val="24"/>
-                      <w:lang w:val="fr-FR"/>
-                    </w:rPr>
-                    <w:t xml:space="preserve">Social-Link : </w:t>
-                  </w:r>
-                  <w:hyperlink r:id="rId10" w:history="1">
-                    <w:proofErr w:type="spellStart"/>
-                    <w:r>
-                      <w:rPr>
-                        <w:rStyle w:val="Hyperlink"/>
-                        <w:rFonts w:ascii="Times New Roman" w:hAnsi="Times New Roman"/>
-                        <w:b/>
-                        <w:bCs/>
-                        <w:color w:val="0070C0"/>
-                        <w:sz w:val="24"/>
-                        <w:szCs w:val="24"/>
-                        <w:lang w:val="fr-FR"/>
-                      </w:rPr>
-                      <w:t>Linkedin</w:t>
-                    </w:r>
-                    <w:proofErr w:type="spellEnd"/>
-                  </w:hyperlink>
-                  <w:r>
-                    <w:rPr>
-                      <w:rFonts w:ascii="Times New Roman" w:hAnsi="Times New Roman"/>
-                      <w:b/>
-                      <w:bCs/>
-                      <w:color w:val="0070C0"/>
-                      <w:sz w:val="24"/>
-                      <w:szCs w:val="24"/>
-                      <w:lang w:val="fr-FR"/>
-                    </w:rPr>
-                    <w:t xml:space="preserve">, </w:t>
-                  </w:r>
-                  <w:hyperlink r:id="rId11" w:history="1">
-                    <w:proofErr w:type="spellStart"/>
-                    <w:r>
-                      <w:rPr>
-                        <w:rStyle w:val="Hyperlink"/>
-                        <w:rFonts w:ascii="Times New Roman" w:hAnsi="Times New Roman"/>
-                        <w:b/>
-                        <w:bCs/>
-                        <w:color w:val="0070C0"/>
-                        <w:sz w:val="24"/>
-                        <w:szCs w:val="24"/>
-                        <w:lang w:val="fr-FR"/>
-                      </w:rPr>
-                      <w:t>ieeexplore</w:t>
-                    </w:r>
-                    <w:proofErr w:type="spellEnd"/>
-                  </w:hyperlink>
+                      <w:sz w:val="22"/>
+                      <w:szCs w:val="22"/>
+                    </w:rPr>
+                    <w:t>SCAN TO CONNECT WITH ME</w:t>
+                  </w:r>
                 </w:p>
               </w:tc>
             </w:tr>
@@ -725,58 +789,48 @@
                     </w:rPr>
                     <w:t xml:space="preserve">Mathematical modeling &amp; Stability analysis, </w:t>
                   </w:r>
-                  <w:proofErr w:type="spellStart"/>
+                  <w:r>
+                    <w:rPr>
+                      <w:rFonts w:ascii="Times New Roman" w:hAnsi="Times New Roman"/>
+                    </w:rPr>
+                    <w:t xml:space="preserve">Microgrid Operation &amp; Control, </w:t>
+                  </w:r>
+                  <w:r>
+                    <w:rPr>
+                      <w:rFonts w:ascii="Times New Roman" w:hAnsi="Times New Roman"/>
+                    </w:rPr>
+                    <w:t>Automatic Generation and Control, Design and control of Power Electronics Converters, Integration of Renewable energy sources like Solar and wind with the grid, Implementation of grid codes, grid forming, feeding</w:t>
+                  </w:r>
+                  <w:r>
+                    <w:rPr>
+                      <w:rFonts w:ascii="Times New Roman" w:hAnsi="Times New Roman"/>
+                    </w:rPr>
+                    <w:t>,</w:t>
+                  </w:r>
+                  <w:r>
+                    <w:rPr>
+                      <w:rFonts w:ascii="Times New Roman" w:hAnsi="Times New Roman"/>
+                    </w:rPr>
+                    <w:t xml:space="preserve"> and supporting control algorithms for inver</w:t>
+                  </w:r>
+                  <w:r>
+                    <w:rPr>
+                      <w:rFonts w:ascii="Times New Roman" w:hAnsi="Times New Roman"/>
+                    </w:rPr>
+                    <w:t xml:space="preserve">ters, centralized, </w:t>
+                  </w:r>
+                  <w:r>
+                    <w:rPr>
+                      <w:rFonts w:ascii="Times New Roman" w:hAnsi="Times New Roman"/>
+                    </w:rPr>
+                    <w:t xml:space="preserve">distributed control implementation in </w:t>
+                  </w:r>
                   <w:r>
                     <w:rPr>
                       <w:rFonts w:ascii="Times New Roman" w:hAnsi="Times New Roman"/>
                     </w:rPr>
                     <w:t>Microgrid</w:t>
                   </w:r>
-                  <w:proofErr w:type="spellEnd"/>
-                  <w:r>
-                    <w:rPr>
-                      <w:rFonts w:ascii="Times New Roman" w:hAnsi="Times New Roman"/>
-                    </w:rPr>
-                    <w:t xml:space="preserve"> Operation &amp; Control, </w:t>
-                  </w:r>
-                  <w:r>
-                    <w:rPr>
-                      <w:rFonts w:ascii="Times New Roman" w:hAnsi="Times New Roman"/>
-                    </w:rPr>
-                    <w:t>Automatic Generation and Control, Design and control of Power Electronics Converters, Integration of Renewable energy sources like Solar and wind with the grid, Implementation of grid codes, grid forming, feeding</w:t>
-                  </w:r>
-                  <w:r>
-                    <w:rPr>
-                      <w:rFonts w:ascii="Times New Roman" w:hAnsi="Times New Roman"/>
-                    </w:rPr>
-                    <w:t>,</w:t>
-                  </w:r>
-                  <w:r>
-                    <w:rPr>
-                      <w:rFonts w:ascii="Times New Roman" w:hAnsi="Times New Roman"/>
-                    </w:rPr>
-                    <w:t xml:space="preserve"> and supporting control algorithms for inver</w:t>
-                  </w:r>
-                  <w:r>
-                    <w:rPr>
-                      <w:rFonts w:ascii="Times New Roman" w:hAnsi="Times New Roman"/>
-                    </w:rPr>
-                    <w:t xml:space="preserve">ters, centralized, </w:t>
-                  </w:r>
-                  <w:r>
-                    <w:rPr>
-                      <w:rFonts w:ascii="Times New Roman" w:hAnsi="Times New Roman"/>
-                    </w:rPr>
-                    <w:t xml:space="preserve">distributed control implementation in </w:t>
-                  </w:r>
-                  <w:proofErr w:type="spellStart"/>
-                  <w:r>
-                    <w:rPr>
-                      <w:rFonts w:ascii="Times New Roman" w:hAnsi="Times New Roman"/>
-                    </w:rPr>
-                    <w:t>Microgrid</w:t>
-                  </w:r>
-                  <w:proofErr w:type="spellEnd"/>
                   <w:r>
                     <w:rPr>
                       <w:rFonts w:ascii="Times New Roman" w:hAnsi="Times New Roman"/>
@@ -978,8 +1032,6 @@
                     </w:rPr>
                     <w:t>C</w:t>
                   </w:r>
-                  <w:bookmarkStart w:id="0" w:name="_GoBack"/>
-                  <w:bookmarkEnd w:id="0"/>
                   <w:r>
                     <w:rPr>
                       <w:rFonts w:ascii="Times New Roman" w:hAnsi="Times New Roman"/>
@@ -1439,23 +1491,7 @@
                             <w:rFonts w:ascii="Times New Roman" w:hAnsi="Times New Roman"/>
                             <w:bCs/>
                           </w:rPr>
-                          <w:t xml:space="preserve">IIT </w:t>
-                        </w:r>
-                        <w:proofErr w:type="spellStart"/>
-                        <w:r>
-                          <w:rPr>
-                            <w:rFonts w:ascii="Times New Roman" w:hAnsi="Times New Roman"/>
-                            <w:bCs/>
-                          </w:rPr>
-                          <w:t>Roorkee</w:t>
-                        </w:r>
-                        <w:proofErr w:type="spellEnd"/>
-                        <w:r>
-                          <w:rPr>
-                            <w:rFonts w:ascii="Times New Roman" w:hAnsi="Times New Roman"/>
-                            <w:bCs/>
-                          </w:rPr>
-                          <w:t>, India</w:t>
+                          <w:t>IIT Roorkee, India</w:t>
                         </w:r>
                       </w:p>
                     </w:tc>
@@ -1484,8 +1520,10 @@
                             <w:rFonts w:ascii="Times New Roman" w:hAnsi="Times New Roman"/>
                             <w:bCs/>
                           </w:rPr>
-                          <w:t>5</w:t>
+                          <w:t>6</w:t>
                         </w:r>
+                        <w:bookmarkStart w:id="0" w:name="_GoBack"/>
+                        <w:bookmarkEnd w:id="0"/>
                       </w:p>
                     </w:tc>
                     <w:tc>
@@ -2780,6 +2818,7 @@
                       <w:rFonts w:ascii="Times New Roman" w:hAnsi="Times New Roman"/>
                       <w:b/>
                     </w:rPr>
+                    <w:lastRenderedPageBreak/>
                     <w:t xml:space="preserve">Industrial Automation (PLC) </w:t>
                   </w:r>
                   <w:r>
@@ -2983,17 +3022,8 @@
                       <w:rFonts w:ascii="Times New Roman" w:hAnsi="Times New Roman"/>
                       <w:b/>
                     </w:rPr>
-                    <w:t xml:space="preserve">in Hybrid </w:t>
-                  </w:r>
-                  <w:proofErr w:type="spellStart"/>
-                  <w:r>
-                    <w:rPr>
-                      <w:rFonts w:ascii="Times New Roman" w:hAnsi="Times New Roman"/>
-                      <w:b/>
-                    </w:rPr>
-                    <w:t>Microgrid</w:t>
-                  </w:r>
-                  <w:proofErr w:type="spellEnd"/>
+                    <w:t>in Hybrid Microgrid</w:t>
+                  </w:r>
                 </w:p>
                 <w:p>
                   <w:pPr>
@@ -3027,23 +3057,7 @@
                       <w:rFonts w:ascii="Times New Roman" w:hAnsi="Times New Roman"/>
                       <w:bCs/>
                     </w:rPr>
-                    <w:t xml:space="preserve">nterlinking converter in hybrid </w:t>
-                  </w:r>
-                  <w:proofErr w:type="spellStart"/>
-                  <w:r>
-                    <w:rPr>
-                      <w:rFonts w:ascii="Times New Roman" w:hAnsi="Times New Roman"/>
-                      <w:bCs/>
-                    </w:rPr>
-                    <w:t>Microgrid</w:t>
-                  </w:r>
-                  <w:proofErr w:type="spellEnd"/>
-                  <w:r>
-                    <w:rPr>
-                      <w:rFonts w:ascii="Times New Roman" w:hAnsi="Times New Roman"/>
-                      <w:bCs/>
-                    </w:rPr>
-                    <w:t xml:space="preserve"> and </w:t>
+                    <w:t xml:space="preserve">nterlinking converter in hybrid Microgrid and </w:t>
                   </w:r>
                   <w:proofErr w:type="spellStart"/>
                   <w:r>
@@ -3155,21 +3169,7 @@
                     <w:rPr>
                       <w:rFonts w:ascii="Times New Roman" w:hAnsi="Times New Roman"/>
                     </w:rPr>
-                    <w:t xml:space="preserve">Dual virtual inertia control (DVIC) for the interlinking converter to improve the ROCOF and ROCOV in the hybrid </w:t>
-                  </w:r>
-                  <w:proofErr w:type="spellStart"/>
-                  <w:r>
-                    <w:rPr>
-                      <w:rFonts w:ascii="Times New Roman" w:hAnsi="Times New Roman"/>
-                    </w:rPr>
-                    <w:t>Microgrid</w:t>
-                  </w:r>
-                  <w:proofErr w:type="spellEnd"/>
-                  <w:r>
-                    <w:rPr>
-                      <w:rFonts w:ascii="Times New Roman" w:hAnsi="Times New Roman"/>
-                    </w:rPr>
-                    <w:t xml:space="preserve"> and validated by MATLAB simulation.</w:t>
+                    <w:t>Dual virtual inertia control (DVIC) for the interlinking converter to improve the ROCOF and ROCOV in the hybrid Microgrid and validated by MATLAB simulation.</w:t>
                   </w:r>
                   <w:r>
                     <w:rPr>
@@ -3206,17 +3206,8 @@
                       <w:rFonts w:ascii="Times New Roman" w:hAnsi="Times New Roman"/>
                       <w:b/>
                     </w:rPr>
-                    <w:t xml:space="preserve">Centralized Control of Hybrid </w:t>
-                  </w:r>
-                  <w:proofErr w:type="spellStart"/>
-                  <w:r>
-                    <w:rPr>
-                      <w:rFonts w:ascii="Times New Roman" w:hAnsi="Times New Roman"/>
-                      <w:b/>
-                    </w:rPr>
-                    <w:t>Microgrid</w:t>
-                  </w:r>
-                  <w:proofErr w:type="spellEnd"/>
+                    <w:t>Centralized Control of Hybrid Microgrid</w:t>
+                  </w:r>
                 </w:p>
                 <w:p>
                   <w:pPr>
@@ -3236,21 +3227,7 @@
                     <w:rPr>
                       <w:rFonts w:ascii="Times New Roman" w:hAnsi="Times New Roman"/>
                     </w:rPr>
-                    <w:t xml:space="preserve">Modeling and stability of generalized hybrid </w:t>
-                  </w:r>
-                  <w:proofErr w:type="spellStart"/>
-                  <w:r>
-                    <w:rPr>
-                      <w:rFonts w:ascii="Times New Roman" w:hAnsi="Times New Roman"/>
-                    </w:rPr>
-                    <w:t>Microgrid</w:t>
-                  </w:r>
-                  <w:proofErr w:type="spellEnd"/>
-                  <w:r>
-                    <w:rPr>
-                      <w:rFonts w:ascii="Times New Roman" w:hAnsi="Times New Roman"/>
-                    </w:rPr>
-                    <w:t xml:space="preserve"> with hierarchical control consisting of primary and secondary control.</w:t>
+                    <w:t>Modeling and stability of generalized hybrid Microgrid with hierarchical control consisting of primary and secondary control.</w:t>
                   </w:r>
                 </w:p>
                 <w:p>
@@ -3340,17 +3317,8 @@
                       <w:rFonts w:ascii="Times New Roman" w:hAnsi="Times New Roman"/>
                       <w:b/>
                     </w:rPr>
-                    <w:t xml:space="preserve">Distributed Control of Hybrid </w:t>
-                  </w:r>
-                  <w:proofErr w:type="spellStart"/>
-                  <w:r>
-                    <w:rPr>
-                      <w:rFonts w:ascii="Times New Roman" w:hAnsi="Times New Roman"/>
-                      <w:b/>
-                    </w:rPr>
-                    <w:t>Microgrid</w:t>
-                  </w:r>
-                  <w:proofErr w:type="spellEnd"/>
+                    <w:t>Distributed Control of Hybrid Microgrid</w:t>
+                  </w:r>
                 </w:p>
                 <w:p>
                   <w:pPr>
@@ -3370,23 +3338,7 @@
                       <w:rFonts w:ascii="Times New Roman" w:hAnsi="Times New Roman"/>
                       <w:bCs/>
                     </w:rPr>
-                    <w:t xml:space="preserve">Distributed Multi-objective Control of Hybrid </w:t>
-                  </w:r>
-                  <w:proofErr w:type="spellStart"/>
-                  <w:r>
-                    <w:rPr>
-                      <w:rFonts w:ascii="Times New Roman" w:hAnsi="Times New Roman"/>
-                      <w:bCs/>
-                    </w:rPr>
-                    <w:t>Microgrid</w:t>
-                  </w:r>
-                  <w:proofErr w:type="spellEnd"/>
-                  <w:r>
-                    <w:rPr>
-                      <w:rFonts w:ascii="Times New Roman" w:hAnsi="Times New Roman"/>
-                      <w:bCs/>
-                    </w:rPr>
-                    <w:t xml:space="preserve"> in Autonomous Mode</w:t>
+                    <w:t>Distributed Multi-objective Control of Hybrid Microgrid in Autonomous Mode</w:t>
                   </w:r>
                   <w:r>
                     <w:rPr>
@@ -3420,21 +3372,7 @@
                     <w:rPr>
                       <w:rFonts w:ascii="Times New Roman" w:hAnsi="Times New Roman"/>
                     </w:rPr>
-                    <w:t xml:space="preserve">Modeling and stability of the generalized hybrid </w:t>
-                  </w:r>
-                  <w:proofErr w:type="spellStart"/>
-                  <w:r>
-                    <w:rPr>
-                      <w:rFonts w:ascii="Times New Roman" w:hAnsi="Times New Roman"/>
-                    </w:rPr>
-                    <w:t>Microgrid</w:t>
-                  </w:r>
-                  <w:proofErr w:type="spellEnd"/>
-                  <w:r>
-                    <w:rPr>
-                      <w:rFonts w:ascii="Times New Roman" w:hAnsi="Times New Roman"/>
-                    </w:rPr>
-                    <w:t xml:space="preserve"> with distributed secondary control along with the validation with CHIL and UART protocol for communication.</w:t>
+                    <w:t>Modeling and stability of the generalized hybrid Microgrid with distributed secondary control along with the validation with CHIL and UART protocol for communication.</w:t>
                   </w:r>
                 </w:p>
                 <w:p>
@@ -3833,21 +3771,7 @@
                     <w:rPr>
                       <w:rFonts w:ascii="Times New Roman" w:hAnsi="Times New Roman"/>
                     </w:rPr>
-                    <w:t xml:space="preserve">, V. Kumar and P. Sharma, "Operation and Control of Parallel-Operated Interlinking Converter in Hybrid </w:t>
-                  </w:r>
-                  <w:proofErr w:type="spellStart"/>
-                  <w:r>
-                    <w:rPr>
-                      <w:rFonts w:ascii="Times New Roman" w:hAnsi="Times New Roman"/>
-                    </w:rPr>
-                    <w:t>Microgrid</w:t>
-                  </w:r>
-                  <w:proofErr w:type="spellEnd"/>
-                  <w:r>
-                    <w:rPr>
-                      <w:rFonts w:ascii="Times New Roman" w:hAnsi="Times New Roman"/>
-                    </w:rPr>
-                    <w:t>," in IEEE Transactions on Industry Applications.</w:t>
+                    <w:t>, V. Kumar and P. Sharma, "Operation and Control of Parallel-Operated Interlinking Converter in Hybrid Microgrid," in IEEE Transactions on Industry Applications.</w:t>
                   </w:r>
                 </w:p>
                 <w:p>
@@ -3981,21 +3905,7 @@
                     <w:rPr>
                       <w:rFonts w:ascii="Times New Roman" w:hAnsi="Times New Roman"/>
                     </w:rPr>
-                    <w:t xml:space="preserve">, “Dual Virtual Inertia Control of Interlinking Converter in Hybrid </w:t>
-                  </w:r>
-                  <w:proofErr w:type="spellStart"/>
-                  <w:r>
-                    <w:rPr>
-                      <w:rFonts w:ascii="Times New Roman" w:hAnsi="Times New Roman"/>
-                    </w:rPr>
-                    <w:t>Microgrid</w:t>
-                  </w:r>
-                  <w:proofErr w:type="spellEnd"/>
-                  <w:r>
-                    <w:rPr>
-                      <w:rFonts w:ascii="Times New Roman" w:hAnsi="Times New Roman"/>
-                    </w:rPr>
-                    <w:t xml:space="preserve">,” IEEE PEDES 2024, NIT </w:t>
+                    <w:t xml:space="preserve">, “Dual Virtual Inertia Control of Interlinking Converter in Hybrid Microgrid,” IEEE PEDES 2024, NIT </w:t>
                   </w:r>
                   <w:proofErr w:type="spellStart"/>
                   <w:r>
@@ -4080,7 +3990,14 @@
                     <w:rPr>
                       <w:rFonts w:ascii="Times New Roman" w:hAnsi="Times New Roman"/>
                     </w:rPr>
-                    <w:t>Interlinking Converter Operation with Enhanced Hybrid and Inverse Q-V Droop</w:t>
+                    <w:t xml:space="preserve">Interlinking Converter Operation with Enhanced Hybrid and Inverse </w:t>
+                  </w:r>
+                  <w:r>
+                    <w:rPr>
+                      <w:rFonts w:ascii="Times New Roman" w:hAnsi="Times New Roman"/>
+                    </w:rPr>
+                    <w:lastRenderedPageBreak/>
+                    <w:t>Q-V Droop</w:t>
                   </w:r>
                   <w:r>
                     <w:rPr>
@@ -4190,7 +4107,6 @@
                     <w:rPr>
                       <w:rFonts w:ascii="Times New Roman" w:hAnsi="Times New Roman"/>
                     </w:rPr>
-                    <w:lastRenderedPageBreak/>
                     <w:t xml:space="preserve">S. Agrawal, B. </w:t>
                   </w:r>
                   <w:proofErr w:type="spellStart"/>
@@ -4267,21 +4183,7 @@
                     <w:rPr>
                       <w:rFonts w:ascii="Times New Roman" w:hAnsi="Times New Roman"/>
                     </w:rPr>
-                    <w:t xml:space="preserve">, V. Kumar and P. Sharma, "Distributed Multi-objective Control of Hybrid </w:t>
-                  </w:r>
-                  <w:proofErr w:type="spellStart"/>
-                  <w:r>
-                    <w:rPr>
-                      <w:rFonts w:ascii="Times New Roman" w:hAnsi="Times New Roman"/>
-                    </w:rPr>
-                    <w:t>Microgrid</w:t>
-                  </w:r>
-                  <w:proofErr w:type="spellEnd"/>
-                  <w:r>
-                    <w:rPr>
-                      <w:rFonts w:ascii="Times New Roman" w:hAnsi="Times New Roman"/>
-                    </w:rPr>
-                    <w:t xml:space="preserve"> in Autonomous Mode," 2023 IEEE Power &amp; Energy Society General Meeting (PESGM), Orlando, FL, USA, 2023, pp. 1-5.</w:t>
+                    <w:t>, V. Kumar and P. Sharma, "Distributed Multi-objective Control of Hybrid Microgrid in Autonomous Mode," 2023 IEEE Power &amp; Energy Society General Meeting (PESGM), Orlando, FL, USA, 2023, pp. 1-5.</w:t>
                   </w:r>
                 </w:p>
                 <w:p>
@@ -4315,21 +4217,7 @@
                     <w:rPr>
                       <w:rFonts w:ascii="Times New Roman" w:hAnsi="Times New Roman"/>
                     </w:rPr>
-                    <w:t xml:space="preserve">, V. Kumar and P. Sharma, "Interlinking Converter Operation in Hybrid </w:t>
-                  </w:r>
-                  <w:proofErr w:type="spellStart"/>
-                  <w:r>
-                    <w:rPr>
-                      <w:rFonts w:ascii="Times New Roman" w:hAnsi="Times New Roman"/>
-                    </w:rPr>
-                    <w:t>Microgrid</w:t>
-                  </w:r>
-                  <w:proofErr w:type="spellEnd"/>
-                  <w:r>
-                    <w:rPr>
-                      <w:rFonts w:ascii="Times New Roman" w:hAnsi="Times New Roman"/>
-                    </w:rPr>
-                    <w:t xml:space="preserve"> As a Tie-line," 2022 IEEE International Conference on Power Electronics, Drives and Energy Systems (PEDES), Jaipur, India, 2022, pp. 1-6.</w:t>
+                    <w:t>, V. Kumar and P. Sharma, "Interlinking Converter Operation in Hybrid Microgrid As a Tie-line," 2022 IEEE International Conference on Power Electronics, Drives and Energy Systems (PEDES), Jaipur, India, 2022, pp. 1-6.</w:t>
                   </w:r>
                 </w:p>
                 <w:p>
@@ -4781,18 +4669,8 @@
                       <w:b/>
                       <w:color w:val="0070C0"/>
                     </w:rPr>
-                    <w:t xml:space="preserve">SRIC – IIT </w:t>
-                  </w:r>
-                  <w:proofErr w:type="spellStart"/>
-                  <w:r>
-                    <w:rPr>
-                      <w:rFonts w:ascii="Times New Roman" w:hAnsi="Times New Roman"/>
-                      <w:b/>
-                      <w:color w:val="0070C0"/>
-                    </w:rPr>
-                    <w:t>Roorkee</w:t>
-                  </w:r>
-                  <w:proofErr w:type="spellEnd"/>
+                    <w:t>SRIC – IIT Roorkee</w:t>
+                  </w:r>
                   <w:r>
                     <w:rPr>
                       <w:rFonts w:ascii="Times New Roman" w:hAnsi="Times New Roman"/>
@@ -4814,7 +4692,7 @@
                     </w:rPr>
                     <w:t xml:space="preserve">Website: </w:t>
                   </w:r>
-                  <w:hyperlink r:id="rId12" w:history="1">
+                  <w:hyperlink r:id="rId13" w:history="1">
                     <w:r>
                       <w:rPr>
                         <w:rStyle w:val="Hyperlink"/>
@@ -4843,21 +4721,7 @@
                     <w:rPr>
                       <w:rFonts w:ascii="Times New Roman" w:hAnsi="Times New Roman"/>
                     </w:rPr>
-                    <w:t xml:space="preserve">Hybrid </w:t>
-                  </w:r>
-                  <w:proofErr w:type="spellStart"/>
-                  <w:r>
-                    <w:rPr>
-                      <w:rFonts w:ascii="Times New Roman" w:hAnsi="Times New Roman"/>
-                    </w:rPr>
-                    <w:t>Microgrid</w:t>
-                  </w:r>
-                  <w:proofErr w:type="spellEnd"/>
-                  <w:r>
-                    <w:rPr>
-                      <w:rFonts w:ascii="Times New Roman" w:hAnsi="Times New Roman"/>
-                    </w:rPr>
-                    <w:t xml:space="preserve"> Lab-setup at </w:t>
+                    <w:t xml:space="preserve">Hybrid Microgrid Lab-setup at </w:t>
                   </w:r>
                   <w:r>
                     <w:rPr>
@@ -4893,21 +4757,7 @@
                     <w:rPr>
                       <w:rFonts w:ascii="Times New Roman" w:hAnsi="Times New Roman"/>
                     </w:rPr>
-                    <w:t xml:space="preserve">epartment IIT </w:t>
-                  </w:r>
-                  <w:proofErr w:type="spellStart"/>
-                  <w:r>
-                    <w:rPr>
-                      <w:rFonts w:ascii="Times New Roman" w:hAnsi="Times New Roman"/>
-                    </w:rPr>
-                    <w:t>Roorkee</w:t>
-                  </w:r>
-                  <w:proofErr w:type="spellEnd"/>
-                  <w:r>
-                    <w:rPr>
-                      <w:rFonts w:ascii="Times New Roman" w:hAnsi="Times New Roman"/>
-                    </w:rPr>
-                    <w:t>.</w:t>
+                    <w:t>epartment IIT Roorkee.</w:t>
                   </w:r>
                 </w:p>
                 <w:p>
@@ -5157,15 +5007,33 @@
                     <w:ind w:left="360"/>
                     <w:rPr>
                       <w:rFonts w:ascii="Times New Roman" w:hAnsi="Times New Roman"/>
+                    </w:rPr>
+                  </w:pPr>
+                  <w:r>
+                    <w:rPr>
+                      <w:rFonts w:ascii="Times New Roman" w:hAnsi="Times New Roman"/>
+                    </w:rPr>
+                    <w:t>This study applies power flow analysis to distribution systems, which involve lower-voltage networks connected to various loads. The research introduces an efficient power flow method utilizing current injection and Kirchhoff's laws. This method outperforms traditional approaches like Newton-Raphson and Fast Decoupled Method in terms of convergence. It can handle unbalanced (three-phase) and balanced (single-phase) network representations. The primary objective is to evaluate the Forward-Backward Sweep method's efficiency in solving load flow challenges in meshed distribution networks.</w:t>
+                  </w:r>
+                </w:p>
+                <w:p>
+                  <w:pPr>
+                    <w:pStyle w:val="ListParagraph"/>
+                    <w:ind w:left="360"/>
+                    <w:rPr>
+                      <w:rFonts w:ascii="Times New Roman" w:hAnsi="Times New Roman"/>
+                    </w:rPr>
+                  </w:pPr>
+                </w:p>
+                <w:p>
+                  <w:pPr>
+                    <w:pStyle w:val="ListParagraph"/>
+                    <w:ind w:left="360"/>
+                    <w:rPr>
+                      <w:rFonts w:ascii="Times New Roman" w:hAnsi="Times New Roman"/>
                       <w:bCs/>
                     </w:rPr>
                   </w:pPr>
-                  <w:r>
-                    <w:rPr>
-                      <w:rFonts w:ascii="Times New Roman" w:hAnsi="Times New Roman"/>
-                    </w:rPr>
-                    <w:t>This study applies power flow analysis to distribution systems, which involve lower-voltage networks connected to various loads. The research introduces an efficient power flow method utilizing current injection and Kirchhoff's laws. This method outperforms traditional approaches like Newton-Raphson and Fast Decoupled Method in terms of convergence. It can handle unbalanced (three-phase) and balanced (single-phase) network representations. The primary objective is to evaluate the Forward-Backward Sweep method's efficiency in solving load flow challenges in meshed distribution networks.</w:t>
-                  </w:r>
                 </w:p>
               </w:tc>
             </w:tr>
@@ -5200,6 +5068,7 @@
                       <w:sz w:val="24"/>
                       <w:szCs w:val="22"/>
                     </w:rPr>
+                    <w:lastRenderedPageBreak/>
                     <w:t>Awards &amp; Academic Achievements</w:t>
                   </w:r>
                 </w:p>
@@ -5251,21 +5120,7 @@
                     <w:rPr>
                       <w:rFonts w:ascii="Times New Roman" w:hAnsi="Times New Roman"/>
                     </w:rPr>
-                    <w:t xml:space="preserve"> Runner-up at IIT </w:t>
-                  </w:r>
-                  <w:proofErr w:type="spellStart"/>
-                  <w:r>
-                    <w:rPr>
-                      <w:rFonts w:ascii="Times New Roman" w:hAnsi="Times New Roman"/>
-                    </w:rPr>
-                    <w:t>Roorkee</w:t>
-                  </w:r>
-                  <w:proofErr w:type="spellEnd"/>
-                  <w:r>
-                    <w:rPr>
-                      <w:rFonts w:ascii="Times New Roman" w:hAnsi="Times New Roman"/>
-                    </w:rPr>
-                    <w:t xml:space="preserve">. </w:t>
+                    <w:t xml:space="preserve"> Runner-up at IIT Roorkee. </w:t>
                   </w:r>
                 </w:p>
                 <w:p>
@@ -5406,89 +5261,61 @@
                     <w:rPr>
                       <w:rFonts w:ascii="Times New Roman" w:hAnsi="Times New Roman"/>
                     </w:rPr>
-                    <w:t xml:space="preserve">at the IIT, </w:t>
+                    <w:t xml:space="preserve">at the IIT, Roorkee, in collaboration with the </w:t>
+                  </w:r>
+                  <w:r>
+                    <w:rPr>
+                      <w:rFonts w:ascii="Times New Roman" w:hAnsi="Times New Roman"/>
+                    </w:rPr>
+                    <w:t xml:space="preserve">Centre </w:t>
+                  </w:r>
+                  <w:proofErr w:type="gramStart"/>
+                  <w:r>
+                    <w:rPr>
+                      <w:rFonts w:ascii="Times New Roman" w:hAnsi="Times New Roman"/>
+                    </w:rPr>
+                    <w:t>od</w:t>
+                  </w:r>
+                  <w:proofErr w:type="gramEnd"/>
+                  <w:r>
+                    <w:rPr>
+                      <w:rFonts w:ascii="Times New Roman" w:hAnsi="Times New Roman"/>
+                    </w:rPr>
+                    <w:t xml:space="preserve"> Sustainable Energy (CFDE)</w:t>
+                  </w:r>
+                  <w:r>
+                    <w:rPr>
+                      <w:rFonts w:ascii="Times New Roman" w:hAnsi="Times New Roman"/>
+                    </w:rPr>
+                    <w:t xml:space="preserve">, </w:t>
                   </w:r>
                   <w:proofErr w:type="spellStart"/>
                   <w:r>
                     <w:rPr>
                       <w:rFonts w:ascii="Times New Roman" w:hAnsi="Times New Roman"/>
                     </w:rPr>
-                    <w:t>Roorkee</w:t>
+                    <w:t>iHUB</w:t>
                   </w:r>
                   <w:proofErr w:type="spellEnd"/>
                   <w:r>
                     <w:rPr>
                       <w:rFonts w:ascii="Times New Roman" w:hAnsi="Times New Roman"/>
                     </w:rPr>
-                    <w:t xml:space="preserve">, in collaboration with the </w:t>
-                  </w:r>
-                  <w:r>
-                    <w:rPr>
-                      <w:rFonts w:ascii="Times New Roman" w:hAnsi="Times New Roman"/>
-                    </w:rPr>
-                    <w:t xml:space="preserve">Centre </w:t>
-                  </w:r>
-                  <w:proofErr w:type="gramStart"/>
-                  <w:r>
-                    <w:rPr>
-                      <w:rFonts w:ascii="Times New Roman" w:hAnsi="Times New Roman"/>
-                    </w:rPr>
-                    <w:t>od</w:t>
-                  </w:r>
-                  <w:proofErr w:type="gramEnd"/>
-                  <w:r>
-                    <w:rPr>
-                      <w:rFonts w:ascii="Times New Roman" w:hAnsi="Times New Roman"/>
-                    </w:rPr>
-                    <w:t xml:space="preserve"> Sustainable Energy (CFDE)</w:t>
-                  </w:r>
-                  <w:r>
-                    <w:rPr>
-                      <w:rFonts w:ascii="Times New Roman" w:hAnsi="Times New Roman"/>
-                    </w:rPr>
-                    <w:t xml:space="preserve">, </w:t>
+                    <w:t xml:space="preserve"> </w:t>
                   </w:r>
                   <w:proofErr w:type="spellStart"/>
                   <w:r>
                     <w:rPr>
                       <w:rFonts w:ascii="Times New Roman" w:hAnsi="Times New Roman"/>
                     </w:rPr>
-                    <w:t>iHUB</w:t>
+                    <w:t>DivyaSampark</w:t>
                   </w:r>
                   <w:proofErr w:type="spellEnd"/>
                   <w:r>
                     <w:rPr>
                       <w:rFonts w:ascii="Times New Roman" w:hAnsi="Times New Roman"/>
                     </w:rPr>
-                    <w:t xml:space="preserve"> </w:t>
-                  </w:r>
-                  <w:proofErr w:type="spellStart"/>
-                  <w:r>
-                    <w:rPr>
-                      <w:rFonts w:ascii="Times New Roman" w:hAnsi="Times New Roman"/>
-                    </w:rPr>
-                    <w:t>DivyaSampark</w:t>
-                  </w:r>
-                  <w:proofErr w:type="spellEnd"/>
-                  <w:r>
-                    <w:rPr>
-                      <w:rFonts w:ascii="Times New Roman" w:hAnsi="Times New Roman"/>
-                    </w:rPr>
-                    <w:t xml:space="preserve">, IIT </w:t>
-                  </w:r>
-                  <w:proofErr w:type="spellStart"/>
-                  <w:r>
-                    <w:rPr>
-                      <w:rFonts w:ascii="Times New Roman" w:hAnsi="Times New Roman"/>
-                    </w:rPr>
-                    <w:t>Roorkee</w:t>
-                  </w:r>
-                  <w:proofErr w:type="spellEnd"/>
-                  <w:r>
-                    <w:rPr>
-                      <w:rFonts w:ascii="Times New Roman" w:hAnsi="Times New Roman"/>
-                    </w:rPr>
-                    <w:t>, and THDC India Limited Official</w:t>
+                    <w:t>, IIT Roorkee, and THDC India Limited Official</w:t>
                   </w:r>
                   <w:r>
                     <w:rPr>
@@ -5513,7 +5340,6 @@
                     <w:rPr>
                       <w:rFonts w:ascii="Times New Roman" w:hAnsi="Times New Roman"/>
                     </w:rPr>
-                    <w:lastRenderedPageBreak/>
                     <w:t>International Travel Support (ITS)</w:t>
                   </w:r>
                   <w:r>
@@ -5795,7 +5621,6 @@
                       <w:sz w:val="24"/>
                       <w:szCs w:val="24"/>
                     </w:rPr>
-                    <w:lastRenderedPageBreak/>
                     <w:t>Pos</w:t>
                   </w:r>
                   <w:r>
@@ -5938,117 +5763,6 @@
         </w:rPr>
       </w:pPr>
     </w:p>
-    <w:p>
-      <w:pPr>
-        <w:widowControl w:val="0"/>
-        <w:autoSpaceDE w:val="0"/>
-        <w:autoSpaceDN w:val="0"/>
-        <w:adjustRightInd w:val="0"/>
-        <w:spacing w:line="240" w:lineRule="auto"/>
-        <w:jc w:val="center"/>
-        <w:rPr>
-          <w:rFonts w:ascii="Times New Roman" w:hAnsi="Times New Roman"/>
-          <w:sz w:val="24"/>
-          <w:szCs w:val="24"/>
-        </w:rPr>
-      </w:pPr>
-      <w:r>
-        <w:rPr>
-          <w:rFonts w:ascii="Times New Roman" w:hAnsi="Times New Roman"/>
-          <w:noProof/>
-          <w:sz w:val="24"/>
-          <w:szCs w:val="24"/>
-          <w:lang w:val="en-IN" w:eastAsia="en-IN" w:bidi="ar-SA"/>
-        </w:rPr>
-        <w:drawing>
-          <wp:inline distT="0" distB="0" distL="0" distR="0">
-            <wp:extent cx="1758743" cy="1972573"/>
-            <wp:effectExtent l="0" t="0" r="0" b="0"/>
-            <wp:docPr id="1" name="Picture 1" descr="C:\Users\Admin\Downloads\qrcode_200px.png"/>
-            <wp:cNvGraphicFramePr>
-              <a:graphicFrameLocks xmlns:a="http://schemas.openxmlformats.org/drawingml/2006/main" noChangeAspect="1"/>
-            </wp:cNvGraphicFramePr>
-            <a:graphic xmlns:a="http://schemas.openxmlformats.org/drawingml/2006/main">
-              <a:graphicData uri="http://schemas.openxmlformats.org/drawingml/2006/picture">
-                <pic:pic xmlns:pic="http://schemas.openxmlformats.org/drawingml/2006/picture">
-                  <pic:nvPicPr>
-                    <pic:cNvPr id="0" name="Picture 2" descr="C:\Users\Admin\Downloads\qrcode_200px.png"/>
-                    <pic:cNvPicPr>
-                      <a:picLocks noChangeAspect="1" noChangeArrowheads="1"/>
-                    </pic:cNvPicPr>
-                  </pic:nvPicPr>
-                  <pic:blipFill>
-                    <a:blip r:embed="rId13" cstate="print">
-                      <a:extLst>
-                        <a:ext uri="{28A0092B-C50C-407E-A947-70E740481C1C}">
-                          <a14:useLocalDpi xmlns:a14="http://schemas.microsoft.com/office/drawing/2010/main" val="0"/>
-                        </a:ext>
-                      </a:extLst>
-                    </a:blip>
-                    <a:srcRect/>
-                    <a:stretch>
-                      <a:fillRect/>
-                    </a:stretch>
-                  </pic:blipFill>
-                  <pic:spPr bwMode="auto">
-                    <a:xfrm>
-                      <a:off x="0" y="0"/>
-                      <a:ext cx="1765246" cy="1979867"/>
-                    </a:xfrm>
-                    <a:prstGeom prst="rect">
-                      <a:avLst/>
-                    </a:prstGeom>
-                    <a:noFill/>
-                    <a:ln>
-                      <a:noFill/>
-                    </a:ln>
-                  </pic:spPr>
-                </pic:pic>
-              </a:graphicData>
-            </a:graphic>
-          </wp:inline>
-        </w:drawing>
-      </w:r>
-    </w:p>
-    <w:p>
-      <w:pPr>
-        <w:widowControl w:val="0"/>
-        <w:autoSpaceDE w:val="0"/>
-        <w:autoSpaceDN w:val="0"/>
-        <w:adjustRightInd w:val="0"/>
-        <w:spacing w:line="240" w:lineRule="auto"/>
-        <w:jc w:val="center"/>
-        <w:rPr>
-          <w:rFonts w:ascii="Times New Roman" w:hAnsi="Times New Roman"/>
-          <w:sz w:val="24"/>
-          <w:szCs w:val="24"/>
-        </w:rPr>
-      </w:pPr>
-      <w:r>
-        <w:rPr>
-          <w:rFonts w:ascii="Times New Roman" w:hAnsi="Times New Roman"/>
-          <w:sz w:val="24"/>
-          <w:szCs w:val="24"/>
-        </w:rPr>
-        <w:t>SCAN TO CONNE</w:t>
-      </w:r>
-      <w:r>
-        <w:rPr>
-          <w:rFonts w:ascii="Times New Roman" w:hAnsi="Times New Roman"/>
-          <w:sz w:val="24"/>
-          <w:szCs w:val="24"/>
-        </w:rPr>
-        <w:t>C</w:t>
-      </w:r>
-      <w:r>
-        <w:rPr>
-          <w:rFonts w:ascii="Times New Roman" w:hAnsi="Times New Roman"/>
-          <w:sz w:val="24"/>
-          <w:szCs w:val="24"/>
-        </w:rPr>
-        <w:t>T WITH ME</w:t>
-      </w:r>
-    </w:p>
     <w:sectPr>
       <w:pgSz w:w="11906" w:h="16838"/>
       <w:pgMar w:top="720" w:right="720" w:bottom="720" w:left="720" w:header="708" w:footer="708" w:gutter="0"/>
@@ -6060,8 +5774,8 @@
 </file>
 
 <file path=word/numbering.xml><?xml version="1.0" encoding="utf-8"?>
-<w:numbering xmlns:wpc="http://schemas.microsoft.com/office/word/2010/wordprocessingCanvas" xmlns:mc="http://schemas.openxmlformats.org/markup-compatibility/2006" xmlns:o="urn:schemas-microsoft-com:office:office" xmlns:r="http://schemas.openxmlformats.org/officeDocument/2006/relationships" xmlns:m="http://schemas.openxmlformats.org/officeDocument/2006/math" xmlns:v="urn:schemas-microsoft-com:vml" xmlns:wp14="http://schemas.microsoft.com/office/word/2010/wordprocessingDrawing" xmlns:wp="http://schemas.openxmlformats.org/drawingml/2006/wordprocessingDrawing" xmlns:w10="urn:schemas-microsoft-com:office:word" xmlns:w="http://schemas.openxmlformats.org/wordprocessingml/2006/main" xmlns:w14="http://schemas.microsoft.com/office/word/2010/wordml" xmlns:w15="http://schemas.microsoft.com/office/word/2012/wordml" xmlns:wpg="http://schemas.microsoft.com/office/word/2010/wordprocessingGroup" xmlns:wpi="http://schemas.microsoft.com/office/word/2010/wordprocessingInk" xmlns:wne="http://schemas.microsoft.com/office/word/2006/wordml" xmlns:wps="http://schemas.microsoft.com/office/word/2010/wordprocessingShape" mc:Ignorable="w14 w15 wp14">
-  <w:abstractNum w:abstractNumId="0" w15:restartNumberingAfterBreak="0">
+<w:numbering xmlns:wpc="http://schemas.microsoft.com/office/word/2010/wordprocessingCanvas" xmlns:mc="http://schemas.openxmlformats.org/markup-compatibility/2006" xmlns:o="urn:schemas-microsoft-com:office:office" xmlns:r="http://schemas.openxmlformats.org/officeDocument/2006/relationships" xmlns:m="http://schemas.openxmlformats.org/officeDocument/2006/math" xmlns:v="urn:schemas-microsoft-com:vml" xmlns:wp14="http://schemas.microsoft.com/office/word/2010/wordprocessingDrawing" xmlns:wp="http://schemas.openxmlformats.org/drawingml/2006/wordprocessingDrawing" xmlns:w10="urn:schemas-microsoft-com:office:word" xmlns:w="http://schemas.openxmlformats.org/wordprocessingml/2006/main" xmlns:w14="http://schemas.microsoft.com/office/word/2010/wordml" xmlns:wpg="http://schemas.microsoft.com/office/word/2010/wordprocessingGroup" xmlns:wpi="http://schemas.microsoft.com/office/word/2010/wordprocessingInk" xmlns:wne="http://schemas.microsoft.com/office/word/2006/wordml" xmlns:wps="http://schemas.microsoft.com/office/word/2010/wordprocessingShape" mc:Ignorable="w14 wp14">
+  <w:abstractNum w:abstractNumId="0">
     <w:nsid w:val="00AF76F1"/>
     <w:multiLevelType w:val="hybridMultilevel"/>
     <w:tmpl w:val="EFC88B82"/>
@@ -6176,7 +5890,7 @@
       </w:rPr>
     </w:lvl>
   </w:abstractNum>
-  <w:abstractNum w:abstractNumId="1" w15:restartNumberingAfterBreak="0">
+  <w:abstractNum w:abstractNumId="1">
     <w:nsid w:val="023D1AD2"/>
     <w:multiLevelType w:val="hybridMultilevel"/>
     <w:tmpl w:val="9A067F86"/>
@@ -6291,7 +6005,7 @@
       </w:rPr>
     </w:lvl>
   </w:abstractNum>
-  <w:abstractNum w:abstractNumId="2" w15:restartNumberingAfterBreak="0">
+  <w:abstractNum w:abstractNumId="2">
     <w:nsid w:val="0FDB7865"/>
     <w:multiLevelType w:val="hybridMultilevel"/>
     <w:tmpl w:val="BAB898A8"/>
@@ -6404,7 +6118,7 @@
       </w:rPr>
     </w:lvl>
   </w:abstractNum>
-  <w:abstractNum w:abstractNumId="3" w15:restartNumberingAfterBreak="0">
+  <w:abstractNum w:abstractNumId="3">
     <w:nsid w:val="103A3270"/>
     <w:multiLevelType w:val="hybridMultilevel"/>
     <w:tmpl w:val="5A5CD172"/>
@@ -6518,7 +6232,7 @@
       </w:rPr>
     </w:lvl>
   </w:abstractNum>
-  <w:abstractNum w:abstractNumId="4" w15:restartNumberingAfterBreak="0">
+  <w:abstractNum w:abstractNumId="4">
     <w:nsid w:val="12841123"/>
     <w:multiLevelType w:val="hybridMultilevel"/>
     <w:tmpl w:val="9BDA9592"/>
@@ -6631,7 +6345,7 @@
       </w:rPr>
     </w:lvl>
   </w:abstractNum>
-  <w:abstractNum w:abstractNumId="5" w15:restartNumberingAfterBreak="0">
+  <w:abstractNum w:abstractNumId="5">
     <w:nsid w:val="16C65F3E"/>
     <w:multiLevelType w:val="hybridMultilevel"/>
     <w:tmpl w:val="457AECD2"/>
@@ -6744,7 +6458,7 @@
       </w:rPr>
     </w:lvl>
   </w:abstractNum>
-  <w:abstractNum w:abstractNumId="6" w15:restartNumberingAfterBreak="0">
+  <w:abstractNum w:abstractNumId="6">
     <w:nsid w:val="18A47B4F"/>
     <w:multiLevelType w:val="hybridMultilevel"/>
     <w:tmpl w:val="BD88A546"/>
@@ -6857,7 +6571,7 @@
       </w:rPr>
     </w:lvl>
   </w:abstractNum>
-  <w:abstractNum w:abstractNumId="7" w15:restartNumberingAfterBreak="0">
+  <w:abstractNum w:abstractNumId="7">
     <w:nsid w:val="28DC2C2A"/>
     <w:multiLevelType w:val="hybridMultilevel"/>
     <w:tmpl w:val="0136EF52"/>
@@ -6970,7 +6684,7 @@
       </w:rPr>
     </w:lvl>
   </w:abstractNum>
-  <w:abstractNum w:abstractNumId="8" w15:restartNumberingAfterBreak="0">
+  <w:abstractNum w:abstractNumId="8">
     <w:nsid w:val="2A332391"/>
     <w:multiLevelType w:val="hybridMultilevel"/>
     <w:tmpl w:val="223E2D3E"/>
@@ -7084,7 +6798,7 @@
       </w:rPr>
     </w:lvl>
   </w:abstractNum>
-  <w:abstractNum w:abstractNumId="9" w15:restartNumberingAfterBreak="0">
+  <w:abstractNum w:abstractNumId="9">
     <w:nsid w:val="2BD83301"/>
     <w:multiLevelType w:val="hybridMultilevel"/>
     <w:tmpl w:val="210E8260"/>
@@ -7197,7 +6911,7 @@
       </w:rPr>
     </w:lvl>
   </w:abstractNum>
-  <w:abstractNum w:abstractNumId="10" w15:restartNumberingAfterBreak="0">
+  <w:abstractNum w:abstractNumId="10">
     <w:nsid w:val="2F242235"/>
     <w:multiLevelType w:val="hybridMultilevel"/>
     <w:tmpl w:val="98963C34"/>
@@ -7283,7 +6997,7 @@
       </w:pPr>
     </w:lvl>
   </w:abstractNum>
-  <w:abstractNum w:abstractNumId="11" w15:restartNumberingAfterBreak="0">
+  <w:abstractNum w:abstractNumId="11">
     <w:nsid w:val="31F83CB2"/>
     <w:multiLevelType w:val="hybridMultilevel"/>
     <w:tmpl w:val="607256BA"/>
@@ -7396,7 +7110,7 @@
       </w:rPr>
     </w:lvl>
   </w:abstractNum>
-  <w:abstractNum w:abstractNumId="12" w15:restartNumberingAfterBreak="0">
+  <w:abstractNum w:abstractNumId="12">
     <w:nsid w:val="3C48520F"/>
     <w:multiLevelType w:val="hybridMultilevel"/>
     <w:tmpl w:val="980234CC"/>
@@ -7509,7 +7223,7 @@
       </w:rPr>
     </w:lvl>
   </w:abstractNum>
-  <w:abstractNum w:abstractNumId="13" w15:restartNumberingAfterBreak="0">
+  <w:abstractNum w:abstractNumId="13">
     <w:nsid w:val="3ECC49C3"/>
     <w:multiLevelType w:val="hybridMultilevel"/>
     <w:tmpl w:val="CC4E781A"/>
@@ -7624,7 +7338,7 @@
       </w:rPr>
     </w:lvl>
   </w:abstractNum>
-  <w:abstractNum w:abstractNumId="14" w15:restartNumberingAfterBreak="0">
+  <w:abstractNum w:abstractNumId="14">
     <w:nsid w:val="4918648F"/>
     <w:multiLevelType w:val="hybridMultilevel"/>
     <w:tmpl w:val="D94CF038"/>
@@ -7737,7 +7451,7 @@
       </w:rPr>
     </w:lvl>
   </w:abstractNum>
-  <w:abstractNum w:abstractNumId="15" w15:restartNumberingAfterBreak="0">
+  <w:abstractNum w:abstractNumId="15">
     <w:nsid w:val="4A084B7C"/>
     <w:multiLevelType w:val="hybridMultilevel"/>
     <w:tmpl w:val="3CCEF5B0"/>
@@ -7850,7 +7564,7 @@
       </w:rPr>
     </w:lvl>
   </w:abstractNum>
-  <w:abstractNum w:abstractNumId="16" w15:restartNumberingAfterBreak="0">
+  <w:abstractNum w:abstractNumId="16">
     <w:nsid w:val="4E50096F"/>
     <w:multiLevelType w:val="hybridMultilevel"/>
     <w:tmpl w:val="A7EA27EA"/>
@@ -7963,7 +7677,7 @@
       </w:rPr>
     </w:lvl>
   </w:abstractNum>
-  <w:abstractNum w:abstractNumId="17" w15:restartNumberingAfterBreak="0">
+  <w:abstractNum w:abstractNumId="17">
     <w:nsid w:val="51C959AD"/>
     <w:multiLevelType w:val="hybridMultilevel"/>
     <w:tmpl w:val="F9A85A0C"/>
@@ -8078,7 +7792,7 @@
       </w:rPr>
     </w:lvl>
   </w:abstractNum>
-  <w:abstractNum w:abstractNumId="18" w15:restartNumberingAfterBreak="0">
+  <w:abstractNum w:abstractNumId="18">
     <w:nsid w:val="54B738CF"/>
     <w:multiLevelType w:val="hybridMultilevel"/>
     <w:tmpl w:val="21C6FAEE"/>
@@ -8191,7 +7905,7 @@
       </w:rPr>
     </w:lvl>
   </w:abstractNum>
-  <w:abstractNum w:abstractNumId="19" w15:restartNumberingAfterBreak="0">
+  <w:abstractNum w:abstractNumId="19">
     <w:nsid w:val="55F00E68"/>
     <w:multiLevelType w:val="hybridMultilevel"/>
     <w:tmpl w:val="D3E240A4"/>
@@ -8306,7 +8020,7 @@
       </w:rPr>
     </w:lvl>
   </w:abstractNum>
-  <w:abstractNum w:abstractNumId="20" w15:restartNumberingAfterBreak="0">
+  <w:abstractNum w:abstractNumId="20">
     <w:nsid w:val="5A356F33"/>
     <w:multiLevelType w:val="hybridMultilevel"/>
     <w:tmpl w:val="6EE6FD74"/>
@@ -8419,7 +8133,7 @@
       </w:rPr>
     </w:lvl>
   </w:abstractNum>
-  <w:abstractNum w:abstractNumId="21" w15:restartNumberingAfterBreak="0">
+  <w:abstractNum w:abstractNumId="21">
     <w:nsid w:val="5B6927DB"/>
     <w:multiLevelType w:val="hybridMultilevel"/>
     <w:tmpl w:val="4F282240"/>
@@ -8532,7 +8246,7 @@
       </w:rPr>
     </w:lvl>
   </w:abstractNum>
-  <w:abstractNum w:abstractNumId="22" w15:restartNumberingAfterBreak="0">
+  <w:abstractNum w:abstractNumId="22">
     <w:nsid w:val="5BA34A3A"/>
     <w:multiLevelType w:val="hybridMultilevel"/>
     <w:tmpl w:val="A712FACA"/>
@@ -8645,7 +8359,7 @@
       </w:rPr>
     </w:lvl>
   </w:abstractNum>
-  <w:abstractNum w:abstractNumId="23" w15:restartNumberingAfterBreak="0">
+  <w:abstractNum w:abstractNumId="23">
     <w:nsid w:val="5C4B7158"/>
     <w:multiLevelType w:val="hybridMultilevel"/>
     <w:tmpl w:val="71E02FCA"/>
@@ -8734,7 +8448,7 @@
       </w:pPr>
     </w:lvl>
   </w:abstractNum>
-  <w:abstractNum w:abstractNumId="24" w15:restartNumberingAfterBreak="0">
+  <w:abstractNum w:abstractNumId="24">
     <w:nsid w:val="5D863797"/>
     <w:multiLevelType w:val="hybridMultilevel"/>
     <w:tmpl w:val="936AECF2"/>
@@ -8847,7 +8561,7 @@
       </w:rPr>
     </w:lvl>
   </w:abstractNum>
-  <w:abstractNum w:abstractNumId="25" w15:restartNumberingAfterBreak="0">
+  <w:abstractNum w:abstractNumId="25">
     <w:nsid w:val="60CE0CD0"/>
     <w:multiLevelType w:val="hybridMultilevel"/>
     <w:tmpl w:val="7A0A3798"/>
@@ -8960,7 +8674,7 @@
       </w:rPr>
     </w:lvl>
   </w:abstractNum>
-  <w:abstractNum w:abstractNumId="26" w15:restartNumberingAfterBreak="0">
+  <w:abstractNum w:abstractNumId="26">
     <w:nsid w:val="6169323D"/>
     <w:multiLevelType w:val="hybridMultilevel"/>
     <w:tmpl w:val="0004E908"/>
@@ -9073,7 +8787,7 @@
       </w:rPr>
     </w:lvl>
   </w:abstractNum>
-  <w:abstractNum w:abstractNumId="27" w15:restartNumberingAfterBreak="0">
+  <w:abstractNum w:abstractNumId="27">
     <w:nsid w:val="61E971AC"/>
     <w:multiLevelType w:val="hybridMultilevel"/>
     <w:tmpl w:val="0F7A3308"/>
@@ -9188,7 +8902,7 @@
       </w:rPr>
     </w:lvl>
   </w:abstractNum>
-  <w:abstractNum w:abstractNumId="28" w15:restartNumberingAfterBreak="0">
+  <w:abstractNum w:abstractNumId="28">
     <w:nsid w:val="6AA3327E"/>
     <w:multiLevelType w:val="hybridMultilevel"/>
     <w:tmpl w:val="9718DBBE"/>
@@ -9303,7 +9017,7 @@
       </w:rPr>
     </w:lvl>
   </w:abstractNum>
-  <w:abstractNum w:abstractNumId="29" w15:restartNumberingAfterBreak="0">
+  <w:abstractNum w:abstractNumId="29">
     <w:nsid w:val="6C4A1492"/>
     <w:multiLevelType w:val="hybridMultilevel"/>
     <w:tmpl w:val="87DC9DF4"/>
@@ -9416,7 +9130,7 @@
       </w:rPr>
     </w:lvl>
   </w:abstractNum>
-  <w:abstractNum w:abstractNumId="30" w15:restartNumberingAfterBreak="0">
+  <w:abstractNum w:abstractNumId="30">
     <w:nsid w:val="70873A8B"/>
     <w:multiLevelType w:val="hybridMultilevel"/>
     <w:tmpl w:val="3E4E9048"/>
@@ -9529,7 +9243,7 @@
       </w:rPr>
     </w:lvl>
   </w:abstractNum>
-  <w:abstractNum w:abstractNumId="31" w15:restartNumberingAfterBreak="0">
+  <w:abstractNum w:abstractNumId="31">
     <w:nsid w:val="759770CD"/>
     <w:multiLevelType w:val="hybridMultilevel"/>
     <w:tmpl w:val="0220C314"/>
@@ -9642,7 +9356,7 @@
       </w:rPr>
     </w:lvl>
   </w:abstractNum>
-  <w:abstractNum w:abstractNumId="32" w15:restartNumberingAfterBreak="0">
+  <w:abstractNum w:abstractNumId="32">
     <w:nsid w:val="7D3D50B5"/>
     <w:multiLevelType w:val="hybridMultilevel"/>
     <w:tmpl w:val="CA64DDBC"/>
@@ -9860,7 +9574,7 @@
 </file>
 
 <file path=word/styles.xml><?xml version="1.0" encoding="utf-8"?>
-<w:styles xmlns:mc="http://schemas.openxmlformats.org/markup-compatibility/2006" xmlns:r="http://schemas.openxmlformats.org/officeDocument/2006/relationships" xmlns:w="http://schemas.openxmlformats.org/wordprocessingml/2006/main" xmlns:w14="http://schemas.microsoft.com/office/word/2010/wordml" xmlns:w15="http://schemas.microsoft.com/office/word/2012/wordml" mc:Ignorable="w14 w15">
+<w:styles xmlns:mc="http://schemas.openxmlformats.org/markup-compatibility/2006" xmlns:r="http://schemas.openxmlformats.org/officeDocument/2006/relationships" xmlns:w="http://schemas.openxmlformats.org/wordprocessingml/2006/main" xmlns:w14="http://schemas.microsoft.com/office/word/2010/wordml" mc:Ignorable="w14">
   <w:docDefaults>
     <w:rPrDefault>
       <w:rPr>
@@ -9870,378 +9584,144 @@
     </w:rPrDefault>
     <w:pPrDefault/>
   </w:docDefaults>
-  <w:latentStyles w:defLockedState="0" w:defUIPriority="99" w:defSemiHidden="0" w:defUnhideWhenUsed="0" w:defQFormat="0" w:count="371">
-    <w:lsdException w:name="Normal" w:uiPriority="0" w:qFormat="1"/>
-    <w:lsdException w:name="heading 1" w:uiPriority="9" w:qFormat="1"/>
-    <w:lsdException w:name="heading 2" w:semiHidden="1" w:uiPriority="9" w:unhideWhenUsed="1" w:qFormat="1"/>
-    <w:lsdException w:name="heading 3" w:semiHidden="1" w:uiPriority="9" w:unhideWhenUsed="1" w:qFormat="1"/>
-    <w:lsdException w:name="heading 4" w:semiHidden="1" w:uiPriority="9" w:unhideWhenUsed="1" w:qFormat="1"/>
-    <w:lsdException w:name="heading 5" w:semiHidden="1" w:uiPriority="9" w:unhideWhenUsed="1" w:qFormat="1"/>
-    <w:lsdException w:name="heading 6" w:semiHidden="1" w:uiPriority="9" w:unhideWhenUsed="1" w:qFormat="1"/>
-    <w:lsdException w:name="heading 7" w:semiHidden="1" w:uiPriority="9" w:unhideWhenUsed="1" w:qFormat="1"/>
-    <w:lsdException w:name="heading 8" w:semiHidden="1" w:uiPriority="9" w:unhideWhenUsed="1" w:qFormat="1"/>
-    <w:lsdException w:name="heading 9" w:semiHidden="1" w:uiPriority="9" w:unhideWhenUsed="1" w:qFormat="1"/>
-    <w:lsdException w:name="index 1" w:semiHidden="1" w:unhideWhenUsed="1"/>
-    <w:lsdException w:name="index 2" w:semiHidden="1" w:unhideWhenUsed="1"/>
-    <w:lsdException w:name="index 3" w:semiHidden="1" w:unhideWhenUsed="1"/>
-    <w:lsdException w:name="index 4" w:semiHidden="1" w:unhideWhenUsed="1"/>
-    <w:lsdException w:name="index 5" w:semiHidden="1" w:unhideWhenUsed="1"/>
-    <w:lsdException w:name="index 6" w:semiHidden="1" w:unhideWhenUsed="1"/>
-    <w:lsdException w:name="index 7" w:semiHidden="1" w:unhideWhenUsed="1"/>
-    <w:lsdException w:name="index 8" w:semiHidden="1" w:unhideWhenUsed="1"/>
-    <w:lsdException w:name="index 9" w:semiHidden="1" w:unhideWhenUsed="1"/>
-    <w:lsdException w:name="toc 1" w:semiHidden="1" w:uiPriority="39" w:unhideWhenUsed="1"/>
-    <w:lsdException w:name="toc 2" w:semiHidden="1" w:uiPriority="39" w:unhideWhenUsed="1"/>
-    <w:lsdException w:name="toc 3" w:semiHidden="1" w:uiPriority="39" w:unhideWhenUsed="1"/>
-    <w:lsdException w:name="toc 4" w:semiHidden="1" w:uiPriority="39" w:unhideWhenUsed="1"/>
-    <w:lsdException w:name="toc 5" w:semiHidden="1" w:uiPriority="39" w:unhideWhenUsed="1"/>
-    <w:lsdException w:name="toc 6" w:semiHidden="1" w:uiPriority="39" w:unhideWhenUsed="1"/>
-    <w:lsdException w:name="toc 7" w:semiHidden="1" w:uiPriority="39" w:unhideWhenUsed="1"/>
-    <w:lsdException w:name="toc 8" w:semiHidden="1" w:uiPriority="39" w:unhideWhenUsed="1"/>
-    <w:lsdException w:name="toc 9" w:semiHidden="1" w:uiPriority="39" w:unhideWhenUsed="1"/>
-    <w:lsdException w:name="Normal Indent" w:semiHidden="1" w:unhideWhenUsed="1"/>
-    <w:lsdException w:name="footnote text" w:semiHidden="1" w:unhideWhenUsed="1"/>
-    <w:lsdException w:name="annotation text" w:semiHidden="1" w:unhideWhenUsed="1"/>
-    <w:lsdException w:name="header" w:semiHidden="1" w:unhideWhenUsed="1"/>
-    <w:lsdException w:name="footer" w:semiHidden="1" w:unhideWhenUsed="1"/>
-    <w:lsdException w:name="index heading" w:semiHidden="1" w:unhideWhenUsed="1"/>
-    <w:lsdException w:name="caption" w:semiHidden="1" w:uiPriority="35" w:unhideWhenUsed="1" w:qFormat="1"/>
-    <w:lsdException w:name="table of figures" w:semiHidden="1" w:unhideWhenUsed="1"/>
-    <w:lsdException w:name="envelope address" w:semiHidden="1" w:unhideWhenUsed="1"/>
-    <w:lsdException w:name="envelope return" w:semiHidden="1" w:unhideWhenUsed="1"/>
-    <w:lsdException w:name="footnote reference" w:semiHidden="1" w:unhideWhenUsed="1"/>
-    <w:lsdException w:name="annotation reference" w:semiHidden="1" w:unhideWhenUsed="1"/>
-    <w:lsdException w:name="line number" w:semiHidden="1" w:unhideWhenUsed="1"/>
-    <w:lsdException w:name="page number" w:semiHidden="1" w:unhideWhenUsed="1"/>
-    <w:lsdException w:name="endnote reference" w:semiHidden="1" w:unhideWhenUsed="1"/>
-    <w:lsdException w:name="endnote text" w:semiHidden="1" w:unhideWhenUsed="1"/>
-    <w:lsdException w:name="table of authorities" w:semiHidden="1" w:unhideWhenUsed="1"/>
-    <w:lsdException w:name="macro" w:semiHidden="1" w:unhideWhenUsed="1"/>
-    <w:lsdException w:name="toa heading" w:semiHidden="1" w:unhideWhenUsed="1"/>
-    <w:lsdException w:name="List" w:semiHidden="1" w:unhideWhenUsed="1"/>
-    <w:lsdException w:name="List Bullet" w:semiHidden="1" w:unhideWhenUsed="1"/>
-    <w:lsdException w:name="List Number" w:semiHidden="1" w:unhideWhenUsed="1"/>
-    <w:lsdException w:name="List 2" w:semiHidden="1" w:unhideWhenUsed="1"/>
-    <w:lsdException w:name="List 3" w:semiHidden="1" w:unhideWhenUsed="1"/>
-    <w:lsdException w:name="List 4" w:semiHidden="1" w:unhideWhenUsed="1"/>
-    <w:lsdException w:name="List 5" w:semiHidden="1" w:unhideWhenUsed="1"/>
-    <w:lsdException w:name="List Bullet 2" w:semiHidden="1" w:unhideWhenUsed="1"/>
-    <w:lsdException w:name="List Bullet 3" w:semiHidden="1" w:unhideWhenUsed="1"/>
-    <w:lsdException w:name="List Bullet 4" w:semiHidden="1" w:unhideWhenUsed="1"/>
-    <w:lsdException w:name="List Bullet 5" w:semiHidden="1" w:unhideWhenUsed="1"/>
-    <w:lsdException w:name="List Number 2" w:semiHidden="1" w:unhideWhenUsed="1"/>
-    <w:lsdException w:name="List Number 3" w:semiHidden="1" w:unhideWhenUsed="1"/>
-    <w:lsdException w:name="List Number 4" w:semiHidden="1" w:unhideWhenUsed="1"/>
-    <w:lsdException w:name="List Number 5" w:semiHidden="1" w:unhideWhenUsed="1"/>
-    <w:lsdException w:name="Title" w:uiPriority="10" w:qFormat="1"/>
-    <w:lsdException w:name="Closing" w:semiHidden="1" w:unhideWhenUsed="1"/>
-    <w:lsdException w:name="Signature" w:semiHidden="1" w:unhideWhenUsed="1"/>
-    <w:lsdException w:name="Default Paragraph Font" w:semiHidden="1" w:uiPriority="1" w:unhideWhenUsed="1"/>
-    <w:lsdException w:name="Body Text" w:semiHidden="1" w:unhideWhenUsed="1"/>
-    <w:lsdException w:name="Body Text Indent" w:semiHidden="1" w:unhideWhenUsed="1"/>
-    <w:lsdException w:name="List Continue" w:semiHidden="1" w:unhideWhenUsed="1"/>
-    <w:lsdException w:name="List Continue 2" w:semiHidden="1" w:unhideWhenUsed="1"/>
-    <w:lsdException w:name="List Continue 3" w:semiHidden="1" w:unhideWhenUsed="1"/>
-    <w:lsdException w:name="List Continue 4" w:semiHidden="1" w:unhideWhenUsed="1"/>
-    <w:lsdException w:name="List Continue 5" w:semiHidden="1" w:unhideWhenUsed="1"/>
-    <w:lsdException w:name="Message Header" w:semiHidden="1" w:unhideWhenUsed="1"/>
-    <w:lsdException w:name="Subtitle" w:uiPriority="11" w:qFormat="1"/>
-    <w:lsdException w:name="Salutation" w:semiHidden="1" w:unhideWhenUsed="1"/>
-    <w:lsdException w:name="Date" w:semiHidden="1" w:unhideWhenUsed="1"/>
-    <w:lsdException w:name="Body Text First Indent" w:semiHidden="1" w:unhideWhenUsed="1"/>
-    <w:lsdException w:name="Body Text First Indent 2" w:semiHidden="1" w:unhideWhenUsed="1"/>
-    <w:lsdException w:name="Note Heading" w:semiHidden="1" w:unhideWhenUsed="1"/>
-    <w:lsdException w:name="Body Text 2" w:semiHidden="1" w:unhideWhenUsed="1"/>
-    <w:lsdException w:name="Body Text 3" w:semiHidden="1" w:unhideWhenUsed="1"/>
-    <w:lsdException w:name="Body Text Indent 2" w:semiHidden="1" w:unhideWhenUsed="1"/>
-    <w:lsdException w:name="Body Text Indent 3" w:semiHidden="1" w:unhideWhenUsed="1"/>
-    <w:lsdException w:name="Block Text" w:semiHidden="1" w:unhideWhenUsed="1"/>
-    <w:lsdException w:name="Hyperlink" w:semiHidden="1" w:unhideWhenUsed="1"/>
-    <w:lsdException w:name="FollowedHyperlink" w:semiHidden="1" w:unhideWhenUsed="1"/>
-    <w:lsdException w:name="Strong" w:uiPriority="22" w:qFormat="1"/>
-    <w:lsdException w:name="Emphasis" w:uiPriority="20" w:qFormat="1"/>
-    <w:lsdException w:name="Document Map" w:semiHidden="1" w:unhideWhenUsed="1"/>
-    <w:lsdException w:name="Plain Text" w:semiHidden="1" w:unhideWhenUsed="1"/>
-    <w:lsdException w:name="E-mail Signature" w:semiHidden="1" w:unhideWhenUsed="1"/>
-    <w:lsdException w:name="HTML Top of Form" w:semiHidden="1" w:unhideWhenUsed="1"/>
-    <w:lsdException w:name="HTML Bottom of Form" w:semiHidden="1" w:unhideWhenUsed="1"/>
-    <w:lsdException w:name="Normal (Web)" w:semiHidden="1" w:unhideWhenUsed="1"/>
-    <w:lsdException w:name="HTML Acronym" w:semiHidden="1" w:unhideWhenUsed="1"/>
-    <w:lsdException w:name="HTML Address" w:semiHidden="1" w:unhideWhenUsed="1"/>
-    <w:lsdException w:name="HTML Cite" w:semiHidden="1" w:unhideWhenUsed="1"/>
-    <w:lsdException w:name="HTML Code" w:semiHidden="1" w:unhideWhenUsed="1"/>
-    <w:lsdException w:name="HTML Definition" w:semiHidden="1" w:unhideWhenUsed="1"/>
-    <w:lsdException w:name="HTML Keyboard" w:semiHidden="1" w:unhideWhenUsed="1"/>
-    <w:lsdException w:name="HTML Preformatted" w:semiHidden="1" w:unhideWhenUsed="1"/>
-    <w:lsdException w:name="HTML Sample" w:semiHidden="1" w:unhideWhenUsed="1"/>
-    <w:lsdException w:name="HTML Typewriter" w:semiHidden="1" w:unhideWhenUsed="1"/>
-    <w:lsdException w:name="HTML Variable" w:semiHidden="1" w:unhideWhenUsed="1"/>
-    <w:lsdException w:name="Normal Table" w:semiHidden="1" w:unhideWhenUsed="1"/>
-    <w:lsdException w:name="annotation subject" w:semiHidden="1" w:unhideWhenUsed="1"/>
-    <w:lsdException w:name="No List" w:semiHidden="1" w:unhideWhenUsed="1"/>
-    <w:lsdException w:name="Outline List 1" w:semiHidden="1" w:unhideWhenUsed="1"/>
-    <w:lsdException w:name="Outline List 2" w:semiHidden="1" w:unhideWhenUsed="1"/>
-    <w:lsdException w:name="Outline List 3" w:semiHidden="1" w:unhideWhenUsed="1"/>
-    <w:lsdException w:name="Table Simple 1" w:semiHidden="1" w:unhideWhenUsed="1"/>
-    <w:lsdException w:name="Table Simple 2" w:semiHidden="1" w:unhideWhenUsed="1"/>
-    <w:lsdException w:name="Table Simple 3" w:semiHidden="1" w:unhideWhenUsed="1"/>
-    <w:lsdException w:name="Table Classic 1" w:semiHidden="1" w:unhideWhenUsed="1"/>
-    <w:lsdException w:name="Table Classic 2" w:semiHidden="1" w:unhideWhenUsed="1"/>
-    <w:lsdException w:name="Table Classic 3" w:semiHidden="1" w:unhideWhenUsed="1"/>
-    <w:lsdException w:name="Table Classic 4" w:semiHidden="1" w:unhideWhenUsed="1"/>
-    <w:lsdException w:name="Table Colorful 1" w:semiHidden="1" w:unhideWhenUsed="1"/>
-    <w:lsdException w:name="Table Colorful 2" w:semiHidden="1" w:unhideWhenUsed="1"/>
-    <w:lsdException w:name="Table Colorful 3" w:semiHidden="1" w:unhideWhenUsed="1"/>
-    <w:lsdException w:name="Table Columns 1" w:semiHidden="1" w:unhideWhenUsed="1"/>
-    <w:lsdException w:name="Table Columns 2" w:semiHidden="1" w:unhideWhenUsed="1"/>
-    <w:lsdException w:name="Table Columns 3" w:semiHidden="1" w:unhideWhenUsed="1"/>
-    <w:lsdException w:name="Table Columns 4" w:semiHidden="1" w:unhideWhenUsed="1"/>
-    <w:lsdException w:name="Table Columns 5" w:semiHidden="1" w:unhideWhenUsed="1"/>
-    <w:lsdException w:name="Table Grid 1" w:semiHidden="1" w:unhideWhenUsed="1"/>
-    <w:lsdException w:name="Table Grid 2" w:semiHidden="1" w:unhideWhenUsed="1"/>
-    <w:lsdException w:name="Table Grid 3" w:semiHidden="1" w:unhideWhenUsed="1"/>
-    <w:lsdException w:name="Table Grid 4" w:semiHidden="1" w:unhideWhenUsed="1"/>
-    <w:lsdException w:name="Table Grid 5" w:semiHidden="1" w:unhideWhenUsed="1"/>
-    <w:lsdException w:name="Table Grid 6" w:semiHidden="1" w:unhideWhenUsed="1"/>
-    <w:lsdException w:name="Table Grid 7" w:semiHidden="1" w:unhideWhenUsed="1"/>
-    <w:lsdException w:name="Table Grid 8" w:semiHidden="1" w:unhideWhenUsed="1"/>
-    <w:lsdException w:name="Table List 1" w:semiHidden="1" w:unhideWhenUsed="1"/>
-    <w:lsdException w:name="Table List 2" w:semiHidden="1" w:unhideWhenUsed="1"/>
-    <w:lsdException w:name="Table List 3" w:semiHidden="1" w:unhideWhenUsed="1"/>
-    <w:lsdException w:name="Table List 4" w:semiHidden="1" w:unhideWhenUsed="1"/>
-    <w:lsdException w:name="Table List 5" w:semiHidden="1" w:unhideWhenUsed="1"/>
-    <w:lsdException w:name="Table List 6" w:semiHidden="1" w:unhideWhenUsed="1"/>
-    <w:lsdException w:name="Table List 7" w:semiHidden="1" w:unhideWhenUsed="1"/>
-    <w:lsdException w:name="Table List 8" w:semiHidden="1" w:unhideWhenUsed="1"/>
-    <w:lsdException w:name="Table 3D effects 1" w:semiHidden="1" w:unhideWhenUsed="1"/>
-    <w:lsdException w:name="Table 3D effects 2" w:semiHidden="1" w:unhideWhenUsed="1"/>
-    <w:lsdException w:name="Table 3D effects 3" w:semiHidden="1" w:unhideWhenUsed="1"/>
-    <w:lsdException w:name="Table Contemporary" w:semiHidden="1" w:unhideWhenUsed="1"/>
-    <w:lsdException w:name="Table Elegant" w:semiHidden="1" w:unhideWhenUsed="1"/>
-    <w:lsdException w:name="Table Professional" w:semiHidden="1" w:unhideWhenUsed="1"/>
-    <w:lsdException w:name="Table Subtle 1" w:semiHidden="1" w:unhideWhenUsed="1"/>
-    <w:lsdException w:name="Table Subtle 2" w:semiHidden="1" w:unhideWhenUsed="1"/>
-    <w:lsdException w:name="Table Web 1" w:semiHidden="1" w:unhideWhenUsed="1"/>
-    <w:lsdException w:name="Table Web 2" w:semiHidden="1" w:unhideWhenUsed="1"/>
-    <w:lsdException w:name="Table Web 3" w:semiHidden="1" w:unhideWhenUsed="1"/>
-    <w:lsdException w:name="Balloon Text" w:semiHidden="1" w:unhideWhenUsed="1"/>
-    <w:lsdException w:name="Table Grid" w:uiPriority="59"/>
-    <w:lsdException w:name="Table Theme" w:semiHidden="1" w:unhideWhenUsed="1"/>
-    <w:lsdException w:name="Placeholder Text" w:semiHidden="1"/>
-    <w:lsdException w:name="No Spacing" w:uiPriority="1" w:qFormat="1"/>
-    <w:lsdException w:name="Light Shading" w:uiPriority="60"/>
-    <w:lsdException w:name="Light List" w:uiPriority="61"/>
-    <w:lsdException w:name="Light Grid" w:uiPriority="62"/>
-    <w:lsdException w:name="Medium Shading 1" w:uiPriority="63"/>
-    <w:lsdException w:name="Medium Shading 2" w:uiPriority="64"/>
-    <w:lsdException w:name="Medium List 1" w:uiPriority="65"/>
-    <w:lsdException w:name="Medium List 2" w:uiPriority="66"/>
-    <w:lsdException w:name="Medium Grid 1" w:uiPriority="67"/>
-    <w:lsdException w:name="Medium Grid 2" w:uiPriority="68"/>
-    <w:lsdException w:name="Medium Grid 3" w:uiPriority="69"/>
-    <w:lsdException w:name="Dark List" w:uiPriority="70"/>
-    <w:lsdException w:name="Colorful Shading" w:uiPriority="71"/>
-    <w:lsdException w:name="Colorful List" w:uiPriority="72"/>
-    <w:lsdException w:name="Colorful Grid" w:uiPriority="73"/>
-    <w:lsdException w:name="Light Shading Accent 1" w:uiPriority="60"/>
-    <w:lsdException w:name="Light List Accent 1" w:uiPriority="61"/>
-    <w:lsdException w:name="Light Grid Accent 1" w:uiPriority="62"/>
-    <w:lsdException w:name="Medium Shading 1 Accent 1" w:uiPriority="63"/>
-    <w:lsdException w:name="Medium Shading 2 Accent 1" w:uiPriority="64"/>
-    <w:lsdException w:name="Medium List 1 Accent 1" w:uiPriority="65"/>
-    <w:lsdException w:name="Revision" w:semiHidden="1"/>
-    <w:lsdException w:name="List Paragraph" w:uiPriority="1" w:qFormat="1"/>
-    <w:lsdException w:name="Quote" w:uiPriority="29" w:qFormat="1"/>
-    <w:lsdException w:name="Intense Quote" w:uiPriority="30" w:qFormat="1"/>
-    <w:lsdException w:name="Medium List 2 Accent 1" w:uiPriority="66"/>
-    <w:lsdException w:name="Medium Grid 1 Accent 1" w:uiPriority="67"/>
-    <w:lsdException w:name="Medium Grid 2 Accent 1" w:uiPriority="68"/>
-    <w:lsdException w:name="Medium Grid 3 Accent 1" w:uiPriority="69"/>
-    <w:lsdException w:name="Dark List Accent 1" w:uiPriority="70"/>
-    <w:lsdException w:name="Colorful Shading Accent 1" w:uiPriority="71"/>
-    <w:lsdException w:name="Colorful List Accent 1" w:uiPriority="72"/>
-    <w:lsdException w:name="Colorful Grid Accent 1" w:uiPriority="73"/>
-    <w:lsdException w:name="Light Shading Accent 2" w:uiPriority="60"/>
-    <w:lsdException w:name="Light List Accent 2" w:uiPriority="61"/>
-    <w:lsdException w:name="Light Grid Accent 2" w:uiPriority="62"/>
-    <w:lsdException w:name="Medium Shading 1 Accent 2" w:uiPriority="63"/>
-    <w:lsdException w:name="Medium Shading 2 Accent 2" w:uiPriority="64"/>
-    <w:lsdException w:name="Medium List 1 Accent 2" w:uiPriority="65"/>
-    <w:lsdException w:name="Medium List 2 Accent 2" w:uiPriority="66"/>
-    <w:lsdException w:name="Medium Grid 1 Accent 2" w:uiPriority="67"/>
-    <w:lsdException w:name="Medium Grid 2 Accent 2" w:uiPriority="68"/>
-    <w:lsdException w:name="Medium Grid 3 Accent 2" w:uiPriority="69"/>
-    <w:lsdException w:name="Dark List Accent 2" w:uiPriority="70"/>
-    <w:lsdException w:name="Colorful Shading Accent 2" w:uiPriority="71"/>
-    <w:lsdException w:name="Colorful List Accent 2" w:uiPriority="72"/>
-    <w:lsdException w:name="Colorful Grid Accent 2" w:uiPriority="73"/>
-    <w:lsdException w:name="Light Shading Accent 3" w:uiPriority="60"/>
-    <w:lsdException w:name="Light List Accent 3" w:uiPriority="61"/>
-    <w:lsdException w:name="Light Grid Accent 3" w:uiPriority="62"/>
-    <w:lsdException w:name="Medium Shading 1 Accent 3" w:uiPriority="63"/>
-    <w:lsdException w:name="Medium Shading 2 Accent 3" w:uiPriority="64"/>
-    <w:lsdException w:name="Medium List 1 Accent 3" w:uiPriority="65"/>
-    <w:lsdException w:name="Medium List 2 Accent 3" w:uiPriority="66"/>
-    <w:lsdException w:name="Medium Grid 1 Accent 3" w:uiPriority="67"/>
-    <w:lsdException w:name="Medium Grid 2 Accent 3" w:uiPriority="68"/>
-    <w:lsdException w:name="Medium Grid 3 Accent 3" w:uiPriority="69"/>
-    <w:lsdException w:name="Dark List Accent 3" w:uiPriority="70"/>
-    <w:lsdException w:name="Colorful Shading Accent 3" w:uiPriority="71"/>
-    <w:lsdException w:name="Colorful List Accent 3" w:uiPriority="72"/>
-    <w:lsdException w:name="Colorful Grid Accent 3" w:uiPriority="73"/>
-    <w:lsdException w:name="Light Shading Accent 4" w:uiPriority="60"/>
-    <w:lsdException w:name="Light List Accent 4" w:uiPriority="61"/>
-    <w:lsdException w:name="Light Grid Accent 4" w:uiPriority="62"/>
-    <w:lsdException w:name="Medium Shading 1 Accent 4" w:uiPriority="63"/>
-    <w:lsdException w:name="Medium Shading 2 Accent 4" w:uiPriority="64"/>
-    <w:lsdException w:name="Medium List 1 Accent 4" w:uiPriority="65"/>
-    <w:lsdException w:name="Medium List 2 Accent 4" w:uiPriority="66"/>
-    <w:lsdException w:name="Medium Grid 1 Accent 4" w:uiPriority="67"/>
-    <w:lsdException w:name="Medium Grid 2 Accent 4" w:uiPriority="68"/>
-    <w:lsdException w:name="Medium Grid 3 Accent 4" w:uiPriority="69"/>
-    <w:lsdException w:name="Dark List Accent 4" w:uiPriority="70"/>
-    <w:lsdException w:name="Colorful Shading Accent 4" w:uiPriority="71"/>
-    <w:lsdException w:name="Colorful List Accent 4" w:uiPriority="72"/>
-    <w:lsdException w:name="Colorful Grid Accent 4" w:uiPriority="73"/>
-    <w:lsdException w:name="Light Shading Accent 5" w:uiPriority="60"/>
-    <w:lsdException w:name="Light List Accent 5" w:uiPriority="61"/>
-    <w:lsdException w:name="Light Grid Accent 5" w:uiPriority="62"/>
-    <w:lsdException w:name="Medium Shading 1 Accent 5" w:uiPriority="63"/>
-    <w:lsdException w:name="Medium Shading 2 Accent 5" w:uiPriority="64"/>
-    <w:lsdException w:name="Medium List 1 Accent 5" w:uiPriority="65"/>
-    <w:lsdException w:name="Medium List 2 Accent 5" w:uiPriority="66"/>
-    <w:lsdException w:name="Medium Grid 1 Accent 5" w:uiPriority="67"/>
-    <w:lsdException w:name="Medium Grid 2 Accent 5" w:uiPriority="68"/>
-    <w:lsdException w:name="Medium Grid 3 Accent 5" w:uiPriority="69"/>
-    <w:lsdException w:name="Dark List Accent 5" w:uiPriority="70"/>
-    <w:lsdException w:name="Colorful Shading Accent 5" w:uiPriority="71"/>
-    <w:lsdException w:name="Colorful List Accent 5" w:uiPriority="72"/>
-    <w:lsdException w:name="Colorful Grid Accent 5" w:uiPriority="73"/>
-    <w:lsdException w:name="Light Shading Accent 6" w:uiPriority="60"/>
-    <w:lsdException w:name="Light List Accent 6" w:uiPriority="61"/>
-    <w:lsdException w:name="Light Grid Accent 6" w:uiPriority="62"/>
-    <w:lsdException w:name="Medium Shading 1 Accent 6" w:uiPriority="63"/>
-    <w:lsdException w:name="Medium Shading 2 Accent 6" w:uiPriority="64"/>
-    <w:lsdException w:name="Medium List 1 Accent 6" w:uiPriority="65"/>
-    <w:lsdException w:name="Medium List 2 Accent 6" w:uiPriority="66"/>
-    <w:lsdException w:name="Medium Grid 1 Accent 6" w:uiPriority="67"/>
-    <w:lsdException w:name="Medium Grid 2 Accent 6" w:uiPriority="68"/>
-    <w:lsdException w:name="Medium Grid 3 Accent 6" w:uiPriority="69"/>
-    <w:lsdException w:name="Dark List Accent 6" w:uiPriority="70"/>
-    <w:lsdException w:name="Colorful Shading Accent 6" w:uiPriority="71"/>
-    <w:lsdException w:name="Colorful List Accent 6" w:uiPriority="72"/>
-    <w:lsdException w:name="Colorful Grid Accent 6" w:uiPriority="73"/>
-    <w:lsdException w:name="Subtle Emphasis" w:uiPriority="19" w:qFormat="1"/>
-    <w:lsdException w:name="Intense Emphasis" w:uiPriority="21" w:qFormat="1"/>
-    <w:lsdException w:name="Subtle Reference" w:uiPriority="31" w:qFormat="1"/>
-    <w:lsdException w:name="Intense Reference" w:uiPriority="32" w:qFormat="1"/>
-    <w:lsdException w:name="Book Title" w:uiPriority="33" w:qFormat="1"/>
-    <w:lsdException w:name="Bibliography" w:semiHidden="1" w:uiPriority="37" w:unhideWhenUsed="1"/>
-    <w:lsdException w:name="TOC Heading" w:semiHidden="1" w:uiPriority="39" w:unhideWhenUsed="1" w:qFormat="1"/>
-    <w:lsdException w:name="Plain Table 1" w:uiPriority="41"/>
-    <w:lsdException w:name="Plain Table 2" w:uiPriority="42"/>
-    <w:lsdException w:name="Plain Table 3" w:uiPriority="43"/>
-    <w:lsdException w:name="Plain Table 4" w:uiPriority="44"/>
-    <w:lsdException w:name="Plain Table 5" w:uiPriority="45"/>
-    <w:lsdException w:name="Grid Table Light" w:uiPriority="40"/>
-    <w:lsdException w:name="Grid Table 1 Light" w:uiPriority="46"/>
-    <w:lsdException w:name="Grid Table 2" w:uiPriority="47"/>
-    <w:lsdException w:name="Grid Table 3" w:uiPriority="48"/>
-    <w:lsdException w:name="Grid Table 4" w:uiPriority="49"/>
-    <w:lsdException w:name="Grid Table 5 Dark" w:uiPriority="50"/>
-    <w:lsdException w:name="Grid Table 6 Colorful" w:uiPriority="51"/>
-    <w:lsdException w:name="Grid Table 7 Colorful" w:uiPriority="52"/>
-    <w:lsdException w:name="Grid Table 1 Light Accent 1" w:uiPriority="46"/>
-    <w:lsdException w:name="Grid Table 2 Accent 1" w:uiPriority="47"/>
-    <w:lsdException w:name="Grid Table 3 Accent 1" w:uiPriority="48"/>
-    <w:lsdException w:name="Grid Table 4 Accent 1" w:uiPriority="49"/>
-    <w:lsdException w:name="Grid Table 5 Dark Accent 1" w:uiPriority="50"/>
-    <w:lsdException w:name="Grid Table 6 Colorful Accent 1" w:uiPriority="51"/>
-    <w:lsdException w:name="Grid Table 7 Colorful Accent 1" w:uiPriority="52"/>
-    <w:lsdException w:name="Grid Table 1 Light Accent 2" w:uiPriority="46"/>
-    <w:lsdException w:name="Grid Table 2 Accent 2" w:uiPriority="47"/>
-    <w:lsdException w:name="Grid Table 3 Accent 2" w:uiPriority="48"/>
-    <w:lsdException w:name="Grid Table 4 Accent 2" w:uiPriority="49"/>
-    <w:lsdException w:name="Grid Table 5 Dark Accent 2" w:uiPriority="50"/>
-    <w:lsdException w:name="Grid Table 6 Colorful Accent 2" w:uiPriority="51"/>
-    <w:lsdException w:name="Grid Table 7 Colorful Accent 2" w:uiPriority="52"/>
-    <w:lsdException w:name="Grid Table 1 Light Accent 3" w:uiPriority="46"/>
-    <w:lsdException w:name="Grid Table 2 Accent 3" w:uiPriority="47"/>
-    <w:lsdException w:name="Grid Table 3 Accent 3" w:uiPriority="48"/>
-    <w:lsdException w:name="Grid Table 4 Accent 3" w:uiPriority="49"/>
-    <w:lsdException w:name="Grid Table 5 Dark Accent 3" w:uiPriority="50"/>
-    <w:lsdException w:name="Grid Table 6 Colorful Accent 3" w:uiPriority="51"/>
-    <w:lsdException w:name="Grid Table 7 Colorful Accent 3" w:uiPriority="52"/>
-    <w:lsdException w:name="Grid Table 1 Light Accent 4" w:uiPriority="46"/>
-    <w:lsdException w:name="Grid Table 2 Accent 4" w:uiPriority="47"/>
-    <w:lsdException w:name="Grid Table 3 Accent 4" w:uiPriority="48"/>
-    <w:lsdException w:name="Grid Table 4 Accent 4" w:uiPriority="49"/>
-    <w:lsdException w:name="Grid Table 5 Dark Accent 4" w:uiPriority="50"/>
-    <w:lsdException w:name="Grid Table 6 Colorful Accent 4" w:uiPriority="51"/>
-    <w:lsdException w:name="Grid Table 7 Colorful Accent 4" w:uiPriority="52"/>
-    <w:lsdException w:name="Grid Table 1 Light Accent 5" w:uiPriority="46"/>
-    <w:lsdException w:name="Grid Table 2 Accent 5" w:uiPriority="47"/>
-    <w:lsdException w:name="Grid Table 3 Accent 5" w:uiPriority="48"/>
-    <w:lsdException w:name="Grid Table 4 Accent 5" w:uiPriority="49"/>
-    <w:lsdException w:name="Grid Table 5 Dark Accent 5" w:uiPriority="50"/>
-    <w:lsdException w:name="Grid Table 6 Colorful Accent 5" w:uiPriority="51"/>
-    <w:lsdException w:name="Grid Table 7 Colorful Accent 5" w:uiPriority="52"/>
-    <w:lsdException w:name="Grid Table 1 Light Accent 6" w:uiPriority="46"/>
-    <w:lsdException w:name="Grid Table 2 Accent 6" w:uiPriority="47"/>
-    <w:lsdException w:name="Grid Table 3 Accent 6" w:uiPriority="48"/>
-    <w:lsdException w:name="Grid Table 4 Accent 6" w:uiPriority="49"/>
-    <w:lsdException w:name="Grid Table 5 Dark Accent 6" w:uiPriority="50"/>
-    <w:lsdException w:name="Grid Table 6 Colorful Accent 6" w:uiPriority="51"/>
-    <w:lsdException w:name="Grid Table 7 Colorful Accent 6" w:uiPriority="52"/>
-    <w:lsdException w:name="List Table 1 Light" w:uiPriority="46"/>
-    <w:lsdException w:name="List Table 2" w:uiPriority="47"/>
-    <w:lsdException w:name="List Table 3" w:uiPriority="48"/>
-    <w:lsdException w:name="List Table 4" w:uiPriority="49"/>
-    <w:lsdException w:name="List Table 5 Dark" w:uiPriority="50"/>
-    <w:lsdException w:name="List Table 6 Colorful" w:uiPriority="51"/>
-    <w:lsdException w:name="List Table 7 Colorful" w:uiPriority="52"/>
-    <w:lsdException w:name="List Table 1 Light Accent 1" w:uiPriority="46"/>
-    <w:lsdException w:name="List Table 2 Accent 1" w:uiPriority="47"/>
-    <w:lsdException w:name="List Table 3 Accent 1" w:uiPriority="48"/>
-    <w:lsdException w:name="List Table 4 Accent 1" w:uiPriority="49"/>
-    <w:lsdException w:name="List Table 5 Dark Accent 1" w:uiPriority="50"/>
-    <w:lsdException w:name="List Table 6 Colorful Accent 1" w:uiPriority="51"/>
-    <w:lsdException w:name="List Table 7 Colorful Accent 1" w:uiPriority="52"/>
-    <w:lsdException w:name="List Table 1 Light Accent 2" w:uiPriority="46"/>
-    <w:lsdException w:name="List Table 2 Accent 2" w:uiPriority="47"/>
-    <w:lsdException w:name="List Table 3 Accent 2" w:uiPriority="48"/>
-    <w:lsdException w:name="List Table 4 Accent 2" w:uiPriority="49"/>
-    <w:lsdException w:name="List Table 5 Dark Accent 2" w:uiPriority="50"/>
-    <w:lsdException w:name="List Table 6 Colorful Accent 2" w:uiPriority="51"/>
-    <w:lsdException w:name="List Table 7 Colorful Accent 2" w:uiPriority="52"/>
-    <w:lsdException w:name="List Table 1 Light Accent 3" w:uiPriority="46"/>
-    <w:lsdException w:name="List Table 2 Accent 3" w:uiPriority="47"/>
-    <w:lsdException w:name="List Table 3 Accent 3" w:uiPriority="48"/>
-    <w:lsdException w:name="List Table 4 Accent 3" w:uiPriority="49"/>
-    <w:lsdException w:name="List Table 5 Dark Accent 3" w:uiPriority="50"/>
-    <w:lsdException w:name="List Table 6 Colorful Accent 3" w:uiPriority="51"/>
-    <w:lsdException w:name="List Table 7 Colorful Accent 3" w:uiPriority="52"/>
-    <w:lsdException w:name="List Table 1 Light Accent 4" w:uiPriority="46"/>
-    <w:lsdException w:name="List Table 2 Accent 4" w:uiPriority="47"/>
-    <w:lsdException w:name="List Table 3 Accent 4" w:uiPriority="48"/>
-    <w:lsdException w:name="List Table 4 Accent 4" w:uiPriority="49"/>
-    <w:lsdException w:name="List Table 5 Dark Accent 4" w:uiPriority="50"/>
-    <w:lsdException w:name="List Table 6 Colorful Accent 4" w:uiPriority="51"/>
-    <w:lsdException w:name="List Table 7 Colorful Accent 4" w:uiPriority="52"/>
-    <w:lsdException w:name="List Table 1 Light Accent 5" w:uiPriority="46"/>
-    <w:lsdException w:name="List Table 2 Accent 5" w:uiPriority="47"/>
-    <w:lsdException w:name="List Table 3 Accent 5" w:uiPriority="48"/>
-    <w:lsdException w:name="List Table 4 Accent 5" w:uiPriority="49"/>
-    <w:lsdException w:name="List Table 5 Dark Accent 5" w:uiPriority="50"/>
-    <w:lsdException w:name="List Table 6 Colorful Accent 5" w:uiPriority="51"/>
-    <w:lsdException w:name="List Table 7 Colorful Accent 5" w:uiPriority="52"/>
-    <w:lsdException w:name="List Table 1 Light Accent 6" w:uiPriority="46"/>
-    <w:lsdException w:name="List Table 2 Accent 6" w:uiPriority="47"/>
-    <w:lsdException w:name="List Table 3 Accent 6" w:uiPriority="48"/>
-    <w:lsdException w:name="List Table 4 Accent 6" w:uiPriority="49"/>
-    <w:lsdException w:name="List Table 5 Dark Accent 6" w:uiPriority="50"/>
-    <w:lsdException w:name="List Table 6 Colorful Accent 6" w:uiPriority="51"/>
-    <w:lsdException w:name="List Table 7 Colorful Accent 6" w:uiPriority="52"/>
+  <w:latentStyles w:defLockedState="0" w:defUIPriority="99" w:defSemiHidden="1" w:defUnhideWhenUsed="1" w:defQFormat="0" w:count="267">
+    <w:lsdException w:name="Normal" w:semiHidden="0" w:uiPriority="0" w:unhideWhenUsed="0" w:qFormat="1"/>
+    <w:lsdException w:name="heading 1" w:semiHidden="0" w:uiPriority="9" w:unhideWhenUsed="0" w:qFormat="1"/>
+    <w:lsdException w:name="heading 2" w:uiPriority="9" w:qFormat="1"/>
+    <w:lsdException w:name="heading 3" w:uiPriority="9" w:qFormat="1"/>
+    <w:lsdException w:name="heading 4" w:uiPriority="9" w:qFormat="1"/>
+    <w:lsdException w:name="heading 5" w:uiPriority="9" w:qFormat="1"/>
+    <w:lsdException w:name="heading 6" w:uiPriority="9" w:qFormat="1"/>
+    <w:lsdException w:name="heading 7" w:uiPriority="9" w:qFormat="1"/>
+    <w:lsdException w:name="heading 8" w:uiPriority="9" w:qFormat="1"/>
+    <w:lsdException w:name="heading 9" w:uiPriority="9" w:qFormat="1"/>
+    <w:lsdException w:name="toc 1" w:uiPriority="39"/>
+    <w:lsdException w:name="toc 2" w:uiPriority="39"/>
+    <w:lsdException w:name="toc 3" w:uiPriority="39"/>
+    <w:lsdException w:name="toc 4" w:uiPriority="39"/>
+    <w:lsdException w:name="toc 5" w:uiPriority="39"/>
+    <w:lsdException w:name="toc 6" w:uiPriority="39"/>
+    <w:lsdException w:name="toc 7" w:uiPriority="39"/>
+    <w:lsdException w:name="toc 8" w:uiPriority="39"/>
+    <w:lsdException w:name="toc 9" w:uiPriority="39"/>
+    <w:lsdException w:name="caption" w:uiPriority="35" w:qFormat="1"/>
+    <w:lsdException w:name="Title" w:semiHidden="0" w:uiPriority="10" w:unhideWhenUsed="0" w:qFormat="1"/>
+    <w:lsdException w:name="Default Paragraph Font" w:uiPriority="1"/>
+    <w:lsdException w:name="Subtitle" w:semiHidden="0" w:uiPriority="11" w:unhideWhenUsed="0" w:qFormat="1"/>
+    <w:lsdException w:name="Strong" w:semiHidden="0" w:uiPriority="22" w:unhideWhenUsed="0" w:qFormat="1"/>
+    <w:lsdException w:name="Emphasis" w:semiHidden="0" w:uiPriority="20" w:unhideWhenUsed="0" w:qFormat="1"/>
+    <w:lsdException w:name="Table Grid" w:semiHidden="0" w:uiPriority="59" w:unhideWhenUsed="0"/>
+    <w:lsdException w:name="Placeholder Text" w:unhideWhenUsed="0"/>
+    <w:lsdException w:name="No Spacing" w:semiHidden="0" w:uiPriority="1" w:unhideWhenUsed="0" w:qFormat="1"/>
+    <w:lsdException w:name="Light Shading" w:semiHidden="0" w:uiPriority="60" w:unhideWhenUsed="0"/>
+    <w:lsdException w:name="Light List" w:semiHidden="0" w:uiPriority="61" w:unhideWhenUsed="0"/>
+    <w:lsdException w:name="Light Grid" w:semiHidden="0" w:uiPriority="62" w:unhideWhenUsed="0"/>
+    <w:lsdException w:name="Medium Shading 1" w:semiHidden="0" w:uiPriority="63" w:unhideWhenUsed="0"/>
+    <w:lsdException w:name="Medium Shading 2" w:semiHidden="0" w:uiPriority="64" w:unhideWhenUsed="0"/>
+    <w:lsdException w:name="Medium List 1" w:semiHidden="0" w:uiPriority="65" w:unhideWhenUsed="0"/>
+    <w:lsdException w:name="Medium List 2" w:semiHidden="0" w:uiPriority="66" w:unhideWhenUsed="0"/>
+    <w:lsdException w:name="Medium Grid 1" w:semiHidden="0" w:uiPriority="67" w:unhideWhenUsed="0"/>
+    <w:lsdException w:name="Medium Grid 2" w:semiHidden="0" w:uiPriority="68" w:unhideWhenUsed="0"/>
+    <w:lsdException w:name="Medium Grid 3" w:semiHidden="0" w:uiPriority="69" w:unhideWhenUsed="0"/>
+    <w:lsdException w:name="Dark List" w:semiHidden="0" w:uiPriority="70" w:unhideWhenUsed="0"/>
+    <w:lsdException w:name="Colorful Shading" w:semiHidden="0" w:uiPriority="71" w:unhideWhenUsed="0"/>
+    <w:lsdException w:name="Colorful List" w:semiHidden="0" w:uiPriority="72" w:unhideWhenUsed="0"/>
+    <w:lsdException w:name="Colorful Grid" w:semiHidden="0" w:uiPriority="73" w:unhideWhenUsed="0"/>
+    <w:lsdException w:name="Light Shading Accent 1" w:semiHidden="0" w:uiPriority="60" w:unhideWhenUsed="0"/>
+    <w:lsdException w:name="Light List Accent 1" w:semiHidden="0" w:uiPriority="61" w:unhideWhenUsed="0"/>
+    <w:lsdException w:name="Light Grid Accent 1" w:semiHidden="0" w:uiPriority="62" w:unhideWhenUsed="0"/>
+    <w:lsdException w:name="Medium Shading 1 Accent 1" w:semiHidden="0" w:uiPriority="63" w:unhideWhenUsed="0"/>
+    <w:lsdException w:name="Medium Shading 2 Accent 1" w:semiHidden="0" w:uiPriority="64" w:unhideWhenUsed="0"/>
+    <w:lsdException w:name="Medium List 1 Accent 1" w:semiHidden="0" w:uiPriority="65" w:unhideWhenUsed="0"/>
+    <w:lsdException w:name="Revision" w:unhideWhenUsed="0"/>
+    <w:lsdException w:name="List Paragraph" w:semiHidden="0" w:uiPriority="1" w:unhideWhenUsed="0" w:qFormat="1"/>
+    <w:lsdException w:name="Quote" w:semiHidden="0" w:uiPriority="29" w:unhideWhenUsed="0" w:qFormat="1"/>
+    <w:lsdException w:name="Intense Quote" w:semiHidden="0" w:uiPriority="30" w:unhideWhenUsed="0" w:qFormat="1"/>
+    <w:lsdException w:name="Medium List 2 Accent 1" w:semiHidden="0" w:uiPriority="66" w:unhideWhenUsed="0"/>
+    <w:lsdException w:name="Medium Grid 1 Accent 1" w:semiHidden="0" w:uiPriority="67" w:unhideWhenUsed="0"/>
+    <w:lsdException w:name="Medium Grid 2 Accent 1" w:semiHidden="0" w:uiPriority="68" w:unhideWhenUsed="0"/>
+    <w:lsdException w:name="Medium Grid 3 Accent 1" w:semiHidden="0" w:uiPriority="69" w:unhideWhenUsed="0"/>
+    <w:lsdException w:name="Dark List Accent 1" w:semiHidden="0" w:uiPriority="70" w:unhideWhenUsed="0"/>
+    <w:lsdException w:name="Colorful Shading Accent 1" w:semiHidden="0" w:uiPriority="71" w:unhideWhenUsed="0"/>
+    <w:lsdException w:name="Colorful List Accent 1" w:semiHidden="0" w:uiPriority="72" w:unhideWhenUsed="0"/>
+    <w:lsdException w:name="Colorful Grid Accent 1" w:semiHidden="0" w:uiPriority="73" w:unhideWhenUsed="0"/>
+    <w:lsdException w:name="Light Shading Accent 2" w:semiHidden="0" w:uiPriority="60" w:unhideWhenUsed="0"/>
+    <w:lsdException w:name="Light List Accent 2" w:semiHidden="0" w:uiPriority="61" w:unhideWhenUsed="0"/>
+    <w:lsdException w:name="Light Grid Accent 2" w:semiHidden="0" w:uiPriority="62" w:unhideWhenUsed="0"/>
+    <w:lsdException w:name="Medium Shading 1 Accent 2" w:semiHidden="0" w:uiPriority="63" w:unhideWhenUsed="0"/>
+    <w:lsdException w:name="Medium Shading 2 Accent 2" w:semiHidden="0" w:uiPriority="64" w:unhideWhenUsed="0"/>
+    <w:lsdException w:name="Medium List 1 Accent 2" w:semiHidden="0" w:uiPriority="65" w:unhideWhenUsed="0"/>
+    <w:lsdException w:name="Medium List 2 Accent 2" w:semiHidden="0" w:uiPriority="66" w:unhideWhenUsed="0"/>
+    <w:lsdException w:name="Medium Grid 1 Accent 2" w:semiHidden="0" w:uiPriority="67" w:unhideWhenUsed="0"/>
+    <w:lsdException w:name="Medium Grid 2 Accent 2" w:semiHidden="0" w:uiPriority="68" w:unhideWhenUsed="0"/>
+    <w:lsdException w:name="Medium Grid 3 Accent 2" w:semiHidden="0" w:uiPriority="69" w:unhideWhenUsed="0"/>
+    <w:lsdException w:name="Dark List Accent 2" w:semiHidden="0" w:uiPriority="70" w:unhideWhenUsed="0"/>
+    <w:lsdException w:name="Colorful Shading Accent 2" w:semiHidden="0" w:uiPriority="71" w:unhideWhenUsed="0"/>
+    <w:lsdException w:name="Colorful List Accent 2" w:semiHidden="0" w:uiPriority="72" w:unhideWhenUsed="0"/>
+    <w:lsdException w:name="Colorful Grid Accent 2" w:semiHidden="0" w:uiPriority="73" w:unhideWhenUsed="0"/>
+    <w:lsdException w:name="Light Shading Accent 3" w:semiHidden="0" w:uiPriority="60" w:unhideWhenUsed="0"/>
+    <w:lsdException w:name="Light List Accent 3" w:semiHidden="0" w:uiPriority="61" w:unhideWhenUsed="0"/>
+    <w:lsdException w:name="Light Grid Accent 3" w:semiHidden="0" w:uiPriority="62" w:unhideWhenUsed="0"/>
+    <w:lsdException w:name="Medium Shading 1 Accent 3" w:semiHidden="0" w:uiPriority="63" w:unhideWhenUsed="0"/>
+    <w:lsdException w:name="Medium Shading 2 Accent 3" w:semiHidden="0" w:uiPriority="64" w:unhideWhenUsed="0"/>
+    <w:lsdException w:name="Medium List 1 Accent 3" w:semiHidden="0" w:uiPriority="65" w:unhideWhenUsed="0"/>
+    <w:lsdException w:name="Medium List 2 Accent 3" w:semiHidden="0" w:uiPriority="66" w:unhideWhenUsed="0"/>
+    <w:lsdException w:name="Medium Grid 1 Accent 3" w:semiHidden="0" w:uiPriority="67" w:unhideWhenUsed="0"/>
+    <w:lsdException w:name="Medium Grid 2 Accent 3" w:semiHidden="0" w:uiPriority="68" w:unhideWhenUsed="0"/>
+    <w:lsdException w:name="Medium Grid 3 Accent 3" w:semiHidden="0" w:uiPriority="69" w:unhideWhenUsed="0"/>
+    <w:lsdException w:name="Dark List Accent 3" w:semiHidden="0" w:uiPriority="70" w:unhideWhenUsed="0"/>
+    <w:lsdException w:name="Colorful Shading Accent 3" w:semiHidden="0" w:uiPriority="71" w:unhideWhenUsed="0"/>
+    <w:lsdException w:name="Colorful List Accent 3" w:semiHidden="0" w:uiPriority="72" w:unhideWhenUsed="0"/>
+    <w:lsdException w:name="Colorful Grid Accent 3" w:semiHidden="0" w:uiPriority="73" w:unhideWhenUsed="0"/>
+    <w:lsdException w:name="Light Shading Accent 4" w:semiHidden="0" w:uiPriority="60" w:unhideWhenUsed="0"/>
+    <w:lsdException w:name="Light List Accent 4" w:semiHidden="0" w:uiPriority="61" w:unhideWhenUsed="0"/>
+    <w:lsdException w:name="Light Grid Accent 4" w:semiHidden="0" w:uiPriority="62" w:unhideWhenUsed="0"/>
+    <w:lsdException w:name="Medium Shading 1 Accent 4" w:semiHidden="0" w:uiPriority="63" w:unhideWhenUsed="0"/>
+    <w:lsdException w:name="Medium Shading 2 Accent 4" w:semiHidden="0" w:uiPriority="64" w:unhideWhenUsed="0"/>
+    <w:lsdException w:name="Medium List 1 Accent 4" w:semiHidden="0" w:uiPriority="65" w:unhideWhenUsed="0"/>
+    <w:lsdException w:name="Medium List 2 Accent 4" w:semiHidden="0" w:uiPriority="66" w:unhideWhenUsed="0"/>
+    <w:lsdException w:name="Medium Grid 1 Accent 4" w:semiHidden="0" w:uiPriority="67" w:unhideWhenUsed="0"/>
+    <w:lsdException w:name="Medium Grid 2 Accent 4" w:semiHidden="0" w:uiPriority="68" w:unhideWhenUsed="0"/>
+    <w:lsdException w:name="Medium Grid 3 Accent 4" w:semiHidden="0" w:uiPriority="69" w:unhideWhenUsed="0"/>
+    <w:lsdException w:name="Dark List Accent 4" w:semiHidden="0" w:uiPriority="70" w:unhideWhenUsed="0"/>
+    <w:lsdException w:name="Colorful Shading Accent 4" w:semiHidden="0" w:uiPriority="71" w:unhideWhenUsed="0"/>
+    <w:lsdException w:name="Colorful List Accent 4" w:semiHidden="0" w:uiPriority="72" w:unhideWhenUsed="0"/>
+    <w:lsdException w:name="Colorful Grid Accent 4" w:semiHidden="0" w:uiPriority="73" w:unhideWhenUsed="0"/>
+    <w:lsdException w:name="Light Shading Accent 5" w:semiHidden="0" w:uiPriority="60" w:unhideWhenUsed="0"/>
+    <w:lsdException w:name="Light List Accent 5" w:semiHidden="0" w:uiPriority="61" w:unhideWhenUsed="0"/>
+    <w:lsdException w:name="Light Grid Accent 5" w:semiHidden="0" w:uiPriority="62" w:unhideWhenUsed="0"/>
+    <w:lsdException w:name="Medium Shading 1 Accent 5" w:semiHidden="0" w:uiPriority="63" w:unhideWhenUsed="0"/>
+    <w:lsdException w:name="Medium Shading 2 Accent 5" w:semiHidden="0" w:uiPriority="64" w:unhideWhenUsed="0"/>
+    <w:lsdException w:name="Medium List 1 Accent 5" w:semiHidden="0" w:uiPriority="65" w:unhideWhenUsed="0"/>
+    <w:lsdException w:name="Medium List 2 Accent 5" w:semiHidden="0" w:uiPriority="66" w:unhideWhenUsed="0"/>
+    <w:lsdException w:name="Medium Grid 1 Accent 5" w:semiHidden="0" w:uiPriority="67" w:unhideWhenUsed="0"/>
+    <w:lsdException w:name="Medium Grid 2 Accent 5" w:semiHidden="0" w:uiPriority="68" w:unhideWhenUsed="0"/>
+    <w:lsdException w:name="Medium Grid 3 Accent 5" w:semiHidden="0" w:uiPriority="69" w:unhideWhenUsed="0"/>
+    <w:lsdException w:name="Dark List Accent 5" w:semiHidden="0" w:uiPriority="70" w:unhideWhenUsed="0"/>
+    <w:lsdException w:name="Colorful Shading Accent 5" w:semiHidden="0" w:uiPriority="71" w:unhideWhenUsed="0"/>
+    <w:lsdException w:name="Colorful List Accent 5" w:semiHidden="0" w:uiPriority="72" w:unhideWhenUsed="0"/>
+    <w:lsdException w:name="Colorful Grid Accent 5" w:semiHidden="0" w:uiPriority="73" w:unhideWhenUsed="0"/>
+    <w:lsdException w:name="Light Shading Accent 6" w:semiHidden="0" w:uiPriority="60" w:unhideWhenUsed="0"/>
+    <w:lsdException w:name="Light List Accent 6" w:semiHidden="0" w:uiPriority="61" w:unhideWhenUsed="0"/>
+    <w:lsdException w:name="Light Grid Accent 6" w:semiHidden="0" w:uiPriority="62" w:unhideWhenUsed="0"/>
+    <w:lsdException w:name="Medium Shading 1 Accent 6" w:semiHidden="0" w:uiPriority="63" w:unhideWhenUsed="0"/>
+    <w:lsdException w:name="Medium Shading 2 Accent 6" w:semiHidden="0" w:uiPriority="64" w:unhideWhenUsed="0"/>
+    <w:lsdException w:name="Medium List 1 Accent 6" w:semiHidden="0" w:uiPriority="65" w:unhideWhenUsed="0"/>
+    <w:lsdException w:name="Medium List 2 Accent 6" w:semiHidden="0" w:uiPriority="66" w:unhideWhenUsed="0"/>
+    <w:lsdException w:name="Medium Grid 1 Accent 6" w:semiHidden="0" w:uiPriority="67" w:unhideWhenUsed="0"/>
+    <w:lsdException w:name="Medium Grid 2 Accent 6" w:semiHidden="0" w:uiPriority="68" w:unhideWhenUsed="0"/>
+    <w:lsdException w:name="Medium Grid 3 Accent 6" w:semiHidden="0" w:uiPriority="69" w:unhideWhenUsed="0"/>
+    <w:lsdException w:name="Dark List Accent 6" w:semiHidden="0" w:uiPriority="70" w:unhideWhenUsed="0"/>
+    <w:lsdException w:name="Colorful Shading Accent 6" w:semiHidden="0" w:uiPriority="71" w:unhideWhenUsed="0"/>
+    <w:lsdException w:name="Colorful List Accent 6" w:semiHidden="0" w:uiPriority="72" w:unhideWhenUsed="0"/>
+    <w:lsdException w:name="Colorful Grid Accent 6" w:semiHidden="0" w:uiPriority="73" w:unhideWhenUsed="0"/>
+    <w:lsdException w:name="Subtle Emphasis" w:semiHidden="0" w:uiPriority="19" w:unhideWhenUsed="0" w:qFormat="1"/>
+    <w:lsdException w:name="Intense Emphasis" w:semiHidden="0" w:uiPriority="21" w:unhideWhenUsed="0" w:qFormat="1"/>
+    <w:lsdException w:name="Subtle Reference" w:semiHidden="0" w:uiPriority="31" w:unhideWhenUsed="0" w:qFormat="1"/>
+    <w:lsdException w:name="Intense Reference" w:semiHidden="0" w:uiPriority="32" w:unhideWhenUsed="0" w:qFormat="1"/>
+    <w:lsdException w:name="Book Title" w:semiHidden="0" w:uiPriority="33" w:unhideWhenUsed="0" w:qFormat="1"/>
+    <w:lsdException w:name="Bibliography" w:uiPriority="37"/>
+    <w:lsdException w:name="TOC Heading" w:uiPriority="39" w:qFormat="1"/>
   </w:latentStyles>
   <w:style w:type="paragraph" w:default="1" w:styleId="Normal">
     <w:name w:val="Normal"/>
@@ -11602,6 +11082,1515 @@
 </w:styles>
 </file>
 
+<file path=word/stylesWithEffects.xml><?xml version="1.0" encoding="utf-8"?>
+<w:styles xmlns:wpc="http://schemas.microsoft.com/office/word/2010/wordprocessingCanvas" xmlns:mc="http://schemas.openxmlformats.org/markup-compatibility/2006" xmlns:o="urn:schemas-microsoft-com:office:office" xmlns:r="http://schemas.openxmlformats.org/officeDocument/2006/relationships" xmlns:m="http://schemas.openxmlformats.org/officeDocument/2006/math" xmlns:v="urn:schemas-microsoft-com:vml" xmlns:wp14="http://schemas.microsoft.com/office/word/2010/wordprocessingDrawing" xmlns:wp="http://schemas.openxmlformats.org/drawingml/2006/wordprocessingDrawing" xmlns:w10="urn:schemas-microsoft-com:office:word" xmlns:w="http://schemas.openxmlformats.org/wordprocessingml/2006/main" xmlns:w14="http://schemas.microsoft.com/office/word/2010/wordml" xmlns:wpg="http://schemas.microsoft.com/office/word/2010/wordprocessingGroup" xmlns:wpi="http://schemas.microsoft.com/office/word/2010/wordprocessingInk" xmlns:wne="http://schemas.microsoft.com/office/word/2006/wordml" xmlns:wps="http://schemas.microsoft.com/office/word/2010/wordprocessingShape" mc:Ignorable="w14 wp14">
+  <w:docDefaults>
+    <w:rPrDefault>
+      <w:rPr>
+        <w:rFonts w:ascii="Century Schoolbook" w:eastAsia="MS PMincho" w:hAnsi="Century Schoolbook" w:cs="Times New Roman"/>
+        <w:lang w:val="fr-FR" w:eastAsia="ja-JP" w:bidi="ar-SA"/>
+      </w:rPr>
+    </w:rPrDefault>
+    <w:pPrDefault/>
+  </w:docDefaults>
+  <w:latentStyles w:defLockedState="0" w:defUIPriority="99" w:defSemiHidden="1" w:defUnhideWhenUsed="1" w:defQFormat="0" w:count="267">
+    <w:lsdException w:name="Normal" w:semiHidden="0" w:uiPriority="0" w:unhideWhenUsed="0" w:qFormat="1"/>
+    <w:lsdException w:name="heading 1" w:semiHidden="0" w:uiPriority="9" w:unhideWhenUsed="0" w:qFormat="1"/>
+    <w:lsdException w:name="heading 2" w:uiPriority="9" w:qFormat="1"/>
+    <w:lsdException w:name="heading 3" w:uiPriority="9" w:qFormat="1"/>
+    <w:lsdException w:name="heading 4" w:uiPriority="9" w:qFormat="1"/>
+    <w:lsdException w:name="heading 5" w:uiPriority="9" w:qFormat="1"/>
+    <w:lsdException w:name="heading 6" w:uiPriority="9" w:qFormat="1"/>
+    <w:lsdException w:name="heading 7" w:uiPriority="9" w:qFormat="1"/>
+    <w:lsdException w:name="heading 8" w:uiPriority="9" w:qFormat="1"/>
+    <w:lsdException w:name="heading 9" w:uiPriority="9" w:qFormat="1"/>
+    <w:lsdException w:name="toc 1" w:uiPriority="39"/>
+    <w:lsdException w:name="toc 2" w:uiPriority="39"/>
+    <w:lsdException w:name="toc 3" w:uiPriority="39"/>
+    <w:lsdException w:name="toc 4" w:uiPriority="39"/>
+    <w:lsdException w:name="toc 5" w:uiPriority="39"/>
+    <w:lsdException w:name="toc 6" w:uiPriority="39"/>
+    <w:lsdException w:name="toc 7" w:uiPriority="39"/>
+    <w:lsdException w:name="toc 8" w:uiPriority="39"/>
+    <w:lsdException w:name="toc 9" w:uiPriority="39"/>
+    <w:lsdException w:name="caption" w:uiPriority="35" w:qFormat="1"/>
+    <w:lsdException w:name="Title" w:semiHidden="0" w:uiPriority="10" w:unhideWhenUsed="0" w:qFormat="1"/>
+    <w:lsdException w:name="Default Paragraph Font" w:uiPriority="1"/>
+    <w:lsdException w:name="Subtitle" w:semiHidden="0" w:uiPriority="11" w:unhideWhenUsed="0" w:qFormat="1"/>
+    <w:lsdException w:name="Strong" w:semiHidden="0" w:uiPriority="22" w:unhideWhenUsed="0" w:qFormat="1"/>
+    <w:lsdException w:name="Emphasis" w:semiHidden="0" w:uiPriority="20" w:unhideWhenUsed="0" w:qFormat="1"/>
+    <w:lsdException w:name="Table Grid" w:semiHidden="0" w:uiPriority="59" w:unhideWhenUsed="0"/>
+    <w:lsdException w:name="Placeholder Text" w:unhideWhenUsed="0"/>
+    <w:lsdException w:name="No Spacing" w:semiHidden="0" w:uiPriority="1" w:unhideWhenUsed="0" w:qFormat="1"/>
+    <w:lsdException w:name="Light Shading" w:semiHidden="0" w:uiPriority="60" w:unhideWhenUsed="0"/>
+    <w:lsdException w:name="Light List" w:semiHidden="0" w:uiPriority="61" w:unhideWhenUsed="0"/>
+    <w:lsdException w:name="Light Grid" w:semiHidden="0" w:uiPriority="62" w:unhideWhenUsed="0"/>
+    <w:lsdException w:name="Medium Shading 1" w:semiHidden="0" w:uiPriority="63" w:unhideWhenUsed="0"/>
+    <w:lsdException w:name="Medium Shading 2" w:semiHidden="0" w:uiPriority="64" w:unhideWhenUsed="0"/>
+    <w:lsdException w:name="Medium List 1" w:semiHidden="0" w:uiPriority="65" w:unhideWhenUsed="0"/>
+    <w:lsdException w:name="Medium List 2" w:semiHidden="0" w:uiPriority="66" w:unhideWhenUsed="0"/>
+    <w:lsdException w:name="Medium Grid 1" w:semiHidden="0" w:uiPriority="67" w:unhideWhenUsed="0"/>
+    <w:lsdException w:name="Medium Grid 2" w:semiHidden="0" w:uiPriority="68" w:unhideWhenUsed="0"/>
+    <w:lsdException w:name="Medium Grid 3" w:semiHidden="0" w:uiPriority="69" w:unhideWhenUsed="0"/>
+    <w:lsdException w:name="Dark List" w:semiHidden="0" w:uiPriority="70" w:unhideWhenUsed="0"/>
+    <w:lsdException w:name="Colorful Shading" w:semiHidden="0" w:uiPriority="71" w:unhideWhenUsed="0"/>
+    <w:lsdException w:name="Colorful List" w:semiHidden="0" w:uiPriority="72" w:unhideWhenUsed="0"/>
+    <w:lsdException w:name="Colorful Grid" w:semiHidden="0" w:uiPriority="73" w:unhideWhenUsed="0"/>
+    <w:lsdException w:name="Light Shading Accent 1" w:semiHidden="0" w:uiPriority="60" w:unhideWhenUsed="0"/>
+    <w:lsdException w:name="Light List Accent 1" w:semiHidden="0" w:uiPriority="61" w:unhideWhenUsed="0"/>
+    <w:lsdException w:name="Light Grid Accent 1" w:semiHidden="0" w:uiPriority="62" w:unhideWhenUsed="0"/>
+    <w:lsdException w:name="Medium Shading 1 Accent 1" w:semiHidden="0" w:uiPriority="63" w:unhideWhenUsed="0"/>
+    <w:lsdException w:name="Medium Shading 2 Accent 1" w:semiHidden="0" w:uiPriority="64" w:unhideWhenUsed="0"/>
+    <w:lsdException w:name="Medium List 1 Accent 1" w:semiHidden="0" w:uiPriority="65" w:unhideWhenUsed="0"/>
+    <w:lsdException w:name="Revision" w:unhideWhenUsed="0"/>
+    <w:lsdException w:name="List Paragraph" w:semiHidden="0" w:uiPriority="1" w:unhideWhenUsed="0" w:qFormat="1"/>
+    <w:lsdException w:name="Quote" w:semiHidden="0" w:uiPriority="29" w:unhideWhenUsed="0" w:qFormat="1"/>
+    <w:lsdException w:name="Intense Quote" w:semiHidden="0" w:uiPriority="30" w:unhideWhenUsed="0" w:qFormat="1"/>
+    <w:lsdException w:name="Medium List 2 Accent 1" w:semiHidden="0" w:uiPriority="66" w:unhideWhenUsed="0"/>
+    <w:lsdException w:name="Medium Grid 1 Accent 1" w:semiHidden="0" w:uiPriority="67" w:unhideWhenUsed="0"/>
+    <w:lsdException w:name="Medium Grid 2 Accent 1" w:semiHidden="0" w:uiPriority="68" w:unhideWhenUsed="0"/>
+    <w:lsdException w:name="Medium Grid 3 Accent 1" w:semiHidden="0" w:uiPriority="69" w:unhideWhenUsed="0"/>
+    <w:lsdException w:name="Dark List Accent 1" w:semiHidden="0" w:uiPriority="70" w:unhideWhenUsed="0"/>
+    <w:lsdException w:name="Colorful Shading Accent 1" w:semiHidden="0" w:uiPriority="71" w:unhideWhenUsed="0"/>
+    <w:lsdException w:name="Colorful List Accent 1" w:semiHidden="0" w:uiPriority="72" w:unhideWhenUsed="0"/>
+    <w:lsdException w:name="Colorful Grid Accent 1" w:semiHidden="0" w:uiPriority="73" w:unhideWhenUsed="0"/>
+    <w:lsdException w:name="Light Shading Accent 2" w:semiHidden="0" w:uiPriority="60" w:unhideWhenUsed="0"/>
+    <w:lsdException w:name="Light List Accent 2" w:semiHidden="0" w:uiPriority="61" w:unhideWhenUsed="0"/>
+    <w:lsdException w:name="Light Grid Accent 2" w:semiHidden="0" w:uiPriority="62" w:unhideWhenUsed="0"/>
+    <w:lsdException w:name="Medium Shading 1 Accent 2" w:semiHidden="0" w:uiPriority="63" w:unhideWhenUsed="0"/>
+    <w:lsdException w:name="Medium Shading 2 Accent 2" w:semiHidden="0" w:uiPriority="64" w:unhideWhenUsed="0"/>
+    <w:lsdException w:name="Medium List 1 Accent 2" w:semiHidden="0" w:uiPriority="65" w:unhideWhenUsed="0"/>
+    <w:lsdException w:name="Medium List 2 Accent 2" w:semiHidden="0" w:uiPriority="66" w:unhideWhenUsed="0"/>
+    <w:lsdException w:name="Medium Grid 1 Accent 2" w:semiHidden="0" w:uiPriority="67" w:unhideWhenUsed="0"/>
+    <w:lsdException w:name="Medium Grid 2 Accent 2" w:semiHidden="0" w:uiPriority="68" w:unhideWhenUsed="0"/>
+    <w:lsdException w:name="Medium Grid 3 Accent 2" w:semiHidden="0" w:uiPriority="69" w:unhideWhenUsed="0"/>
+    <w:lsdException w:name="Dark List Accent 2" w:semiHidden="0" w:uiPriority="70" w:unhideWhenUsed="0"/>
+    <w:lsdException w:name="Colorful Shading Accent 2" w:semiHidden="0" w:uiPriority="71" w:unhideWhenUsed="0"/>
+    <w:lsdException w:name="Colorful List Accent 2" w:semiHidden="0" w:uiPriority="72" w:unhideWhenUsed="0"/>
+    <w:lsdException w:name="Colorful Grid Accent 2" w:semiHidden="0" w:uiPriority="73" w:unhideWhenUsed="0"/>
+    <w:lsdException w:name="Light Shading Accent 3" w:semiHidden="0" w:uiPriority="60" w:unhideWhenUsed="0"/>
+    <w:lsdException w:name="Light List Accent 3" w:semiHidden="0" w:uiPriority="61" w:unhideWhenUsed="0"/>
+    <w:lsdException w:name="Light Grid Accent 3" w:semiHidden="0" w:uiPriority="62" w:unhideWhenUsed="0"/>
+    <w:lsdException w:name="Medium Shading 1 Accent 3" w:semiHidden="0" w:uiPriority="63" w:unhideWhenUsed="0"/>
+    <w:lsdException w:name="Medium Shading 2 Accent 3" w:semiHidden="0" w:uiPriority="64" w:unhideWhenUsed="0"/>
+    <w:lsdException w:name="Medium List 1 Accent 3" w:semiHidden="0" w:uiPriority="65" w:unhideWhenUsed="0"/>
+    <w:lsdException w:name="Medium List 2 Accent 3" w:semiHidden="0" w:uiPriority="66" w:unhideWhenUsed="0"/>
+    <w:lsdException w:name="Medium Grid 1 Accent 3" w:semiHidden="0" w:uiPriority="67" w:unhideWhenUsed="0"/>
+    <w:lsdException w:name="Medium Grid 2 Accent 3" w:semiHidden="0" w:uiPriority="68" w:unhideWhenUsed="0"/>
+    <w:lsdException w:name="Medium Grid 3 Accent 3" w:semiHidden="0" w:uiPriority="69" w:unhideWhenUsed="0"/>
+    <w:lsdException w:name="Dark List Accent 3" w:semiHidden="0" w:uiPriority="70" w:unhideWhenUsed="0"/>
+    <w:lsdException w:name="Colorful Shading Accent 3" w:semiHidden="0" w:uiPriority="71" w:unhideWhenUsed="0"/>
+    <w:lsdException w:name="Colorful List Accent 3" w:semiHidden="0" w:uiPriority="72" w:unhideWhenUsed="0"/>
+    <w:lsdException w:name="Colorful Grid Accent 3" w:semiHidden="0" w:uiPriority="73" w:unhideWhenUsed="0"/>
+    <w:lsdException w:name="Light Shading Accent 4" w:semiHidden="0" w:uiPriority="60" w:unhideWhenUsed="0"/>
+    <w:lsdException w:name="Light List Accent 4" w:semiHidden="0" w:uiPriority="61" w:unhideWhenUsed="0"/>
+    <w:lsdException w:name="Light Grid Accent 4" w:semiHidden="0" w:uiPriority="62" w:unhideWhenUsed="0"/>
+    <w:lsdException w:name="Medium Shading 1 Accent 4" w:semiHidden="0" w:uiPriority="63" w:unhideWhenUsed="0"/>
+    <w:lsdException w:name="Medium Shading 2 Accent 4" w:semiHidden="0" w:uiPriority="64" w:unhideWhenUsed="0"/>
+    <w:lsdException w:name="Medium List 1 Accent 4" w:semiHidden="0" w:uiPriority="65" w:unhideWhenUsed="0"/>
+    <w:lsdException w:name="Medium List 2 Accent 4" w:semiHidden="0" w:uiPriority="66" w:unhideWhenUsed="0"/>
+    <w:lsdException w:name="Medium Grid 1 Accent 4" w:semiHidden="0" w:uiPriority="67" w:unhideWhenUsed="0"/>
+    <w:lsdException w:name="Medium Grid 2 Accent 4" w:semiHidden="0" w:uiPriority="68" w:unhideWhenUsed="0"/>
+    <w:lsdException w:name="Medium Grid 3 Accent 4" w:semiHidden="0" w:uiPriority="69" w:unhideWhenUsed="0"/>
+    <w:lsdException w:name="Dark List Accent 4" w:semiHidden="0" w:uiPriority="70" w:unhideWhenUsed="0"/>
+    <w:lsdException w:name="Colorful Shading Accent 4" w:semiHidden="0" w:uiPriority="71" w:unhideWhenUsed="0"/>
+    <w:lsdException w:name="Colorful List Accent 4" w:semiHidden="0" w:uiPriority="72" w:unhideWhenUsed="0"/>
+    <w:lsdException w:name="Colorful Grid Accent 4" w:semiHidden="0" w:uiPriority="73" w:unhideWhenUsed="0"/>
+    <w:lsdException w:name="Light Shading Accent 5" w:semiHidden="0" w:uiPriority="60" w:unhideWhenUsed="0"/>
+    <w:lsdException w:name="Light List Accent 5" w:semiHidden="0" w:uiPriority="61" w:unhideWhenUsed="0"/>
+    <w:lsdException w:name="Light Grid Accent 5" w:semiHidden="0" w:uiPriority="62" w:unhideWhenUsed="0"/>
+    <w:lsdException w:name="Medium Shading 1 Accent 5" w:semiHidden="0" w:uiPriority="63" w:unhideWhenUsed="0"/>
+    <w:lsdException w:name="Medium Shading 2 Accent 5" w:semiHidden="0" w:uiPriority="64" w:unhideWhenUsed="0"/>
+    <w:lsdException w:name="Medium List 1 Accent 5" w:semiHidden="0" w:uiPriority="65" w:unhideWhenUsed="0"/>
+    <w:lsdException w:name="Medium List 2 Accent 5" w:semiHidden="0" w:uiPriority="66" w:unhideWhenUsed="0"/>
+    <w:lsdException w:name="Medium Grid 1 Accent 5" w:semiHidden="0" w:uiPriority="67" w:unhideWhenUsed="0"/>
+    <w:lsdException w:name="Medium Grid 2 Accent 5" w:semiHidden="0" w:uiPriority="68" w:unhideWhenUsed="0"/>
+    <w:lsdException w:name="Medium Grid 3 Accent 5" w:semiHidden="0" w:uiPriority="69" w:unhideWhenUsed="0"/>
+    <w:lsdException w:name="Dark List Accent 5" w:semiHidden="0" w:uiPriority="70" w:unhideWhenUsed="0"/>
+    <w:lsdException w:name="Colorful Shading Accent 5" w:semiHidden="0" w:uiPriority="71" w:unhideWhenUsed="0"/>
+    <w:lsdException w:name="Colorful List Accent 5" w:semiHidden="0" w:uiPriority="72" w:unhideWhenUsed="0"/>
+    <w:lsdException w:name="Colorful Grid Accent 5" w:semiHidden="0" w:uiPriority="73" w:unhideWhenUsed="0"/>
+    <w:lsdException w:name="Light Shading Accent 6" w:semiHidden="0" w:uiPriority="60" w:unhideWhenUsed="0"/>
+    <w:lsdException w:name="Light List Accent 6" w:semiHidden="0" w:uiPriority="61" w:unhideWhenUsed="0"/>
+    <w:lsdException w:name="Light Grid Accent 6" w:semiHidden="0" w:uiPriority="62" w:unhideWhenUsed="0"/>
+    <w:lsdException w:name="Medium Shading 1 Accent 6" w:semiHidden="0" w:uiPriority="63" w:unhideWhenUsed="0"/>
+    <w:lsdException w:name="Medium Shading 2 Accent 6" w:semiHidden="0" w:uiPriority="64" w:unhideWhenUsed="0"/>
+    <w:lsdException w:name="Medium List 1 Accent 6" w:semiHidden="0" w:uiPriority="65" w:unhideWhenUsed="0"/>
+    <w:lsdException w:name="Medium List 2 Accent 6" w:semiHidden="0" w:uiPriority="66" w:unhideWhenUsed="0"/>
+    <w:lsdException w:name="Medium Grid 1 Accent 6" w:semiHidden="0" w:uiPriority="67" w:unhideWhenUsed="0"/>
+    <w:lsdException w:name="Medium Grid 2 Accent 6" w:semiHidden="0" w:uiPriority="68" w:unhideWhenUsed="0"/>
+    <w:lsdException w:name="Medium Grid 3 Accent 6" w:semiHidden="0" w:uiPriority="69" w:unhideWhenUsed="0"/>
+    <w:lsdException w:name="Dark List Accent 6" w:semiHidden="0" w:uiPriority="70" w:unhideWhenUsed="0"/>
+    <w:lsdException w:name="Colorful Shading Accent 6" w:semiHidden="0" w:uiPriority="71" w:unhideWhenUsed="0"/>
+    <w:lsdException w:name="Colorful List Accent 6" w:semiHidden="0" w:uiPriority="72" w:unhideWhenUsed="0"/>
+    <w:lsdException w:name="Colorful Grid Accent 6" w:semiHidden="0" w:uiPriority="73" w:unhideWhenUsed="0"/>
+    <w:lsdException w:name="Subtle Emphasis" w:semiHidden="0" w:uiPriority="19" w:unhideWhenUsed="0" w:qFormat="1"/>
+    <w:lsdException w:name="Intense Emphasis" w:semiHidden="0" w:uiPriority="21" w:unhideWhenUsed="0" w:qFormat="1"/>
+    <w:lsdException w:name="Subtle Reference" w:semiHidden="0" w:uiPriority="31" w:unhideWhenUsed="0" w:qFormat="1"/>
+    <w:lsdException w:name="Intense Reference" w:semiHidden="0" w:uiPriority="32" w:unhideWhenUsed="0" w:qFormat="1"/>
+    <w:lsdException w:name="Book Title" w:semiHidden="0" w:uiPriority="33" w:unhideWhenUsed="0" w:qFormat="1"/>
+    <w:lsdException w:name="Bibliography" w:uiPriority="37"/>
+    <w:lsdException w:name="TOC Heading" w:uiPriority="39" w:qFormat="1"/>
+  </w:latentStyles>
+  <w:style w:type="paragraph" w:default="1" w:styleId="Normal">
+    <w:name w:val="Normal"/>
+    <w:qFormat/>
+    <w:rsid w:val="00215B45"/>
+    <w:pPr>
+      <w:spacing w:before="40" w:after="200" w:line="276" w:lineRule="auto"/>
+      <w:jc w:val="both"/>
+    </w:pPr>
+    <w:rPr>
+      <w:lang w:val="en-US" w:eastAsia="en-US" w:bidi="en-US"/>
+    </w:rPr>
+  </w:style>
+  <w:style w:type="paragraph" w:styleId="Heading1">
+    <w:name w:val="heading 1"/>
+    <w:basedOn w:val="Normal"/>
+    <w:next w:val="Normal"/>
+    <w:link w:val="Heading1Char"/>
+    <w:uiPriority w:val="9"/>
+    <w:qFormat/>
+    <w:rsid w:val="009F2958"/>
+    <w:pPr>
+      <w:spacing w:before="300" w:after="40"/>
+      <w:jc w:val="left"/>
+      <w:outlineLvl w:val="0"/>
+    </w:pPr>
+    <w:rPr>
+      <w:smallCaps/>
+      <w:spacing w:val="5"/>
+      <w:sz w:val="32"/>
+      <w:szCs w:val="32"/>
+    </w:rPr>
+  </w:style>
+  <w:style w:type="paragraph" w:styleId="Heading2">
+    <w:name w:val="heading 2"/>
+    <w:basedOn w:val="Normal"/>
+    <w:next w:val="Normal"/>
+    <w:link w:val="Heading2Char"/>
+    <w:uiPriority w:val="9"/>
+    <w:semiHidden/>
+    <w:unhideWhenUsed/>
+    <w:qFormat/>
+    <w:rsid w:val="009F2958"/>
+    <w:pPr>
+      <w:spacing w:before="240" w:after="80"/>
+      <w:jc w:val="left"/>
+      <w:outlineLvl w:val="1"/>
+    </w:pPr>
+    <w:rPr>
+      <w:smallCaps/>
+      <w:spacing w:val="5"/>
+      <w:sz w:val="28"/>
+      <w:szCs w:val="28"/>
+    </w:rPr>
+  </w:style>
+  <w:style w:type="paragraph" w:styleId="Heading3">
+    <w:name w:val="heading 3"/>
+    <w:basedOn w:val="Normal"/>
+    <w:next w:val="Normal"/>
+    <w:link w:val="Heading3Char"/>
+    <w:uiPriority w:val="9"/>
+    <w:unhideWhenUsed/>
+    <w:qFormat/>
+    <w:rsid w:val="009F2958"/>
+    <w:pPr>
+      <w:spacing w:after="0"/>
+      <w:jc w:val="left"/>
+      <w:outlineLvl w:val="2"/>
+    </w:pPr>
+    <w:rPr>
+      <w:smallCaps/>
+      <w:spacing w:val="5"/>
+      <w:sz w:val="24"/>
+      <w:szCs w:val="24"/>
+    </w:rPr>
+  </w:style>
+  <w:style w:type="paragraph" w:styleId="Heading4">
+    <w:name w:val="heading 4"/>
+    <w:basedOn w:val="Normal"/>
+    <w:next w:val="Normal"/>
+    <w:link w:val="Heading4Char"/>
+    <w:uiPriority w:val="9"/>
+    <w:semiHidden/>
+    <w:unhideWhenUsed/>
+    <w:qFormat/>
+    <w:rsid w:val="009F2958"/>
+    <w:pPr>
+      <w:spacing w:before="240" w:after="0"/>
+      <w:jc w:val="left"/>
+      <w:outlineLvl w:val="3"/>
+    </w:pPr>
+    <w:rPr>
+      <w:smallCaps/>
+      <w:spacing w:val="10"/>
+      <w:sz w:val="22"/>
+      <w:szCs w:val="22"/>
+    </w:rPr>
+  </w:style>
+  <w:style w:type="paragraph" w:styleId="Heading5">
+    <w:name w:val="heading 5"/>
+    <w:basedOn w:val="Normal"/>
+    <w:next w:val="Normal"/>
+    <w:link w:val="Heading5Char"/>
+    <w:uiPriority w:val="9"/>
+    <w:semiHidden/>
+    <w:unhideWhenUsed/>
+    <w:qFormat/>
+    <w:rsid w:val="009F2958"/>
+    <w:pPr>
+      <w:spacing w:before="200" w:after="0"/>
+      <w:jc w:val="left"/>
+      <w:outlineLvl w:val="4"/>
+    </w:pPr>
+    <w:rPr>
+      <w:smallCaps/>
+      <w:color w:val="3667C3"/>
+      <w:spacing w:val="10"/>
+      <w:sz w:val="22"/>
+      <w:szCs w:val="26"/>
+    </w:rPr>
+  </w:style>
+  <w:style w:type="paragraph" w:styleId="Heading6">
+    <w:name w:val="heading 6"/>
+    <w:basedOn w:val="Normal"/>
+    <w:next w:val="Normal"/>
+    <w:link w:val="Heading6Char"/>
+    <w:uiPriority w:val="9"/>
+    <w:semiHidden/>
+    <w:unhideWhenUsed/>
+    <w:qFormat/>
+    <w:rsid w:val="009F2958"/>
+    <w:pPr>
+      <w:spacing w:after="0"/>
+      <w:jc w:val="left"/>
+      <w:outlineLvl w:val="5"/>
+    </w:pPr>
+    <w:rPr>
+      <w:smallCaps/>
+      <w:color w:val="7598D9"/>
+      <w:spacing w:val="5"/>
+      <w:sz w:val="22"/>
+    </w:rPr>
+  </w:style>
+  <w:style w:type="paragraph" w:styleId="Heading7">
+    <w:name w:val="heading 7"/>
+    <w:basedOn w:val="Normal"/>
+    <w:next w:val="Normal"/>
+    <w:link w:val="Heading7Char"/>
+    <w:uiPriority w:val="9"/>
+    <w:semiHidden/>
+    <w:unhideWhenUsed/>
+    <w:qFormat/>
+    <w:rsid w:val="009F2958"/>
+    <w:pPr>
+      <w:spacing w:after="0"/>
+      <w:jc w:val="left"/>
+      <w:outlineLvl w:val="6"/>
+    </w:pPr>
+    <w:rPr>
+      <w:b/>
+      <w:smallCaps/>
+      <w:color w:val="7598D9"/>
+      <w:spacing w:val="10"/>
+    </w:rPr>
+  </w:style>
+  <w:style w:type="paragraph" w:styleId="Heading8">
+    <w:name w:val="heading 8"/>
+    <w:basedOn w:val="Normal"/>
+    <w:next w:val="Normal"/>
+    <w:link w:val="Heading8Char"/>
+    <w:uiPriority w:val="9"/>
+    <w:semiHidden/>
+    <w:unhideWhenUsed/>
+    <w:qFormat/>
+    <w:rsid w:val="009F2958"/>
+    <w:pPr>
+      <w:spacing w:after="0"/>
+      <w:jc w:val="left"/>
+      <w:outlineLvl w:val="7"/>
+    </w:pPr>
+    <w:rPr>
+      <w:b/>
+      <w:i/>
+      <w:smallCaps/>
+      <w:color w:val="3667C3"/>
+    </w:rPr>
+  </w:style>
+  <w:style w:type="paragraph" w:styleId="Heading9">
+    <w:name w:val="heading 9"/>
+    <w:basedOn w:val="Normal"/>
+    <w:next w:val="Normal"/>
+    <w:link w:val="Heading9Char"/>
+    <w:uiPriority w:val="9"/>
+    <w:semiHidden/>
+    <w:unhideWhenUsed/>
+    <w:qFormat/>
+    <w:rsid w:val="009F2958"/>
+    <w:pPr>
+      <w:spacing w:after="0"/>
+      <w:jc w:val="left"/>
+      <w:outlineLvl w:val="8"/>
+    </w:pPr>
+    <w:rPr>
+      <w:b/>
+      <w:i/>
+      <w:smallCaps/>
+      <w:color w:val="244482"/>
+    </w:rPr>
+  </w:style>
+  <w:style w:type="character" w:default="1" w:styleId="DefaultParagraphFont">
+    <w:name w:val="Default Paragraph Font"/>
+    <w:uiPriority w:val="1"/>
+    <w:semiHidden/>
+    <w:unhideWhenUsed/>
+  </w:style>
+  <w:style w:type="table" w:default="1" w:styleId="TableNormal">
+    <w:name w:val="Normal Table"/>
+    <w:uiPriority w:val="99"/>
+    <w:semiHidden/>
+    <w:unhideWhenUsed/>
+    <w:tblPr>
+      <w:tblInd w:w="0" w:type="dxa"/>
+      <w:tblCellMar>
+        <w:top w:w="0" w:type="dxa"/>
+        <w:left w:w="108" w:type="dxa"/>
+        <w:bottom w:w="0" w:type="dxa"/>
+        <w:right w:w="108" w:type="dxa"/>
+      </w:tblCellMar>
+    </w:tblPr>
+  </w:style>
+  <w:style w:type="numbering" w:default="1" w:styleId="NoList">
+    <w:name w:val="No List"/>
+    <w:uiPriority w:val="99"/>
+    <w:semiHidden/>
+    <w:unhideWhenUsed/>
+  </w:style>
+  <w:style w:type="table" w:styleId="TableGrid">
+    <w:name w:val="Table Grid"/>
+    <w:basedOn w:val="TableNormal"/>
+    <w:uiPriority w:val="59"/>
+    <w:rsid w:val="00083491"/>
+    <w:tblPr>
+      <w:tblBorders>
+        <w:top w:val="single" w:sz="4" w:space="0" w:color="000000"/>
+        <w:left w:val="single" w:sz="4" w:space="0" w:color="000000"/>
+        <w:bottom w:val="single" w:sz="4" w:space="0" w:color="000000"/>
+        <w:right w:val="single" w:sz="4" w:space="0" w:color="000000"/>
+        <w:insideH w:val="single" w:sz="4" w:space="0" w:color="000000"/>
+        <w:insideV w:val="single" w:sz="4" w:space="0" w:color="000000"/>
+      </w:tblBorders>
+    </w:tblPr>
+  </w:style>
+  <w:style w:type="table" w:styleId="LightShading-Accent5">
+    <w:name w:val="Light Shading Accent 5"/>
+    <w:basedOn w:val="TableNormal"/>
+    <w:uiPriority w:val="60"/>
+    <w:rsid w:val="00083491"/>
+    <w:rPr>
+      <w:color w:val="6D83B3"/>
+    </w:rPr>
+    <w:tblPr>
+      <w:tblStyleRowBandSize w:val="1"/>
+      <w:tblStyleColBandSize w:val="1"/>
+      <w:tblBorders>
+        <w:top w:val="single" w:sz="8" w:space="0" w:color="AEBAD5"/>
+        <w:bottom w:val="single" w:sz="8" w:space="0" w:color="AEBAD5"/>
+      </w:tblBorders>
+    </w:tblPr>
+    <w:tblStylePr w:type="firstRow">
+      <w:pPr>
+        <w:spacing w:before="0" w:after="0" w:line="240" w:lineRule="auto"/>
+      </w:pPr>
+      <w:rPr>
+        <w:b/>
+        <w:bCs/>
+      </w:rPr>
+      <w:tblPr/>
+      <w:tcPr>
+        <w:tcBorders>
+          <w:top w:val="single" w:sz="8" w:space="0" w:color="AEBAD5"/>
+          <w:left w:val="nil"/>
+          <w:bottom w:val="single" w:sz="8" w:space="0" w:color="AEBAD5"/>
+          <w:right w:val="nil"/>
+          <w:insideH w:val="nil"/>
+          <w:insideV w:val="nil"/>
+        </w:tcBorders>
+      </w:tcPr>
+    </w:tblStylePr>
+    <w:tblStylePr w:type="lastRow">
+      <w:pPr>
+        <w:spacing w:before="0" w:after="0" w:line="240" w:lineRule="auto"/>
+      </w:pPr>
+      <w:rPr>
+        <w:b/>
+        <w:bCs/>
+      </w:rPr>
+      <w:tblPr/>
+      <w:tcPr>
+        <w:tcBorders>
+          <w:top w:val="single" w:sz="8" w:space="0" w:color="AEBAD5"/>
+          <w:left w:val="nil"/>
+          <w:bottom w:val="single" w:sz="8" w:space="0" w:color="AEBAD5"/>
+          <w:right w:val="nil"/>
+          <w:insideH w:val="nil"/>
+          <w:insideV w:val="nil"/>
+        </w:tcBorders>
+      </w:tcPr>
+    </w:tblStylePr>
+    <w:tblStylePr w:type="firstCol">
+      <w:rPr>
+        <w:b/>
+        <w:bCs/>
+      </w:rPr>
+    </w:tblStylePr>
+    <w:tblStylePr w:type="lastCol">
+      <w:rPr>
+        <w:b/>
+        <w:bCs/>
+      </w:rPr>
+    </w:tblStylePr>
+    <w:tblStylePr w:type="band1Vert">
+      <w:tblPr/>
+      <w:tcPr>
+        <w:tcBorders>
+          <w:left w:val="nil"/>
+          <w:right w:val="nil"/>
+          <w:insideH w:val="nil"/>
+          <w:insideV w:val="nil"/>
+        </w:tcBorders>
+        <w:shd w:val="clear" w:color="auto" w:fill="EAEDF4"/>
+      </w:tcPr>
+    </w:tblStylePr>
+    <w:tblStylePr w:type="band1Horz">
+      <w:tblPr/>
+      <w:tcPr>
+        <w:tcBorders>
+          <w:left w:val="nil"/>
+          <w:right w:val="nil"/>
+          <w:insideH w:val="nil"/>
+          <w:insideV w:val="nil"/>
+        </w:tcBorders>
+        <w:shd w:val="clear" w:color="auto" w:fill="EAEDF4"/>
+      </w:tcPr>
+    </w:tblStylePr>
+  </w:style>
+  <w:style w:type="character" w:styleId="Hyperlink">
+    <w:name w:val="Hyperlink"/>
+    <w:basedOn w:val="DefaultParagraphFont"/>
+    <w:uiPriority w:val="99"/>
+    <w:unhideWhenUsed/>
+    <w:rsid w:val="00083491"/>
+    <w:rPr>
+      <w:color w:val="D2611C"/>
+      <w:u w:val="single"/>
+    </w:rPr>
+  </w:style>
+  <w:style w:type="character" w:customStyle="1" w:styleId="Heading1Char">
+    <w:name w:val="Heading 1 Char"/>
+    <w:basedOn w:val="DefaultParagraphFont"/>
+    <w:link w:val="Heading1"/>
+    <w:uiPriority w:val="9"/>
+    <w:rsid w:val="009F2958"/>
+    <w:rPr>
+      <w:smallCaps/>
+      <w:spacing w:val="5"/>
+      <w:sz w:val="32"/>
+      <w:szCs w:val="32"/>
+    </w:rPr>
+  </w:style>
+  <w:style w:type="character" w:customStyle="1" w:styleId="Heading2Char">
+    <w:name w:val="Heading 2 Char"/>
+    <w:basedOn w:val="DefaultParagraphFont"/>
+    <w:link w:val="Heading2"/>
+    <w:uiPriority w:val="9"/>
+    <w:semiHidden/>
+    <w:rsid w:val="009F2958"/>
+    <w:rPr>
+      <w:smallCaps/>
+      <w:spacing w:val="5"/>
+      <w:sz w:val="28"/>
+      <w:szCs w:val="28"/>
+    </w:rPr>
+  </w:style>
+  <w:style w:type="character" w:customStyle="1" w:styleId="Heading3Char">
+    <w:name w:val="Heading 3 Char"/>
+    <w:basedOn w:val="DefaultParagraphFont"/>
+    <w:link w:val="Heading3"/>
+    <w:uiPriority w:val="9"/>
+    <w:rsid w:val="009F2958"/>
+    <w:rPr>
+      <w:smallCaps/>
+      <w:spacing w:val="5"/>
+      <w:sz w:val="24"/>
+      <w:szCs w:val="24"/>
+    </w:rPr>
+  </w:style>
+  <w:style w:type="character" w:customStyle="1" w:styleId="Heading4Char">
+    <w:name w:val="Heading 4 Char"/>
+    <w:basedOn w:val="DefaultParagraphFont"/>
+    <w:link w:val="Heading4"/>
+    <w:uiPriority w:val="9"/>
+    <w:semiHidden/>
+    <w:rsid w:val="009F2958"/>
+    <w:rPr>
+      <w:smallCaps/>
+      <w:spacing w:val="10"/>
+      <w:sz w:val="22"/>
+      <w:szCs w:val="22"/>
+    </w:rPr>
+  </w:style>
+  <w:style w:type="character" w:customStyle="1" w:styleId="Heading5Char">
+    <w:name w:val="Heading 5 Char"/>
+    <w:basedOn w:val="DefaultParagraphFont"/>
+    <w:link w:val="Heading5"/>
+    <w:uiPriority w:val="9"/>
+    <w:semiHidden/>
+    <w:rsid w:val="009F2958"/>
+    <w:rPr>
+      <w:smallCaps/>
+      <w:color w:val="3667C3"/>
+      <w:spacing w:val="10"/>
+      <w:sz w:val="22"/>
+      <w:szCs w:val="26"/>
+    </w:rPr>
+  </w:style>
+  <w:style w:type="character" w:customStyle="1" w:styleId="Heading6Char">
+    <w:name w:val="Heading 6 Char"/>
+    <w:basedOn w:val="DefaultParagraphFont"/>
+    <w:link w:val="Heading6"/>
+    <w:uiPriority w:val="9"/>
+    <w:semiHidden/>
+    <w:rsid w:val="009F2958"/>
+    <w:rPr>
+      <w:smallCaps/>
+      <w:color w:val="7598D9"/>
+      <w:spacing w:val="5"/>
+      <w:sz w:val="22"/>
+    </w:rPr>
+  </w:style>
+  <w:style w:type="character" w:customStyle="1" w:styleId="Heading7Char">
+    <w:name w:val="Heading 7 Char"/>
+    <w:basedOn w:val="DefaultParagraphFont"/>
+    <w:link w:val="Heading7"/>
+    <w:uiPriority w:val="9"/>
+    <w:semiHidden/>
+    <w:rsid w:val="009F2958"/>
+    <w:rPr>
+      <w:b/>
+      <w:smallCaps/>
+      <w:color w:val="7598D9"/>
+      <w:spacing w:val="10"/>
+    </w:rPr>
+  </w:style>
+  <w:style w:type="character" w:customStyle="1" w:styleId="Heading8Char">
+    <w:name w:val="Heading 8 Char"/>
+    <w:basedOn w:val="DefaultParagraphFont"/>
+    <w:link w:val="Heading8"/>
+    <w:uiPriority w:val="9"/>
+    <w:semiHidden/>
+    <w:rsid w:val="009F2958"/>
+    <w:rPr>
+      <w:b/>
+      <w:i/>
+      <w:smallCaps/>
+      <w:color w:val="3667C3"/>
+    </w:rPr>
+  </w:style>
+  <w:style w:type="character" w:customStyle="1" w:styleId="Heading9Char">
+    <w:name w:val="Heading 9 Char"/>
+    <w:basedOn w:val="DefaultParagraphFont"/>
+    <w:link w:val="Heading9"/>
+    <w:uiPriority w:val="9"/>
+    <w:semiHidden/>
+    <w:rsid w:val="009F2958"/>
+    <w:rPr>
+      <w:b/>
+      <w:i/>
+      <w:smallCaps/>
+      <w:color w:val="244482"/>
+    </w:rPr>
+  </w:style>
+  <w:style w:type="paragraph" w:styleId="Caption">
+    <w:name w:val="caption"/>
+    <w:basedOn w:val="Normal"/>
+    <w:next w:val="Normal"/>
+    <w:uiPriority w:val="35"/>
+    <w:semiHidden/>
+    <w:unhideWhenUsed/>
+    <w:qFormat/>
+    <w:rsid w:val="009F2958"/>
+    <w:rPr>
+      <w:b/>
+      <w:bCs/>
+      <w:caps/>
+      <w:sz w:val="16"/>
+      <w:szCs w:val="18"/>
+    </w:rPr>
+  </w:style>
+  <w:style w:type="paragraph" w:styleId="Title">
+    <w:name w:val="Title"/>
+    <w:basedOn w:val="Normal"/>
+    <w:next w:val="Normal"/>
+    <w:link w:val="TitleChar"/>
+    <w:uiPriority w:val="10"/>
+    <w:qFormat/>
+    <w:rsid w:val="009F2958"/>
+    <w:pPr>
+      <w:pBdr>
+        <w:top w:val="single" w:sz="12" w:space="1" w:color="7598D9"/>
+      </w:pBdr>
+      <w:spacing w:line="240" w:lineRule="auto"/>
+      <w:jc w:val="right"/>
+    </w:pPr>
+    <w:rPr>
+      <w:smallCaps/>
+      <w:sz w:val="48"/>
+      <w:szCs w:val="48"/>
+    </w:rPr>
+  </w:style>
+  <w:style w:type="character" w:customStyle="1" w:styleId="TitleChar">
+    <w:name w:val="Title Char"/>
+    <w:basedOn w:val="DefaultParagraphFont"/>
+    <w:link w:val="Title"/>
+    <w:uiPriority w:val="10"/>
+    <w:rsid w:val="009F2958"/>
+    <w:rPr>
+      <w:smallCaps/>
+      <w:sz w:val="48"/>
+      <w:szCs w:val="48"/>
+    </w:rPr>
+  </w:style>
+  <w:style w:type="paragraph" w:styleId="Subtitle">
+    <w:name w:val="Subtitle"/>
+    <w:basedOn w:val="Normal"/>
+    <w:next w:val="Normal"/>
+    <w:link w:val="SubtitleChar"/>
+    <w:uiPriority w:val="11"/>
+    <w:qFormat/>
+    <w:rsid w:val="009F2958"/>
+    <w:pPr>
+      <w:spacing w:after="720" w:line="240" w:lineRule="auto"/>
+      <w:jc w:val="right"/>
+    </w:pPr>
+    <w:rPr>
+      <w:szCs w:val="22"/>
+    </w:rPr>
+  </w:style>
+  <w:style w:type="character" w:customStyle="1" w:styleId="SubtitleChar">
+    <w:name w:val="Subtitle Char"/>
+    <w:basedOn w:val="DefaultParagraphFont"/>
+    <w:link w:val="Subtitle"/>
+    <w:uiPriority w:val="11"/>
+    <w:rsid w:val="009F2958"/>
+    <w:rPr>
+      <w:rFonts w:ascii="Century Schoolbook" w:eastAsia="MS PMincho" w:hAnsi="Century Schoolbook" w:cs="Times New Roman"/>
+      <w:szCs w:val="22"/>
+    </w:rPr>
+  </w:style>
+  <w:style w:type="character" w:styleId="Strong">
+    <w:name w:val="Strong"/>
+    <w:uiPriority w:val="22"/>
+    <w:qFormat/>
+    <w:rsid w:val="009F2958"/>
+    <w:rPr>
+      <w:b/>
+      <w:color w:val="7598D9"/>
+    </w:rPr>
+  </w:style>
+  <w:style w:type="character" w:styleId="Emphasis">
+    <w:name w:val="Emphasis"/>
+    <w:uiPriority w:val="20"/>
+    <w:qFormat/>
+    <w:rsid w:val="009F2958"/>
+    <w:rPr>
+      <w:b/>
+      <w:i/>
+      <w:spacing w:val="10"/>
+    </w:rPr>
+  </w:style>
+  <w:style w:type="paragraph" w:styleId="NoSpacing">
+    <w:name w:val="No Spacing"/>
+    <w:basedOn w:val="Normal"/>
+    <w:link w:val="NoSpacingChar"/>
+    <w:uiPriority w:val="1"/>
+    <w:qFormat/>
+    <w:rsid w:val="009F2958"/>
+    <w:pPr>
+      <w:spacing w:after="0" w:line="240" w:lineRule="auto"/>
+    </w:pPr>
+  </w:style>
+  <w:style w:type="character" w:customStyle="1" w:styleId="NoSpacingChar">
+    <w:name w:val="No Spacing Char"/>
+    <w:basedOn w:val="DefaultParagraphFont"/>
+    <w:link w:val="NoSpacing"/>
+    <w:uiPriority w:val="1"/>
+    <w:rsid w:val="009F2958"/>
+  </w:style>
+  <w:style w:type="paragraph" w:styleId="ListParagraph">
+    <w:name w:val="List Paragraph"/>
+    <w:basedOn w:val="Normal"/>
+    <w:uiPriority w:val="1"/>
+    <w:qFormat/>
+    <w:rsid w:val="009F2958"/>
+    <w:pPr>
+      <w:ind w:left="720"/>
+      <w:contextualSpacing/>
+    </w:pPr>
+  </w:style>
+  <w:style w:type="paragraph" w:styleId="Quote">
+    <w:name w:val="Quote"/>
+    <w:basedOn w:val="Normal"/>
+    <w:next w:val="Normal"/>
+    <w:link w:val="QuoteChar"/>
+    <w:uiPriority w:val="29"/>
+    <w:qFormat/>
+    <w:rsid w:val="009F2958"/>
+    <w:rPr>
+      <w:i/>
+    </w:rPr>
+  </w:style>
+  <w:style w:type="character" w:customStyle="1" w:styleId="QuoteChar">
+    <w:name w:val="Quote Char"/>
+    <w:basedOn w:val="DefaultParagraphFont"/>
+    <w:link w:val="Quote"/>
+    <w:uiPriority w:val="29"/>
+    <w:rsid w:val="009F2958"/>
+    <w:rPr>
+      <w:i/>
+    </w:rPr>
+  </w:style>
+  <w:style w:type="paragraph" w:styleId="IntenseQuote">
+    <w:name w:val="Intense Quote"/>
+    <w:basedOn w:val="Normal"/>
+    <w:next w:val="Normal"/>
+    <w:link w:val="IntenseQuoteChar"/>
+    <w:uiPriority w:val="30"/>
+    <w:qFormat/>
+    <w:rsid w:val="009F2958"/>
+    <w:pPr>
+      <w:pBdr>
+        <w:top w:val="single" w:sz="8" w:space="10" w:color="3667C3"/>
+        <w:left w:val="single" w:sz="8" w:space="10" w:color="3667C3"/>
+        <w:bottom w:val="single" w:sz="8" w:space="10" w:color="3667C3"/>
+        <w:right w:val="single" w:sz="8" w:space="10" w:color="3667C3"/>
+      </w:pBdr>
+      <w:shd w:val="clear" w:color="auto" w:fill="7598D9"/>
+      <w:spacing w:before="140" w:after="140"/>
+      <w:ind w:left="1440" w:right="1440"/>
+    </w:pPr>
+    <w:rPr>
+      <w:b/>
+      <w:i/>
+      <w:color w:val="FFFFFF"/>
+    </w:rPr>
+  </w:style>
+  <w:style w:type="character" w:customStyle="1" w:styleId="IntenseQuoteChar">
+    <w:name w:val="Intense Quote Char"/>
+    <w:basedOn w:val="DefaultParagraphFont"/>
+    <w:link w:val="IntenseQuote"/>
+    <w:uiPriority w:val="30"/>
+    <w:rsid w:val="009F2958"/>
+    <w:rPr>
+      <w:b/>
+      <w:i/>
+      <w:color w:val="FFFFFF"/>
+      <w:shd w:val="clear" w:color="auto" w:fill="7598D9"/>
+    </w:rPr>
+  </w:style>
+  <w:style w:type="character" w:styleId="SubtleEmphasis">
+    <w:name w:val="Subtle Emphasis"/>
+    <w:uiPriority w:val="19"/>
+    <w:qFormat/>
+    <w:rsid w:val="009F2958"/>
+    <w:rPr>
+      <w:i/>
+    </w:rPr>
+  </w:style>
+  <w:style w:type="character" w:styleId="IntenseEmphasis">
+    <w:name w:val="Intense Emphasis"/>
+    <w:uiPriority w:val="21"/>
+    <w:qFormat/>
+    <w:rsid w:val="009F2958"/>
+    <w:rPr>
+      <w:b/>
+      <w:i/>
+      <w:color w:val="7598D9"/>
+      <w:spacing w:val="10"/>
+    </w:rPr>
+  </w:style>
+  <w:style w:type="character" w:styleId="SubtleReference">
+    <w:name w:val="Subtle Reference"/>
+    <w:uiPriority w:val="31"/>
+    <w:qFormat/>
+    <w:rsid w:val="009F2958"/>
+    <w:rPr>
+      <w:b/>
+    </w:rPr>
+  </w:style>
+  <w:style w:type="character" w:styleId="IntenseReference">
+    <w:name w:val="Intense Reference"/>
+    <w:uiPriority w:val="32"/>
+    <w:qFormat/>
+    <w:rsid w:val="009F2958"/>
+    <w:rPr>
+      <w:b/>
+      <w:bCs/>
+      <w:smallCaps/>
+      <w:spacing w:val="5"/>
+      <w:sz w:val="22"/>
+      <w:szCs w:val="22"/>
+      <w:u w:val="single"/>
+    </w:rPr>
+  </w:style>
+  <w:style w:type="character" w:styleId="BookTitle">
+    <w:name w:val="Book Title"/>
+    <w:uiPriority w:val="33"/>
+    <w:qFormat/>
+    <w:rsid w:val="009F2958"/>
+    <w:rPr>
+      <w:rFonts w:ascii="Century Schoolbook" w:eastAsia="MS PMincho" w:hAnsi="Century Schoolbook" w:cs="Times New Roman"/>
+      <w:i/>
+      <w:iCs/>
+      <w:sz w:val="20"/>
+      <w:szCs w:val="20"/>
+    </w:rPr>
+  </w:style>
+  <w:style w:type="paragraph" w:styleId="TOCHeading">
+    <w:name w:val="TOC Heading"/>
+    <w:basedOn w:val="Heading1"/>
+    <w:next w:val="Normal"/>
+    <w:uiPriority w:val="39"/>
+    <w:semiHidden/>
+    <w:unhideWhenUsed/>
+    <w:qFormat/>
+    <w:rsid w:val="009F2958"/>
+    <w:pPr>
+      <w:outlineLvl w:val="9"/>
+    </w:pPr>
+  </w:style>
+  <w:style w:type="table" w:styleId="LightGrid-Accent5">
+    <w:name w:val="Light Grid Accent 5"/>
+    <w:basedOn w:val="TableNormal"/>
+    <w:uiPriority w:val="62"/>
+    <w:rsid w:val="00315076"/>
+    <w:tblPr>
+      <w:tblStyleRowBandSize w:val="1"/>
+      <w:tblStyleColBandSize w:val="1"/>
+      <w:tblBorders>
+        <w:top w:val="single" w:sz="8" w:space="0" w:color="AEBAD5"/>
+        <w:left w:val="single" w:sz="8" w:space="0" w:color="AEBAD5"/>
+        <w:bottom w:val="single" w:sz="8" w:space="0" w:color="AEBAD5"/>
+        <w:right w:val="single" w:sz="8" w:space="0" w:color="AEBAD5"/>
+        <w:insideH w:val="single" w:sz="8" w:space="0" w:color="AEBAD5"/>
+        <w:insideV w:val="single" w:sz="8" w:space="0" w:color="AEBAD5"/>
+      </w:tblBorders>
+    </w:tblPr>
+    <w:tblStylePr w:type="firstRow">
+      <w:pPr>
+        <w:spacing w:before="0" w:after="0" w:line="240" w:lineRule="auto"/>
+      </w:pPr>
+      <w:rPr>
+        <w:rFonts w:ascii="Century Schoolbook" w:eastAsia="MS PMincho" w:hAnsi="Century Schoolbook" w:cs="Times New Roman"/>
+        <w:b/>
+        <w:bCs/>
+      </w:rPr>
+      <w:tblPr/>
+      <w:tcPr>
+        <w:tcBorders>
+          <w:top w:val="single" w:sz="8" w:space="0" w:color="AEBAD5"/>
+          <w:left w:val="single" w:sz="8" w:space="0" w:color="AEBAD5"/>
+          <w:bottom w:val="single" w:sz="18" w:space="0" w:color="AEBAD5"/>
+          <w:right w:val="single" w:sz="8" w:space="0" w:color="AEBAD5"/>
+          <w:insideH w:val="nil"/>
+          <w:insideV w:val="single" w:sz="8" w:space="0" w:color="AEBAD5"/>
+        </w:tcBorders>
+      </w:tcPr>
+    </w:tblStylePr>
+    <w:tblStylePr w:type="lastRow">
+      <w:pPr>
+        <w:spacing w:before="0" w:after="0" w:line="240" w:lineRule="auto"/>
+      </w:pPr>
+      <w:rPr>
+        <w:rFonts w:ascii="Century Schoolbook" w:eastAsia="MS PMincho" w:hAnsi="Century Schoolbook" w:cs="Times New Roman"/>
+        <w:b/>
+        <w:bCs/>
+      </w:rPr>
+      <w:tblPr/>
+      <w:tcPr>
+        <w:tcBorders>
+          <w:top w:val="double" w:sz="6" w:space="0" w:color="AEBAD5"/>
+          <w:left w:val="single" w:sz="8" w:space="0" w:color="AEBAD5"/>
+          <w:bottom w:val="single" w:sz="8" w:space="0" w:color="AEBAD5"/>
+          <w:right w:val="single" w:sz="8" w:space="0" w:color="AEBAD5"/>
+          <w:insideH w:val="nil"/>
+          <w:insideV w:val="single" w:sz="8" w:space="0" w:color="AEBAD5"/>
+        </w:tcBorders>
+      </w:tcPr>
+    </w:tblStylePr>
+    <w:tblStylePr w:type="firstCol">
+      <w:rPr>
+        <w:rFonts w:ascii="Century Schoolbook" w:eastAsia="MS PMincho" w:hAnsi="Century Schoolbook" w:cs="Times New Roman"/>
+        <w:b/>
+        <w:bCs/>
+      </w:rPr>
+    </w:tblStylePr>
+    <w:tblStylePr w:type="lastCol">
+      <w:rPr>
+        <w:rFonts w:ascii="Century Schoolbook" w:eastAsia="MS PMincho" w:hAnsi="Century Schoolbook" w:cs="Times New Roman"/>
+        <w:b/>
+        <w:bCs/>
+      </w:rPr>
+      <w:tblPr/>
+      <w:tcPr>
+        <w:tcBorders>
+          <w:top w:val="single" w:sz="8" w:space="0" w:color="AEBAD5"/>
+          <w:left w:val="single" w:sz="8" w:space="0" w:color="AEBAD5"/>
+          <w:bottom w:val="single" w:sz="8" w:space="0" w:color="AEBAD5"/>
+          <w:right w:val="single" w:sz="8" w:space="0" w:color="AEBAD5"/>
+        </w:tcBorders>
+      </w:tcPr>
+    </w:tblStylePr>
+    <w:tblStylePr w:type="band1Vert">
+      <w:tblPr/>
+      <w:tcPr>
+        <w:tcBorders>
+          <w:top w:val="single" w:sz="8" w:space="0" w:color="AEBAD5"/>
+          <w:left w:val="single" w:sz="8" w:space="0" w:color="AEBAD5"/>
+          <w:bottom w:val="single" w:sz="8" w:space="0" w:color="AEBAD5"/>
+          <w:right w:val="single" w:sz="8" w:space="0" w:color="AEBAD5"/>
+        </w:tcBorders>
+        <w:shd w:val="clear" w:color="auto" w:fill="EAEDF4"/>
+      </w:tcPr>
+    </w:tblStylePr>
+    <w:tblStylePr w:type="band1Horz">
+      <w:tblPr/>
+      <w:tcPr>
+        <w:tcBorders>
+          <w:top w:val="single" w:sz="8" w:space="0" w:color="AEBAD5"/>
+          <w:left w:val="single" w:sz="8" w:space="0" w:color="AEBAD5"/>
+          <w:bottom w:val="single" w:sz="8" w:space="0" w:color="AEBAD5"/>
+          <w:right w:val="single" w:sz="8" w:space="0" w:color="AEBAD5"/>
+          <w:insideV w:val="single" w:sz="8" w:space="0" w:color="AEBAD5"/>
+        </w:tcBorders>
+        <w:shd w:val="clear" w:color="auto" w:fill="EAEDF4"/>
+      </w:tcPr>
+    </w:tblStylePr>
+    <w:tblStylePr w:type="band2Horz">
+      <w:tblPr/>
+      <w:tcPr>
+        <w:tcBorders>
+          <w:top w:val="single" w:sz="8" w:space="0" w:color="AEBAD5"/>
+          <w:left w:val="single" w:sz="8" w:space="0" w:color="AEBAD5"/>
+          <w:bottom w:val="single" w:sz="8" w:space="0" w:color="AEBAD5"/>
+          <w:right w:val="single" w:sz="8" w:space="0" w:color="AEBAD5"/>
+          <w:insideV w:val="single" w:sz="8" w:space="0" w:color="AEBAD5"/>
+        </w:tcBorders>
+      </w:tcPr>
+    </w:tblStylePr>
+  </w:style>
+  <w:style w:type="table" w:customStyle="1" w:styleId="LightShading-Accent11">
+    <w:name w:val="Light Shading - Accent 11"/>
+    <w:basedOn w:val="TableNormal"/>
+    <w:uiPriority w:val="60"/>
+    <w:rsid w:val="00BC0FC0"/>
+    <w:rPr>
+      <w:color w:val="365F91" w:themeColor="accent1" w:themeShade="BF"/>
+    </w:rPr>
+    <w:tblPr>
+      <w:tblStyleRowBandSize w:val="1"/>
+      <w:tblStyleColBandSize w:val="1"/>
+      <w:tblBorders>
+        <w:top w:val="single" w:sz="8" w:space="0" w:color="4F81BD" w:themeColor="accent1"/>
+        <w:bottom w:val="single" w:sz="8" w:space="0" w:color="4F81BD" w:themeColor="accent1"/>
+      </w:tblBorders>
+    </w:tblPr>
+    <w:tblStylePr w:type="firstRow">
+      <w:pPr>
+        <w:spacing w:before="0" w:after="0" w:line="240" w:lineRule="auto"/>
+      </w:pPr>
+      <w:rPr>
+        <w:b/>
+        <w:bCs/>
+      </w:rPr>
+      <w:tblPr/>
+      <w:tcPr>
+        <w:tcBorders>
+          <w:top w:val="single" w:sz="8" w:space="0" w:color="4F81BD" w:themeColor="accent1"/>
+          <w:left w:val="nil"/>
+          <w:bottom w:val="single" w:sz="8" w:space="0" w:color="4F81BD" w:themeColor="accent1"/>
+          <w:right w:val="nil"/>
+          <w:insideH w:val="nil"/>
+          <w:insideV w:val="nil"/>
+        </w:tcBorders>
+      </w:tcPr>
+    </w:tblStylePr>
+    <w:tblStylePr w:type="lastRow">
+      <w:pPr>
+        <w:spacing w:before="0" w:after="0" w:line="240" w:lineRule="auto"/>
+      </w:pPr>
+      <w:rPr>
+        <w:b/>
+        <w:bCs/>
+      </w:rPr>
+      <w:tblPr/>
+      <w:tcPr>
+        <w:tcBorders>
+          <w:top w:val="single" w:sz="8" w:space="0" w:color="4F81BD" w:themeColor="accent1"/>
+          <w:left w:val="nil"/>
+          <w:bottom w:val="single" w:sz="8" w:space="0" w:color="4F81BD" w:themeColor="accent1"/>
+          <w:right w:val="nil"/>
+          <w:insideH w:val="nil"/>
+          <w:insideV w:val="nil"/>
+        </w:tcBorders>
+      </w:tcPr>
+    </w:tblStylePr>
+    <w:tblStylePr w:type="firstCol">
+      <w:rPr>
+        <w:b/>
+        <w:bCs/>
+      </w:rPr>
+    </w:tblStylePr>
+    <w:tblStylePr w:type="lastCol">
+      <w:rPr>
+        <w:b/>
+        <w:bCs/>
+      </w:rPr>
+    </w:tblStylePr>
+    <w:tblStylePr w:type="band1Vert">
+      <w:tblPr/>
+      <w:tcPr>
+        <w:tcBorders>
+          <w:left w:val="nil"/>
+          <w:right w:val="nil"/>
+          <w:insideH w:val="nil"/>
+          <w:insideV w:val="nil"/>
+        </w:tcBorders>
+        <w:shd w:val="clear" w:color="auto" w:fill="D3DFEE" w:themeFill="accent1" w:themeFillTint="3F"/>
+      </w:tcPr>
+    </w:tblStylePr>
+    <w:tblStylePr w:type="band1Horz">
+      <w:tblPr/>
+      <w:tcPr>
+        <w:tcBorders>
+          <w:left w:val="nil"/>
+          <w:right w:val="nil"/>
+          <w:insideH w:val="nil"/>
+          <w:insideV w:val="nil"/>
+        </w:tcBorders>
+        <w:shd w:val="clear" w:color="auto" w:fill="D3DFEE" w:themeFill="accent1" w:themeFillTint="3F"/>
+      </w:tcPr>
+    </w:tblStylePr>
+  </w:style>
+  <w:style w:type="table" w:customStyle="1" w:styleId="LightShading1">
+    <w:name w:val="Light Shading1"/>
+    <w:basedOn w:val="TableNormal"/>
+    <w:uiPriority w:val="60"/>
+    <w:rsid w:val="00BC0FC0"/>
+    <w:rPr>
+      <w:color w:val="000000" w:themeColor="text1" w:themeShade="BF"/>
+    </w:rPr>
+    <w:tblPr>
+      <w:tblStyleRowBandSize w:val="1"/>
+      <w:tblStyleColBandSize w:val="1"/>
+      <w:tblBorders>
+        <w:top w:val="single" w:sz="8" w:space="0" w:color="000000" w:themeColor="text1"/>
+        <w:bottom w:val="single" w:sz="8" w:space="0" w:color="000000" w:themeColor="text1"/>
+      </w:tblBorders>
+    </w:tblPr>
+    <w:tblStylePr w:type="firstRow">
+      <w:pPr>
+        <w:spacing w:before="0" w:after="0" w:line="240" w:lineRule="auto"/>
+      </w:pPr>
+      <w:rPr>
+        <w:b/>
+        <w:bCs/>
+      </w:rPr>
+      <w:tblPr/>
+      <w:tcPr>
+        <w:tcBorders>
+          <w:top w:val="single" w:sz="8" w:space="0" w:color="000000" w:themeColor="text1"/>
+          <w:left w:val="nil"/>
+          <w:bottom w:val="single" w:sz="8" w:space="0" w:color="000000" w:themeColor="text1"/>
+          <w:right w:val="nil"/>
+          <w:insideH w:val="nil"/>
+          <w:insideV w:val="nil"/>
+        </w:tcBorders>
+      </w:tcPr>
+    </w:tblStylePr>
+    <w:tblStylePr w:type="lastRow">
+      <w:pPr>
+        <w:spacing w:before="0" w:after="0" w:line="240" w:lineRule="auto"/>
+      </w:pPr>
+      <w:rPr>
+        <w:b/>
+        <w:bCs/>
+      </w:rPr>
+      <w:tblPr/>
+      <w:tcPr>
+        <w:tcBorders>
+          <w:top w:val="single" w:sz="8" w:space="0" w:color="000000" w:themeColor="text1"/>
+          <w:left w:val="nil"/>
+          <w:bottom w:val="single" w:sz="8" w:space="0" w:color="000000" w:themeColor="text1"/>
+          <w:right w:val="nil"/>
+          <w:insideH w:val="nil"/>
+          <w:insideV w:val="nil"/>
+        </w:tcBorders>
+      </w:tcPr>
+    </w:tblStylePr>
+    <w:tblStylePr w:type="firstCol">
+      <w:rPr>
+        <w:b/>
+        <w:bCs/>
+      </w:rPr>
+    </w:tblStylePr>
+    <w:tblStylePr w:type="lastCol">
+      <w:rPr>
+        <w:b/>
+        <w:bCs/>
+      </w:rPr>
+    </w:tblStylePr>
+    <w:tblStylePr w:type="band1Vert">
+      <w:tblPr/>
+      <w:tcPr>
+        <w:tcBorders>
+          <w:left w:val="nil"/>
+          <w:right w:val="nil"/>
+          <w:insideH w:val="nil"/>
+          <w:insideV w:val="nil"/>
+        </w:tcBorders>
+        <w:shd w:val="clear" w:color="auto" w:fill="C0C0C0" w:themeFill="text1" w:themeFillTint="3F"/>
+      </w:tcPr>
+    </w:tblStylePr>
+    <w:tblStylePr w:type="band1Horz">
+      <w:tblPr/>
+      <w:tcPr>
+        <w:tcBorders>
+          <w:left w:val="nil"/>
+          <w:right w:val="nil"/>
+          <w:insideH w:val="nil"/>
+          <w:insideV w:val="nil"/>
+        </w:tcBorders>
+        <w:shd w:val="clear" w:color="auto" w:fill="C0C0C0" w:themeFill="text1" w:themeFillTint="3F"/>
+      </w:tcPr>
+    </w:tblStylePr>
+  </w:style>
+  <w:style w:type="table" w:customStyle="1" w:styleId="LightList1">
+    <w:name w:val="Light List1"/>
+    <w:basedOn w:val="TableNormal"/>
+    <w:uiPriority w:val="61"/>
+    <w:rsid w:val="00BC0FC0"/>
+    <w:tblPr>
+      <w:tblStyleRowBandSize w:val="1"/>
+      <w:tblStyleColBandSize w:val="1"/>
+      <w:tblBorders>
+        <w:top w:val="single" w:sz="8" w:space="0" w:color="000000" w:themeColor="text1"/>
+        <w:left w:val="single" w:sz="8" w:space="0" w:color="000000" w:themeColor="text1"/>
+        <w:bottom w:val="single" w:sz="8" w:space="0" w:color="000000" w:themeColor="text1"/>
+        <w:right w:val="single" w:sz="8" w:space="0" w:color="000000" w:themeColor="text1"/>
+      </w:tblBorders>
+    </w:tblPr>
+    <w:tblStylePr w:type="firstRow">
+      <w:pPr>
+        <w:spacing w:before="0" w:after="0" w:line="240" w:lineRule="auto"/>
+      </w:pPr>
+      <w:rPr>
+        <w:b/>
+        <w:bCs/>
+        <w:color w:val="FFFFFF" w:themeColor="background1"/>
+      </w:rPr>
+      <w:tblPr/>
+      <w:tcPr>
+        <w:shd w:val="clear" w:color="auto" w:fill="000000" w:themeFill="text1"/>
+      </w:tcPr>
+    </w:tblStylePr>
+    <w:tblStylePr w:type="lastRow">
+      <w:pPr>
+        <w:spacing w:before="0" w:after="0" w:line="240" w:lineRule="auto"/>
+      </w:pPr>
+      <w:rPr>
+        <w:b/>
+        <w:bCs/>
+      </w:rPr>
+      <w:tblPr/>
+      <w:tcPr>
+        <w:tcBorders>
+          <w:top w:val="double" w:sz="6" w:space="0" w:color="000000" w:themeColor="text1"/>
+          <w:left w:val="single" w:sz="8" w:space="0" w:color="000000" w:themeColor="text1"/>
+          <w:bottom w:val="single" w:sz="8" w:space="0" w:color="000000" w:themeColor="text1"/>
+          <w:right w:val="single" w:sz="8" w:space="0" w:color="000000" w:themeColor="text1"/>
+        </w:tcBorders>
+      </w:tcPr>
+    </w:tblStylePr>
+    <w:tblStylePr w:type="firstCol">
+      <w:rPr>
+        <w:b/>
+        <w:bCs/>
+      </w:rPr>
+    </w:tblStylePr>
+    <w:tblStylePr w:type="lastCol">
+      <w:rPr>
+        <w:b/>
+        <w:bCs/>
+      </w:rPr>
+    </w:tblStylePr>
+    <w:tblStylePr w:type="band1Vert">
+      <w:tblPr/>
+      <w:tcPr>
+        <w:tcBorders>
+          <w:top w:val="single" w:sz="8" w:space="0" w:color="000000" w:themeColor="text1"/>
+          <w:left w:val="single" w:sz="8" w:space="0" w:color="000000" w:themeColor="text1"/>
+          <w:bottom w:val="single" w:sz="8" w:space="0" w:color="000000" w:themeColor="text1"/>
+          <w:right w:val="single" w:sz="8" w:space="0" w:color="000000" w:themeColor="text1"/>
+        </w:tcBorders>
+      </w:tcPr>
+    </w:tblStylePr>
+    <w:tblStylePr w:type="band1Horz">
+      <w:tblPr/>
+      <w:tcPr>
+        <w:tcBorders>
+          <w:top w:val="single" w:sz="8" w:space="0" w:color="000000" w:themeColor="text1"/>
+          <w:left w:val="single" w:sz="8" w:space="0" w:color="000000" w:themeColor="text1"/>
+          <w:bottom w:val="single" w:sz="8" w:space="0" w:color="000000" w:themeColor="text1"/>
+          <w:right w:val="single" w:sz="8" w:space="0" w:color="000000" w:themeColor="text1"/>
+        </w:tcBorders>
+      </w:tcPr>
+    </w:tblStylePr>
+  </w:style>
+  <w:style w:type="table" w:customStyle="1" w:styleId="LightGrid1">
+    <w:name w:val="Light Grid1"/>
+    <w:basedOn w:val="TableNormal"/>
+    <w:uiPriority w:val="62"/>
+    <w:rsid w:val="008804FC"/>
+    <w:tblPr>
+      <w:tblStyleRowBandSize w:val="1"/>
+      <w:tblStyleColBandSize w:val="1"/>
+      <w:tblBorders>
+        <w:top w:val="single" w:sz="8" w:space="0" w:color="000000" w:themeColor="text1"/>
+        <w:left w:val="single" w:sz="8" w:space="0" w:color="000000" w:themeColor="text1"/>
+        <w:bottom w:val="single" w:sz="8" w:space="0" w:color="000000" w:themeColor="text1"/>
+        <w:right w:val="single" w:sz="8" w:space="0" w:color="000000" w:themeColor="text1"/>
+        <w:insideH w:val="single" w:sz="8" w:space="0" w:color="000000" w:themeColor="text1"/>
+        <w:insideV w:val="single" w:sz="8" w:space="0" w:color="000000" w:themeColor="text1"/>
+      </w:tblBorders>
+    </w:tblPr>
+    <w:tblStylePr w:type="firstRow">
+      <w:pPr>
+        <w:spacing w:before="0" w:after="0" w:line="240" w:lineRule="auto"/>
+      </w:pPr>
+      <w:rPr>
+        <w:rFonts w:asciiTheme="majorHAnsi" w:eastAsiaTheme="majorEastAsia" w:hAnsiTheme="majorHAnsi" w:cstheme="majorBidi"/>
+        <w:b/>
+        <w:bCs/>
+      </w:rPr>
+      <w:tblPr/>
+      <w:tcPr>
+        <w:tcBorders>
+          <w:top w:val="single" w:sz="8" w:space="0" w:color="000000" w:themeColor="text1"/>
+          <w:left w:val="single" w:sz="8" w:space="0" w:color="000000" w:themeColor="text1"/>
+          <w:bottom w:val="single" w:sz="18" w:space="0" w:color="000000" w:themeColor="text1"/>
+          <w:right w:val="single" w:sz="8" w:space="0" w:color="000000" w:themeColor="text1"/>
+          <w:insideH w:val="nil"/>
+          <w:insideV w:val="single" w:sz="8" w:space="0" w:color="000000" w:themeColor="text1"/>
+        </w:tcBorders>
+      </w:tcPr>
+    </w:tblStylePr>
+    <w:tblStylePr w:type="lastRow">
+      <w:pPr>
+        <w:spacing w:before="0" w:after="0" w:line="240" w:lineRule="auto"/>
+      </w:pPr>
+      <w:rPr>
+        <w:rFonts w:asciiTheme="majorHAnsi" w:eastAsiaTheme="majorEastAsia" w:hAnsiTheme="majorHAnsi" w:cstheme="majorBidi"/>
+        <w:b/>
+        <w:bCs/>
+      </w:rPr>
+      <w:tblPr/>
+      <w:tcPr>
+        <w:tcBorders>
+          <w:top w:val="double" w:sz="6" w:space="0" w:color="000000" w:themeColor="text1"/>
+          <w:left w:val="single" w:sz="8" w:space="0" w:color="000000" w:themeColor="text1"/>
+          <w:bottom w:val="single" w:sz="8" w:space="0" w:color="000000" w:themeColor="text1"/>
+          <w:right w:val="single" w:sz="8" w:space="0" w:color="000000" w:themeColor="text1"/>
+          <w:insideH w:val="nil"/>
+          <w:insideV w:val="single" w:sz="8" w:space="0" w:color="000000" w:themeColor="text1"/>
+        </w:tcBorders>
+      </w:tcPr>
+    </w:tblStylePr>
+    <w:tblStylePr w:type="firstCol">
+      <w:rPr>
+        <w:rFonts w:asciiTheme="majorHAnsi" w:eastAsiaTheme="majorEastAsia" w:hAnsiTheme="majorHAnsi" w:cstheme="majorBidi"/>
+        <w:b/>
+        <w:bCs/>
+      </w:rPr>
+    </w:tblStylePr>
+    <w:tblStylePr w:type="lastCol">
+      <w:rPr>
+        <w:rFonts w:asciiTheme="majorHAnsi" w:eastAsiaTheme="majorEastAsia" w:hAnsiTheme="majorHAnsi" w:cstheme="majorBidi"/>
+        <w:b/>
+        <w:bCs/>
+      </w:rPr>
+      <w:tblPr/>
+      <w:tcPr>
+        <w:tcBorders>
+          <w:top w:val="single" w:sz="8" w:space="0" w:color="000000" w:themeColor="text1"/>
+          <w:left w:val="single" w:sz="8" w:space="0" w:color="000000" w:themeColor="text1"/>
+          <w:bottom w:val="single" w:sz="8" w:space="0" w:color="000000" w:themeColor="text1"/>
+          <w:right w:val="single" w:sz="8" w:space="0" w:color="000000" w:themeColor="text1"/>
+        </w:tcBorders>
+      </w:tcPr>
+    </w:tblStylePr>
+    <w:tblStylePr w:type="band1Vert">
+      <w:tblPr/>
+      <w:tcPr>
+        <w:tcBorders>
+          <w:top w:val="single" w:sz="8" w:space="0" w:color="000000" w:themeColor="text1"/>
+          <w:left w:val="single" w:sz="8" w:space="0" w:color="000000" w:themeColor="text1"/>
+          <w:bottom w:val="single" w:sz="8" w:space="0" w:color="000000" w:themeColor="text1"/>
+          <w:right w:val="single" w:sz="8" w:space="0" w:color="000000" w:themeColor="text1"/>
+        </w:tcBorders>
+        <w:shd w:val="clear" w:color="auto" w:fill="C0C0C0" w:themeFill="text1" w:themeFillTint="3F"/>
+      </w:tcPr>
+    </w:tblStylePr>
+    <w:tblStylePr w:type="band1Horz">
+      <w:tblPr/>
+      <w:tcPr>
+        <w:tcBorders>
+          <w:top w:val="single" w:sz="8" w:space="0" w:color="000000" w:themeColor="text1"/>
+          <w:left w:val="single" w:sz="8" w:space="0" w:color="000000" w:themeColor="text1"/>
+          <w:bottom w:val="single" w:sz="8" w:space="0" w:color="000000" w:themeColor="text1"/>
+          <w:right w:val="single" w:sz="8" w:space="0" w:color="000000" w:themeColor="text1"/>
+          <w:insideV w:val="single" w:sz="8" w:space="0" w:color="000000" w:themeColor="text1"/>
+        </w:tcBorders>
+        <w:shd w:val="clear" w:color="auto" w:fill="C0C0C0" w:themeFill="text1" w:themeFillTint="3F"/>
+      </w:tcPr>
+    </w:tblStylePr>
+    <w:tblStylePr w:type="band2Horz">
+      <w:tblPr/>
+      <w:tcPr>
+        <w:tcBorders>
+          <w:top w:val="single" w:sz="8" w:space="0" w:color="000000" w:themeColor="text1"/>
+          <w:left w:val="single" w:sz="8" w:space="0" w:color="000000" w:themeColor="text1"/>
+          <w:bottom w:val="single" w:sz="8" w:space="0" w:color="000000" w:themeColor="text1"/>
+          <w:right w:val="single" w:sz="8" w:space="0" w:color="000000" w:themeColor="text1"/>
+          <w:insideV w:val="single" w:sz="8" w:space="0" w:color="000000" w:themeColor="text1"/>
+        </w:tcBorders>
+      </w:tcPr>
+    </w:tblStylePr>
+  </w:style>
+  <w:style w:type="paragraph" w:customStyle="1" w:styleId="Default">
+    <w:name w:val="Default"/>
+    <w:rsid w:val="004413E4"/>
+    <w:pPr>
+      <w:autoSpaceDE w:val="0"/>
+      <w:autoSpaceDN w:val="0"/>
+      <w:adjustRightInd w:val="0"/>
+    </w:pPr>
+    <w:rPr>
+      <w:rFonts w:ascii="Arial" w:hAnsi="Arial" w:cs="Arial"/>
+      <w:color w:val="000000"/>
+      <w:sz w:val="24"/>
+      <w:szCs w:val="24"/>
+      <w:lang w:val="en-US"/>
+    </w:rPr>
+  </w:style>
+  <w:style w:type="table" w:customStyle="1" w:styleId="MediumGrid11">
+    <w:name w:val="Medium Grid 11"/>
+    <w:basedOn w:val="TableNormal"/>
+    <w:uiPriority w:val="67"/>
+    <w:rsid w:val="007D0E41"/>
+    <w:tblPr>
+      <w:tblStyleRowBandSize w:val="1"/>
+      <w:tblStyleColBandSize w:val="1"/>
+      <w:tblBorders>
+        <w:top w:val="single" w:sz="8" w:space="0" w:color="404040" w:themeColor="text1" w:themeTint="BF"/>
+        <w:left w:val="single" w:sz="8" w:space="0" w:color="404040" w:themeColor="text1" w:themeTint="BF"/>
+        <w:bottom w:val="single" w:sz="8" w:space="0" w:color="404040" w:themeColor="text1" w:themeTint="BF"/>
+        <w:right w:val="single" w:sz="8" w:space="0" w:color="404040" w:themeColor="text1" w:themeTint="BF"/>
+        <w:insideH w:val="single" w:sz="8" w:space="0" w:color="404040" w:themeColor="text1" w:themeTint="BF"/>
+        <w:insideV w:val="single" w:sz="8" w:space="0" w:color="404040" w:themeColor="text1" w:themeTint="BF"/>
+      </w:tblBorders>
+    </w:tblPr>
+    <w:tcPr>
+      <w:shd w:val="clear" w:color="auto" w:fill="C0C0C0" w:themeFill="text1" w:themeFillTint="3F"/>
+    </w:tcPr>
+    <w:tblStylePr w:type="firstRow">
+      <w:rPr>
+        <w:b/>
+        <w:bCs/>
+      </w:rPr>
+    </w:tblStylePr>
+    <w:tblStylePr w:type="lastRow">
+      <w:rPr>
+        <w:b/>
+        <w:bCs/>
+      </w:rPr>
+      <w:tblPr/>
+      <w:tcPr>
+        <w:tcBorders>
+          <w:top w:val="single" w:sz="18" w:space="0" w:color="404040" w:themeColor="text1" w:themeTint="BF"/>
+        </w:tcBorders>
+      </w:tcPr>
+    </w:tblStylePr>
+    <w:tblStylePr w:type="firstCol">
+      <w:rPr>
+        <w:b/>
+        <w:bCs/>
+      </w:rPr>
+    </w:tblStylePr>
+    <w:tblStylePr w:type="lastCol">
+      <w:rPr>
+        <w:b/>
+        <w:bCs/>
+      </w:rPr>
+    </w:tblStylePr>
+    <w:tblStylePr w:type="band1Vert">
+      <w:tblPr/>
+      <w:tcPr>
+        <w:shd w:val="clear" w:color="auto" w:fill="808080" w:themeFill="text1" w:themeFillTint="7F"/>
+      </w:tcPr>
+    </w:tblStylePr>
+    <w:tblStylePr w:type="band1Horz">
+      <w:tblPr/>
+      <w:tcPr>
+        <w:shd w:val="clear" w:color="auto" w:fill="808080" w:themeFill="text1" w:themeFillTint="7F"/>
+      </w:tcPr>
+    </w:tblStylePr>
+  </w:style>
+  <w:style w:type="paragraph" w:styleId="BalloonText">
+    <w:name w:val="Balloon Text"/>
+    <w:basedOn w:val="Normal"/>
+    <w:link w:val="BalloonTextChar"/>
+    <w:uiPriority w:val="99"/>
+    <w:semiHidden/>
+    <w:unhideWhenUsed/>
+    <w:rsid w:val="00915464"/>
+    <w:pPr>
+      <w:spacing w:before="0" w:after="0" w:line="240" w:lineRule="auto"/>
+    </w:pPr>
+    <w:rPr>
+      <w:rFonts w:ascii="Tahoma" w:hAnsi="Tahoma" w:cs="Tahoma"/>
+      <w:sz w:val="16"/>
+      <w:szCs w:val="16"/>
+    </w:rPr>
+  </w:style>
+  <w:style w:type="character" w:customStyle="1" w:styleId="BalloonTextChar">
+    <w:name w:val="Balloon Text Char"/>
+    <w:basedOn w:val="DefaultParagraphFont"/>
+    <w:link w:val="BalloonText"/>
+    <w:uiPriority w:val="99"/>
+    <w:semiHidden/>
+    <w:rsid w:val="00915464"/>
+    <w:rPr>
+      <w:rFonts w:ascii="Tahoma" w:hAnsi="Tahoma" w:cs="Tahoma"/>
+      <w:sz w:val="16"/>
+      <w:szCs w:val="16"/>
+      <w:lang w:val="en-US" w:eastAsia="en-US" w:bidi="en-US"/>
+    </w:rPr>
+  </w:style>
+</w:styles>
+</file>
+
 <file path=word/theme/theme1.xml><?xml version="1.0" encoding="utf-8"?>
 <a:theme xmlns:a="http://schemas.openxmlformats.org/drawingml/2006/main" name="Thème Office">
   <a:themeElements>
@@ -11907,7 +12896,7 @@
 </file>
 
 <file path=customXml/itemProps2.xml><?xml version="1.0" encoding="utf-8"?>
-<ds:datastoreItem xmlns:ds="http://schemas.openxmlformats.org/officeDocument/2006/customXml" ds:itemID="{6EB63AFA-A0EE-4282-85F1-4D57FAA415D1}">
+<ds:datastoreItem xmlns:ds="http://schemas.openxmlformats.org/officeDocument/2006/customXml" ds:itemID="{CA5D63D3-A446-4BC5-AB05-FB10CC063DE7}">
   <ds:schemaRefs>
     <ds:schemaRef ds:uri="http://schemas.openxmlformats.org/officeDocument/2006/bibliography"/>
   </ds:schemaRefs>

</xml_diff>